<commit_message>
chore: update project files and add new learning materials
- Update CodeVisionAVR project timestamps and cursor positions
- Update Arduino examples documentation
- Add TTLT Application installer and resources
- Add Proteus simulation files for Arduino IDE
</commit_message>
<xml_diff>
--- a/Material/drive-download-20260820T004134Z-1-001/2. Vi du Arduino - 2026.docx
+++ b/Material/drive-download-20260820T004134Z-1-001/2. Vi du Arduino - 2026.docx
@@ -1,6 +1,6 @@
 
 <file path=word/document.xml><?xml version="1.0" encoding="utf-8"?>
-<w:document xmlns:wpc="http://schemas.microsoft.com/office/word/2010/wordprocessingCanvas" xmlns:cx="http://schemas.microsoft.com/office/drawing/2014/chartex" xmlns:cx1="http://schemas.microsoft.com/office/drawing/2015/9/8/chartex" xmlns:cx2="http://schemas.microsoft.com/office/drawing/2015/10/21/chartex" xmlns:cx3="http://schemas.microsoft.com/office/drawing/2016/5/9/chartex" xmlns:cx4="http://schemas.microsoft.com/office/drawing/2016/5/10/chartex" xmlns:cx5="http://schemas.microsoft.com/office/drawing/2016/5/11/chartex" xmlns:cx6="http://schemas.microsoft.com/office/drawing/2016/5/12/chartex" xmlns:cx7="http://schemas.microsoft.com/office/drawing/2016/5/13/chartex" xmlns:cx8="http://schemas.microsoft.com/office/drawing/2016/5/14/chartex" xmlns:mc="http://schemas.openxmlformats.org/markup-compatibility/2006" xmlns:aink="http://schemas.microsoft.com/office/drawing/2016/ink" xmlns:am3d="http://schemas.microsoft.com/office/drawing/2017/model3d" xmlns:o="urn:schemas-microsoft-com:office:office" xmlns:oel="http://schemas.microsoft.com/office/2019/extlst" xmlns:r="http://schemas.openxmlformats.org/officeDocument/2006/relationships" xmlns:m="http://schemas.openxmlformats.org/officeDocument/2006/math" xmlns:v="urn:schemas-microsoft-com:vml" xmlns:wp14="http://schemas.microsoft.com/office/word/2010/wordprocessingDrawing" xmlns:wp="http://schemas.openxmlformats.org/drawingml/2006/wordprocessingDrawing" xmlns:w10="urn:schemas-microsoft-com:office:word" xmlns:w="http://schemas.openxmlformats.org/wordprocessingml/2006/main" xmlns:w14="http://schemas.microsoft.com/office/word/2010/wordml" xmlns:w15="http://schemas.microsoft.com/office/word/2012/wordml" xmlns:w16cex="http://schemas.microsoft.com/office/word/2018/wordml/cex" xmlns:w16cid="http://schemas.microsoft.com/office/word/2016/wordml/cid" xmlns:w16="http://schemas.microsoft.com/office/word/2018/wordml" xmlns:w16du="http://schemas.microsoft.com/office/word/2023/wordml/word16du" xmlns:w16sdtdh="http://schemas.microsoft.com/office/word/2020/wordml/sdtdatahash" xmlns:w16se="http://schemas.microsoft.com/office/word/2015/wordml/symex" xmlns:wpg="http://schemas.microsoft.com/office/word/2010/wordprocessingGroup" xmlns:wpi="http://schemas.microsoft.com/office/word/2010/wordprocessingInk" xmlns:wne="http://schemas.microsoft.com/office/word/2006/wordml" xmlns:wps="http://schemas.microsoft.com/office/word/2010/wordprocessingShape" mc:Ignorable="w14 w15 w16se w16cid w16 w16cex w16sdtdh w16du wp14">
+<w:document xmlns:wpc="http://schemas.microsoft.com/office/word/2010/wordprocessingCanvas" xmlns:cx="http://schemas.microsoft.com/office/drawing/2014/chartex" xmlns:cx1="http://schemas.microsoft.com/office/drawing/2015/9/8/chartex" xmlns:cx2="http://schemas.microsoft.com/office/drawing/2015/10/21/chartex" xmlns:cx3="http://schemas.microsoft.com/office/drawing/2016/5/9/chartex" xmlns:cx4="http://schemas.microsoft.com/office/drawing/2016/5/10/chartex" xmlns:cx5="http://schemas.microsoft.com/office/drawing/2016/5/11/chartex" xmlns:cx6="http://schemas.microsoft.com/office/drawing/2016/5/12/chartex" xmlns:cx7="http://schemas.microsoft.com/office/drawing/2016/5/13/chartex" xmlns:cx8="http://schemas.microsoft.com/office/drawing/2016/5/14/chartex" xmlns:mc="http://schemas.openxmlformats.org/markup-compatibility/2006" xmlns:aink="http://schemas.microsoft.com/office/drawing/2016/ink" xmlns:am3d="http://schemas.microsoft.com/office/drawing/2017/model3d" xmlns:o="urn:schemas-microsoft-com:office:office" xmlns:oel="http://schemas.microsoft.com/office/2019/extlst" xmlns:r="http://schemas.openxmlformats.org/officeDocument/2006/relationships" xmlns:m="http://schemas.openxmlformats.org/officeDocument/2006/math" xmlns:v="urn:schemas-microsoft-com:vml" xmlns:wp14="http://schemas.microsoft.com/office/word/2010/wordprocessingDrawing" xmlns:wp="http://schemas.openxmlformats.org/drawingml/2006/wordprocessingDrawing" xmlns:w10="urn:schemas-microsoft-com:office:word" xmlns:w="http://schemas.openxmlformats.org/wordprocessingml/2006/main" xmlns:w14="http://schemas.microsoft.com/office/word/2010/wordml" xmlns:w15="http://schemas.microsoft.com/office/word/2012/wordml" xmlns:w16cex="http://schemas.microsoft.com/office/word/2018/wordml/cex" xmlns:w16cid="http://schemas.microsoft.com/office/word/2016/wordml/cid" xmlns:w16="http://schemas.microsoft.com/office/word/2018/wordml" xmlns:w16du="http://schemas.microsoft.com/office/word/2023/wordml/word16du" xmlns:w16sdtdh="http://schemas.microsoft.com/office/word/2020/wordml/sdtdatahash" xmlns:w16sdtfl="http://schemas.microsoft.com/office/word/2024/wordml/sdtformatlock" xmlns:w16se="http://schemas.microsoft.com/office/word/2015/wordml/symex" xmlns:wpg="http://schemas.microsoft.com/office/word/2010/wordprocessingGroup" xmlns:wpi="http://schemas.microsoft.com/office/word/2010/wordprocessingInk" xmlns:wne="http://schemas.microsoft.com/office/word/2006/wordml" xmlns:wps="http://schemas.microsoft.com/office/word/2010/wordprocessingShape" mc:Ignorable="w14 w15 w16se w16cid w16 w16cex w16sdtdh w16sdtfl w16du wp14">
   <w:body>
     <w:p>
       <w:pPr>
@@ -2106,6 +2106,7 @@
         </w:rPr>
         <w:t>: (“</w:t>
       </w:r>
+      <w:bookmarkStart w:id="0" w:name="OLE_LINK1"/>
       <w:r>
         <w:rPr>
           <w:sz w:val="44"/>
@@ -2141,6 +2142,7 @@
         </w:rPr>
         <w:t>dSo</w:t>
       </w:r>
+      <w:bookmarkEnd w:id="0"/>
       <w:r>
         <w:rPr>
           <w:sz w:val="44"/>
@@ -3060,7 +3062,7 @@
           </mc:Choice>
           <mc:Fallback>
             <w:pict>
-              <v:shapetype w14:anchorId="11EB22A7" id="_x0000_t75" coordsize="21600,21600" o:spt="75" o:preferrelative="t" path="m@4@5l@4@11@9@11@9@5xe" filled="f" stroked="f">
+              <v:shapetype w14:anchorId="4B5F290E" id="_x0000_t75" coordsize="21600,21600" o:spt="75" o:preferrelative="t" path="m@4@5l@4@11@9@11@9@5xe" filled="f" stroked="f">
                 <v:stroke joinstyle="miter"/>
                 <v:formulas>
                   <v:f eqn="if lineDrawn pixelLineWidth 0"/>
@@ -3079,7 +3081,7 @@
                 <v:path o:extrusionok="f" gradientshapeok="t" o:connecttype="rect"/>
                 <o:lock v:ext="edit" aspectratio="t"/>
               </v:shapetype>
-              <v:shape id="Ink 64" o:spid="_x0000_s1026" type="#_x0000_t75" style="position:absolute;margin-left:47.3pt;margin-top:20.5pt;width:16.05pt;height:31.85pt;z-index:251802624;visibility:visible;mso-wrap-style:square;mso-wrap-distance-left:9pt;mso-wrap-distance-top:0;mso-wrap-distance-right:9pt;mso-wrap-distance-bottom:0;mso-position-horizontal:absolute;mso-position-horizontal-relative:text;mso-position-vertical:absolute;mso-position-vertical-relative:text" o:gfxdata="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">
+              <v:shape id="Ink 64" o:spid="_x0000_s1026" type="#_x0000_t75" style="position:absolute;margin-left:47.3pt;margin-top:20.5pt;width:16.05pt;height:31.85pt;z-index:251802624;visibility:visible;mso-wrap-style:square;mso-wrap-distance-left:9pt;mso-wrap-distance-top:0;mso-wrap-distance-right:9pt;mso-wrap-distance-bottom:0;mso-position-horizontal:absolute;mso-position-horizontal-relative:text;mso-position-vertical:absolute;mso-position-vertical-relative:text" o:gfxdata="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">
                 <v:imagedata r:id="rId21" o:title=""/>
               </v:shape>
             </w:pict>
@@ -3125,7 +3127,7 @@
           </mc:Choice>
           <mc:Fallback>
             <w:pict>
-              <v:shape w14:anchorId="5FF9EEEE" id="Ink 63" o:spid="_x0000_s1026" type="#_x0000_t75" style="position:absolute;margin-left:97.1pt;margin-top:20.65pt;width:10.35pt;height:25.05pt;z-index:251801600;visibility:visible;mso-wrap-style:square;mso-wrap-distance-left:9pt;mso-wrap-distance-top:0;mso-wrap-distance-right:9pt;mso-wrap-distance-bottom:0;mso-position-horizontal:absolute;mso-position-horizontal-relative:text;mso-position-vertical:absolute;mso-position-vertical-relative:text" o:gfxdata="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">
+              <v:shape w14:anchorId="4C2DE691" id="Ink 63" o:spid="_x0000_s1026" type="#_x0000_t75" style="position:absolute;margin-left:97.1pt;margin-top:20.65pt;width:10.35pt;height:25.05pt;z-index:251801600;visibility:visible;mso-wrap-style:square;mso-wrap-distance-left:9pt;mso-wrap-distance-top:0;mso-wrap-distance-right:9pt;mso-wrap-distance-bottom:0;mso-position-horizontal:absolute;mso-position-horizontal-relative:text;mso-position-vertical:absolute;mso-position-vertical-relative:text" o:gfxdata="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">
                 <v:imagedata r:id="rId23" o:title=""/>
               </v:shape>
             </w:pict>
@@ -3171,7 +3173,7 @@
           </mc:Choice>
           <mc:Fallback>
             <w:pict>
-              <v:shape w14:anchorId="7E8C8445" id="Ink 62" o:spid="_x0000_s1026" type="#_x0000_t75" style="position:absolute;margin-left:146.35pt;margin-top:25.4pt;width:12.2pt;height:16.4pt;z-index:251800576;visibility:visible;mso-wrap-style:square;mso-wrap-distance-left:9pt;mso-wrap-distance-top:0;mso-wrap-distance-right:9pt;mso-wrap-distance-bottom:0;mso-position-horizontal:absolute;mso-position-horizontal-relative:text;mso-position-vertical:absolute;mso-position-vertical-relative:text" o:gfxdata="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">
+              <v:shape w14:anchorId="0DE49662" id="Ink 62" o:spid="_x0000_s1026" type="#_x0000_t75" style="position:absolute;margin-left:146.35pt;margin-top:25.4pt;width:12.2pt;height:16.4pt;z-index:251800576;visibility:visible;mso-wrap-style:square;mso-wrap-distance-left:9pt;mso-wrap-distance-top:0;mso-wrap-distance-right:9pt;mso-wrap-distance-bottom:0;mso-position-horizontal:absolute;mso-position-horizontal-relative:text;mso-position-vertical:absolute;mso-position-vertical-relative:text" o:gfxdata="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">
                 <v:imagedata r:id="rId25" o:title=""/>
               </v:shape>
             </w:pict>
@@ -3217,7 +3219,7 @@
           </mc:Choice>
           <mc:Fallback>
             <w:pict>
-              <v:shape w14:anchorId="1FA5F738" id="Ink 61" o:spid="_x0000_s1026" type="#_x0000_t75" style="position:absolute;margin-left:139.35pt;margin-top:25.55pt;width:16.2pt;height:20pt;z-index:251799552;visibility:visible;mso-wrap-style:square;mso-wrap-distance-left:9pt;mso-wrap-distance-top:0;mso-wrap-distance-right:9pt;mso-wrap-distance-bottom:0;mso-position-horizontal:absolute;mso-position-horizontal-relative:text;mso-position-vertical:absolute;mso-position-vertical-relative:text" o:gfxdata="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">
+              <v:shape w14:anchorId="06B0502F" id="Ink 61" o:spid="_x0000_s1026" type="#_x0000_t75" style="position:absolute;margin-left:139.35pt;margin-top:25.55pt;width:16.2pt;height:20pt;z-index:251799552;visibility:visible;mso-wrap-style:square;mso-wrap-distance-left:9pt;mso-wrap-distance-top:0;mso-wrap-distance-right:9pt;mso-wrap-distance-bottom:0;mso-position-horizontal:absolute;mso-position-horizontal-relative:text;mso-position-vertical:absolute;mso-position-vertical-relative:text" o:gfxdata="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">
                 <v:imagedata r:id="rId27" o:title=""/>
               </v:shape>
             </w:pict>
@@ -3263,7 +3265,7 @@
           </mc:Choice>
           <mc:Fallback>
             <w:pict>
-              <v:shape w14:anchorId="1080A522" id="Ink 60" o:spid="_x0000_s1026" type="#_x0000_t75" style="position:absolute;margin-left:196.25pt;margin-top:23.95pt;width:13.65pt;height:25.7pt;z-index:251798528;visibility:visible;mso-wrap-style:square;mso-wrap-distance-left:9pt;mso-wrap-distance-top:0;mso-wrap-distance-right:9pt;mso-wrap-distance-bottom:0;mso-position-horizontal:absolute;mso-position-horizontal-relative:text;mso-position-vertical:absolute;mso-position-vertical-relative:text" o:gfxdata="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">
+              <v:shape w14:anchorId="47BD2BE2" id="Ink 60" o:spid="_x0000_s1026" type="#_x0000_t75" style="position:absolute;margin-left:196.25pt;margin-top:23.95pt;width:13.65pt;height:25.7pt;z-index:251798528;visibility:visible;mso-wrap-style:square;mso-wrap-distance-left:9pt;mso-wrap-distance-top:0;mso-wrap-distance-right:9pt;mso-wrap-distance-bottom:0;mso-position-horizontal:absolute;mso-position-horizontal-relative:text;mso-position-vertical:absolute;mso-position-vertical-relative:text" o:gfxdata="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">
                 <v:imagedata r:id="rId29" o:title=""/>
               </v:shape>
             </w:pict>
@@ -3309,7 +3311,7 @@
           </mc:Choice>
           <mc:Fallback>
             <w:pict>
-              <v:shape w14:anchorId="24EC5F1E" id="Ink 59" o:spid="_x0000_s1026" type="#_x0000_t75" style="position:absolute;margin-left:247.7pt;margin-top:18.75pt;width:16pt;height:11.95pt;z-index:251797504;visibility:visible;mso-wrap-style:square;mso-wrap-distance-left:9pt;mso-wrap-distance-top:0;mso-wrap-distance-right:9pt;mso-wrap-distance-bottom:0;mso-position-horizontal:absolute;mso-position-horizontal-relative:text;mso-position-vertical:absolute;mso-position-vertical-relative:text" o:gfxdata="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">
+              <v:shape w14:anchorId="30738DA2" id="Ink 59" o:spid="_x0000_s1026" type="#_x0000_t75" style="position:absolute;margin-left:247.7pt;margin-top:18.75pt;width:16pt;height:11.95pt;z-index:251797504;visibility:visible;mso-wrap-style:square;mso-wrap-distance-left:9pt;mso-wrap-distance-top:0;mso-wrap-distance-right:9pt;mso-wrap-distance-bottom:0;mso-position-horizontal:absolute;mso-position-horizontal-relative:text;mso-position-vertical:absolute;mso-position-vertical-relative:text" o:gfxdata="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">
                 <v:imagedata r:id="rId31" o:title=""/>
               </v:shape>
             </w:pict>
@@ -3355,7 +3357,7 @@
           </mc:Choice>
           <mc:Fallback>
             <w:pict>
-              <v:shape w14:anchorId="21F752D7" id="Ink 58" o:spid="_x0000_s1026" type="#_x0000_t75" style="position:absolute;margin-left:248.05pt;margin-top:25.55pt;width:8.55pt;height:16.5pt;z-index:251796480;visibility:visible;mso-wrap-style:square;mso-wrap-distance-left:9pt;mso-wrap-distance-top:0;mso-wrap-distance-right:9pt;mso-wrap-distance-bottom:0;mso-position-horizontal:absolute;mso-position-horizontal-relative:text;mso-position-vertical:absolute;mso-position-vertical-relative:text" o:gfxdata="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">
+              <v:shape w14:anchorId="40CD3380" id="Ink 58" o:spid="_x0000_s1026" type="#_x0000_t75" style="position:absolute;margin-left:248.05pt;margin-top:25.55pt;width:8.55pt;height:16.5pt;z-index:251796480;visibility:visible;mso-wrap-style:square;mso-wrap-distance-left:9pt;mso-wrap-distance-top:0;mso-wrap-distance-right:9pt;mso-wrap-distance-bottom:0;mso-position-horizontal:absolute;mso-position-horizontal-relative:text;mso-position-vertical:absolute;mso-position-vertical-relative:text" o:gfxdata="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">
                 <v:imagedata r:id="rId33" o:title=""/>
               </v:shape>
             </w:pict>
@@ -3401,7 +3403,7 @@
           </mc:Choice>
           <mc:Fallback>
             <w:pict>
-              <v:shape w14:anchorId="74F8847C" id="Ink 57" o:spid="_x0000_s1026" type="#_x0000_t75" style="position:absolute;margin-left:294.8pt;margin-top:24.95pt;width:6pt;height:20.15pt;z-index:251795456;visibility:visible;mso-wrap-style:square;mso-wrap-distance-left:9pt;mso-wrap-distance-top:0;mso-wrap-distance-right:9pt;mso-wrap-distance-bottom:0;mso-position-horizontal:absolute;mso-position-horizontal-relative:text;mso-position-vertical:absolute;mso-position-vertical-relative:text" o:gfxdata="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">
+              <v:shape w14:anchorId="0B520E7A" id="Ink 57" o:spid="_x0000_s1026" type="#_x0000_t75" style="position:absolute;margin-left:294.8pt;margin-top:24.95pt;width:6pt;height:20.15pt;z-index:251795456;visibility:visible;mso-wrap-style:square;mso-wrap-distance-left:9pt;mso-wrap-distance-top:0;mso-wrap-distance-right:9pt;mso-wrap-distance-bottom:0;mso-position-horizontal:absolute;mso-position-horizontal-relative:text;mso-position-vertical:absolute;mso-position-vertical-relative:text" o:gfxdata="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">
                 <v:imagedata r:id="rId35" o:title=""/>
               </v:shape>
             </w:pict>
@@ -3447,7 +3449,7 @@
           </mc:Choice>
           <mc:Fallback>
             <w:pict>
-              <v:shape w14:anchorId="70DE56B4" id="Ink 56" o:spid="_x0000_s1026" type="#_x0000_t75" style="position:absolute;margin-left:289.75pt;margin-top:15.05pt;width:11.25pt;height:19.9pt;z-index:251794432;visibility:visible;mso-wrap-style:square;mso-wrap-distance-left:9pt;mso-wrap-distance-top:0;mso-wrap-distance-right:9pt;mso-wrap-distance-bottom:0;mso-position-horizontal:absolute;mso-position-horizontal-relative:text;mso-position-vertical:absolute;mso-position-vertical-relative:text" o:gfxdata="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">
+              <v:shape w14:anchorId="2217F8DA" id="Ink 56" o:spid="_x0000_s1026" type="#_x0000_t75" style="position:absolute;margin-left:289.75pt;margin-top:15.05pt;width:11.25pt;height:19.9pt;z-index:251794432;visibility:visible;mso-wrap-style:square;mso-wrap-distance-left:9pt;mso-wrap-distance-top:0;mso-wrap-distance-right:9pt;mso-wrap-distance-bottom:0;mso-position-horizontal:absolute;mso-position-horizontal-relative:text;mso-position-vertical:absolute;mso-position-vertical-relative:text" o:gfxdata="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">
                 <v:imagedata r:id="rId37" o:title=""/>
               </v:shape>
             </w:pict>
@@ -3493,7 +3495,7 @@
           </mc:Choice>
           <mc:Fallback>
             <w:pict>
-              <v:shape w14:anchorId="7A1A4003" id="Ink 55" o:spid="_x0000_s1026" type="#_x0000_t75" style="position:absolute;margin-left:341.65pt;margin-top:16.45pt;width:8.35pt;height:17.4pt;z-index:251793408;visibility:visible;mso-wrap-style:square;mso-wrap-distance-left:9pt;mso-wrap-distance-top:0;mso-wrap-distance-right:9pt;mso-wrap-distance-bottom:0;mso-position-horizontal:absolute;mso-position-horizontal-relative:text;mso-position-vertical:absolute;mso-position-vertical-relative:text" o:gfxdata="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">
+              <v:shape w14:anchorId="49DA95CC" id="Ink 55" o:spid="_x0000_s1026" type="#_x0000_t75" style="position:absolute;margin-left:341.65pt;margin-top:16.45pt;width:8.35pt;height:17.4pt;z-index:251793408;visibility:visible;mso-wrap-style:square;mso-wrap-distance-left:9pt;mso-wrap-distance-top:0;mso-wrap-distance-right:9pt;mso-wrap-distance-bottom:0;mso-position-horizontal:absolute;mso-position-horizontal-relative:text;mso-position-vertical:absolute;mso-position-vertical-relative:text" o:gfxdata="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">
                 <v:imagedata r:id="rId39" o:title=""/>
               </v:shape>
             </w:pict>
@@ -3539,7 +3541,7 @@
           </mc:Choice>
           <mc:Fallback>
             <w:pict>
-              <v:shape w14:anchorId="6265431C" id="Ink 54" o:spid="_x0000_s1026" type="#_x0000_t75" style="position:absolute;margin-left:389.45pt;margin-top:13.1pt;width:17.3pt;height:19.1pt;z-index:251792384;visibility:visible;mso-wrap-style:square;mso-wrap-distance-left:9pt;mso-wrap-distance-top:0;mso-wrap-distance-right:9pt;mso-wrap-distance-bottom:0;mso-position-horizontal:absolute;mso-position-horizontal-relative:text;mso-position-vertical:absolute;mso-position-vertical-relative:text" o:gfxdata="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">
+              <v:shape w14:anchorId="4EED9541" id="Ink 54" o:spid="_x0000_s1026" type="#_x0000_t75" style="position:absolute;margin-left:389.45pt;margin-top:13.1pt;width:17.3pt;height:19.1pt;z-index:251792384;visibility:visible;mso-wrap-style:square;mso-wrap-distance-left:9pt;mso-wrap-distance-top:0;mso-wrap-distance-right:9pt;mso-wrap-distance-bottom:0;mso-position-horizontal:absolute;mso-position-horizontal-relative:text;mso-position-vertical:absolute;mso-position-vertical-relative:text" o:gfxdata="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">
                 <v:imagedata r:id="rId41" o:title=""/>
               </v:shape>
             </w:pict>
@@ -3585,7 +3587,7 @@
           </mc:Choice>
           <mc:Fallback>
             <w:pict>
-              <v:shape w14:anchorId="2D037350" id="Ink 53" o:spid="_x0000_s1026" type="#_x0000_t75" style="position:absolute;margin-left:439.15pt;margin-top:8.45pt;width:5.7pt;height:13.55pt;z-index:251791360;visibility:visible;mso-wrap-style:square;mso-wrap-distance-left:9pt;mso-wrap-distance-top:0;mso-wrap-distance-right:9pt;mso-wrap-distance-bottom:0;mso-position-horizontal:absolute;mso-position-horizontal-relative:text;mso-position-vertical:absolute;mso-position-vertical-relative:text" o:gfxdata="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">
+              <v:shape w14:anchorId="05AA36E0" id="Ink 53" o:spid="_x0000_s1026" type="#_x0000_t75" style="position:absolute;margin-left:439.15pt;margin-top:8.45pt;width:5.7pt;height:13.55pt;z-index:251791360;visibility:visible;mso-wrap-style:square;mso-wrap-distance-left:9pt;mso-wrap-distance-top:0;mso-wrap-distance-right:9pt;mso-wrap-distance-bottom:0;mso-position-horizontal:absolute;mso-position-horizontal-relative:text;mso-position-vertical:absolute;mso-position-vertical-relative:text" o:gfxdata="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">
                 <v:imagedata r:id="rId43" o:title=""/>
               </v:shape>
             </w:pict>
@@ -3631,7 +3633,7 @@
           </mc:Choice>
           <mc:Fallback>
             <w:pict>
-              <v:shape w14:anchorId="4783368C" id="Ink 52" o:spid="_x0000_s1026" type="#_x0000_t75" style="position:absolute;margin-left:425.1pt;margin-top:29.5pt;width:39.7pt;height:20.65pt;z-index:251790336;visibility:visible;mso-wrap-style:square;mso-wrap-distance-left:9pt;mso-wrap-distance-top:0;mso-wrap-distance-right:9pt;mso-wrap-distance-bottom:0;mso-position-horizontal:absolute;mso-position-horizontal-relative:text;mso-position-vertical:absolute;mso-position-vertical-relative:text" o:gfxdata="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">
+              <v:shape w14:anchorId="6CF9581A" id="Ink 52" o:spid="_x0000_s1026" type="#_x0000_t75" style="position:absolute;margin-left:425.1pt;margin-top:29.5pt;width:39.7pt;height:20.65pt;z-index:251790336;visibility:visible;mso-wrap-style:square;mso-wrap-distance-left:9pt;mso-wrap-distance-top:0;mso-wrap-distance-right:9pt;mso-wrap-distance-bottom:0;mso-position-horizontal:absolute;mso-position-horizontal-relative:text;mso-position-vertical:absolute;mso-position-vertical-relative:text" o:gfxdata="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">
                 <v:imagedata r:id="rId45" o:title=""/>
               </v:shape>
             </w:pict>
@@ -3677,7 +3679,7 @@
           </mc:Choice>
           <mc:Fallback>
             <w:pict>
-              <v:shape w14:anchorId="135F5E28" id="Ink 51" o:spid="_x0000_s1026" type="#_x0000_t75" style="position:absolute;margin-left:493.8pt;margin-top:20.8pt;width:11.7pt;height:13.05pt;z-index:251789312;visibility:visible;mso-wrap-style:square;mso-wrap-distance-left:9pt;mso-wrap-distance-top:0;mso-wrap-distance-right:9pt;mso-wrap-distance-bottom:0;mso-position-horizontal:absolute;mso-position-horizontal-relative:text;mso-position-vertical:absolute;mso-position-vertical-relative:text" o:gfxdata="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">
+              <v:shape w14:anchorId="70D64F5F" id="Ink 51" o:spid="_x0000_s1026" type="#_x0000_t75" style="position:absolute;margin-left:493.8pt;margin-top:20.8pt;width:11.7pt;height:13.05pt;z-index:251789312;visibility:visible;mso-wrap-style:square;mso-wrap-distance-left:9pt;mso-wrap-distance-top:0;mso-wrap-distance-right:9pt;mso-wrap-distance-bottom:0;mso-position-horizontal:absolute;mso-position-horizontal-relative:text;mso-position-vertical:absolute;mso-position-vertical-relative:text" o:gfxdata="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">
                 <v:imagedata r:id="rId47" o:title=""/>
               </v:shape>
             </w:pict>
@@ -3723,7 +3725,7 @@
           </mc:Choice>
           <mc:Fallback>
             <w:pict>
-              <v:shape w14:anchorId="54985938" id="Ink 4" o:spid="_x0000_s1026" type="#_x0000_t75" style="position:absolute;margin-left:-7.65pt;margin-top:62.85pt;width:10.8pt;height:10.3pt;z-index:251786240;visibility:visible;mso-wrap-style:square;mso-wrap-distance-left:9pt;mso-wrap-distance-top:0;mso-wrap-distance-right:9pt;mso-wrap-distance-bottom:0;mso-position-horizontal:absolute;mso-position-horizontal-relative:text;mso-position-vertical:absolute;mso-position-vertical-relative:text" o:gfxdata="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">
+              <v:shape w14:anchorId="1A888211" id="Ink 4" o:spid="_x0000_s1026" type="#_x0000_t75" style="position:absolute;margin-left:-7.65pt;margin-top:62.85pt;width:10.8pt;height:10.3pt;z-index:251786240;visibility:visible;mso-wrap-style:square;mso-wrap-distance-left:9pt;mso-wrap-distance-top:0;mso-wrap-distance-right:9pt;mso-wrap-distance-bottom:0;mso-position-horizontal:absolute;mso-position-horizontal-relative:text;mso-position-vertical:absolute;mso-position-vertical-relative:text" o:gfxdata="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">
                 <v:imagedata r:id="rId49" o:title=""/>
               </v:shape>
             </w:pict>
@@ -3769,7 +3771,7 @@
           </mc:Choice>
           <mc:Fallback>
             <w:pict>
-              <v:shape w14:anchorId="0FD27D57" id="Ink 3" o:spid="_x0000_s1026" type="#_x0000_t75" style="position:absolute;margin-left:-8.85pt;margin-top:39.4pt;width:19.65pt;height:8.75pt;z-index:251785216;visibility:visible;mso-wrap-style:square;mso-wrap-distance-left:9pt;mso-wrap-distance-top:0;mso-wrap-distance-right:9pt;mso-wrap-distance-bottom:0;mso-position-horizontal:absolute;mso-position-horizontal-relative:text;mso-position-vertical:absolute;mso-position-vertical-relative:text" o:gfxdata="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">
+              <v:shape w14:anchorId="5DCE8191" id="Ink 3" o:spid="_x0000_s1026" type="#_x0000_t75" style="position:absolute;margin-left:-8.85pt;margin-top:39.4pt;width:19.65pt;height:8.75pt;z-index:251785216;visibility:visible;mso-wrap-style:square;mso-wrap-distance-left:9pt;mso-wrap-distance-top:0;mso-wrap-distance-right:9pt;mso-wrap-distance-bottom:0;mso-position-horizontal:absolute;mso-position-horizontal-relative:text;mso-position-vertical:absolute;mso-position-vertical-relative:text" o:gfxdata="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">
                 <v:imagedata r:id="rId51" o:title=""/>
               </v:shape>
             </w:pict>
@@ -3815,7 +3817,6 @@
               <w:bottom w:val="nil"/>
               <w:right w:val="nil"/>
             </w:tcBorders>
-            <w:shd w:val="clear" w:color="auto" w:fill="auto"/>
             <w:noWrap/>
             <w:vAlign w:val="bottom"/>
             <w:hideMark/>
@@ -3869,7 +3870,7 @@
                 </mc:Choice>
                 <mc:Fallback>
                   <w:pict>
-                    <v:shape w14:anchorId="3019FFAD" id="Ink 2" o:spid="_x0000_s1026" type="#_x0000_t75" style="position:absolute;margin-left:-5.3pt;margin-top:-5pt;width:10.45pt;height:22.35pt;z-index:251784192;visibility:visible;mso-wrap-style:square;mso-wrap-distance-left:9pt;mso-wrap-distance-top:0;mso-wrap-distance-right:9pt;mso-wrap-distance-bottom:0;mso-position-horizontal:absolute;mso-position-horizontal-relative:text;mso-position-vertical:absolute;mso-position-vertical-relative:text" o:gfxdata="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">
+                    <v:shape w14:anchorId="493954B4" id="Ink 2" o:spid="_x0000_s1026" type="#_x0000_t75" style="position:absolute;margin-left:-5.3pt;margin-top:-5pt;width:10.45pt;height:22.35pt;z-index:251784192;visibility:visible;mso-wrap-style:square;mso-wrap-distance-left:9pt;mso-wrap-distance-top:0;mso-wrap-distance-right:9pt;mso-wrap-distance-bottom:0;mso-position-horizontal:absolute;mso-position-horizontal-relative:text;mso-position-vertical:absolute;mso-position-vertical-relative:text" o:gfxdata="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">
                       <v:imagedata r:id="rId53" o:title=""/>
                     </v:shape>
                   </w:pict>
@@ -3904,7 +3905,6 @@
               <w:bottom w:val="nil"/>
               <w:right w:val="nil"/>
             </w:tcBorders>
-            <w:shd w:val="clear" w:color="auto" w:fill="auto"/>
             <w:noWrap/>
             <w:vAlign w:val="bottom"/>
             <w:hideMark/>
@@ -3936,7 +3936,6 @@
               <w:bottom w:val="nil"/>
               <w:right w:val="nil"/>
             </w:tcBorders>
-            <w:shd w:val="clear" w:color="auto" w:fill="auto"/>
             <w:noWrap/>
             <w:vAlign w:val="bottom"/>
             <w:hideMark/>
@@ -3968,7 +3967,6 @@
               <w:bottom w:val="nil"/>
               <w:right w:val="nil"/>
             </w:tcBorders>
-            <w:shd w:val="clear" w:color="auto" w:fill="auto"/>
             <w:noWrap/>
             <w:vAlign w:val="bottom"/>
             <w:hideMark/>
@@ -4000,7 +3998,6 @@
               <w:bottom w:val="nil"/>
               <w:right w:val="nil"/>
             </w:tcBorders>
-            <w:shd w:val="clear" w:color="auto" w:fill="auto"/>
             <w:noWrap/>
             <w:vAlign w:val="bottom"/>
             <w:hideMark/>
@@ -4032,7 +4029,6 @@
               <w:bottom w:val="nil"/>
               <w:right w:val="nil"/>
             </w:tcBorders>
-            <w:shd w:val="clear" w:color="auto" w:fill="auto"/>
             <w:noWrap/>
             <w:vAlign w:val="bottom"/>
             <w:hideMark/>
@@ -4064,7 +4060,6 @@
               <w:bottom w:val="nil"/>
               <w:right w:val="nil"/>
             </w:tcBorders>
-            <w:shd w:val="clear" w:color="auto" w:fill="auto"/>
             <w:noWrap/>
             <w:vAlign w:val="bottom"/>
             <w:hideMark/>
@@ -4096,7 +4091,6 @@
               <w:bottom w:val="nil"/>
               <w:right w:val="nil"/>
             </w:tcBorders>
-            <w:shd w:val="clear" w:color="auto" w:fill="auto"/>
             <w:noWrap/>
             <w:vAlign w:val="bottom"/>
             <w:hideMark/>
@@ -4128,7 +4122,6 @@
               <w:bottom w:val="nil"/>
               <w:right w:val="nil"/>
             </w:tcBorders>
-            <w:shd w:val="clear" w:color="auto" w:fill="auto"/>
             <w:noWrap/>
             <w:vAlign w:val="bottom"/>
             <w:hideMark/>
@@ -4160,7 +4153,6 @@
               <w:bottom w:val="nil"/>
               <w:right w:val="nil"/>
             </w:tcBorders>
-            <w:shd w:val="clear" w:color="auto" w:fill="auto"/>
             <w:noWrap/>
             <w:vAlign w:val="bottom"/>
             <w:hideMark/>
@@ -4192,7 +4184,6 @@
               <w:bottom w:val="nil"/>
               <w:right w:val="nil"/>
             </w:tcBorders>
-            <w:shd w:val="clear" w:color="auto" w:fill="auto"/>
             <w:noWrap/>
             <w:vAlign w:val="bottom"/>
             <w:hideMark/>
@@ -4246,7 +4237,7 @@
                 </mc:Choice>
                 <mc:Fallback>
                   <w:pict>
-                    <v:shape w14:anchorId="7D7F9928" id="Ink 50" o:spid="_x0000_s1026" type="#_x0000_t75" style="position:absolute;margin-left:-2.25pt;margin-top:-4.45pt;width:32.7pt;height:10.85pt;z-index:251788288;visibility:visible;mso-wrap-style:square;mso-wrap-distance-left:9pt;mso-wrap-distance-top:0;mso-wrap-distance-right:9pt;mso-wrap-distance-bottom:0;mso-position-horizontal:absolute;mso-position-horizontal-relative:text;mso-position-vertical:absolute;mso-position-vertical-relative:text" o:gfxdata="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">
+                    <v:shape w14:anchorId="5F3B2294" id="Ink 50" o:spid="_x0000_s1026" type="#_x0000_t75" style="position:absolute;margin-left:-2.25pt;margin-top:-4.45pt;width:32.7pt;height:10.85pt;z-index:251788288;visibility:visible;mso-wrap-style:square;mso-wrap-distance-left:9pt;mso-wrap-distance-top:0;mso-wrap-distance-right:9pt;mso-wrap-distance-bottom:0;mso-position-horizontal:absolute;mso-position-horizontal-relative:text;mso-position-vertical:absolute;mso-position-vertical-relative:text" o:gfxdata="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">
                       <v:imagedata r:id="rId55" o:title=""/>
                     </v:shape>
                   </w:pict>
@@ -4276,7 +4267,6 @@
               <w:bottom w:val="nil"/>
               <w:right w:val="nil"/>
             </w:tcBorders>
-            <w:shd w:val="clear" w:color="auto" w:fill="auto"/>
             <w:noWrap/>
             <w:vAlign w:val="bottom"/>
             <w:hideMark/>
@@ -4330,7 +4320,7 @@
                 </mc:Choice>
                 <mc:Fallback>
                   <w:pict>
-                    <v:shape w14:anchorId="2A7F00C5" id="Ink 25" o:spid="_x0000_s1026" type="#_x0000_t75" style="position:absolute;margin-left:-4.35pt;margin-top:2.75pt;width:11.6pt;height:14.8pt;z-index:251787264;visibility:visible;mso-wrap-style:square;mso-wrap-distance-left:9pt;mso-wrap-distance-top:0;mso-wrap-distance-right:9pt;mso-wrap-distance-bottom:0;mso-position-horizontal:absolute;mso-position-horizontal-relative:text;mso-position-vertical:absolute;mso-position-vertical-relative:text" o:gfxdata="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">
+                    <v:shape w14:anchorId="6BDBF869" id="Ink 25" o:spid="_x0000_s1026" type="#_x0000_t75" style="position:absolute;margin-left:-4.35pt;margin-top:2.75pt;width:11.6pt;height:14.8pt;z-index:251787264;visibility:visible;mso-wrap-style:square;mso-wrap-distance-left:9pt;mso-wrap-distance-top:0;mso-wrap-distance-right:9pt;mso-wrap-distance-bottom:0;mso-position-horizontal:absolute;mso-position-horizontal-relative:text;mso-position-vertical:absolute;mso-position-vertical-relative:text" o:gfxdata="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">
                       <v:imagedata r:id="rId57" o:title=""/>
                     </v:shape>
                   </w:pict>
@@ -4355,7 +4345,6 @@
               <w:bottom w:val="nil"/>
               <w:right w:val="nil"/>
             </w:tcBorders>
-            <w:shd w:val="clear" w:color="auto" w:fill="auto"/>
             <w:noWrap/>
             <w:vAlign w:val="bottom"/>
             <w:hideMark/>
@@ -4387,7 +4376,6 @@
               <w:bottom w:val="nil"/>
               <w:right w:val="nil"/>
             </w:tcBorders>
-            <w:shd w:val="clear" w:color="auto" w:fill="auto"/>
             <w:noWrap/>
             <w:vAlign w:val="bottom"/>
             <w:hideMark/>
@@ -4419,7 +4407,6 @@
               <w:bottom w:val="nil"/>
               <w:right w:val="nil"/>
             </w:tcBorders>
-            <w:shd w:val="clear" w:color="auto" w:fill="auto"/>
             <w:noWrap/>
             <w:vAlign w:val="bottom"/>
             <w:hideMark/>
@@ -4451,7 +4438,6 @@
               <w:bottom w:val="nil"/>
               <w:right w:val="nil"/>
             </w:tcBorders>
-            <w:shd w:val="clear" w:color="auto" w:fill="auto"/>
             <w:noWrap/>
             <w:vAlign w:val="bottom"/>
             <w:hideMark/>
@@ -4483,7 +4469,6 @@
               <w:bottom w:val="nil"/>
               <w:right w:val="nil"/>
             </w:tcBorders>
-            <w:shd w:val="clear" w:color="auto" w:fill="auto"/>
             <w:noWrap/>
             <w:vAlign w:val="bottom"/>
             <w:hideMark/>
@@ -4515,7 +4500,6 @@
               <w:bottom w:val="nil"/>
               <w:right w:val="nil"/>
             </w:tcBorders>
-            <w:shd w:val="clear" w:color="auto" w:fill="auto"/>
             <w:noWrap/>
             <w:vAlign w:val="bottom"/>
             <w:hideMark/>
@@ -4547,7 +4531,6 @@
               <w:bottom w:val="nil"/>
               <w:right w:val="nil"/>
             </w:tcBorders>
-            <w:shd w:val="clear" w:color="auto" w:fill="auto"/>
             <w:noWrap/>
             <w:vAlign w:val="bottom"/>
             <w:hideMark/>
@@ -4579,7 +4562,6 @@
               <w:bottom w:val="nil"/>
               <w:right w:val="nil"/>
             </w:tcBorders>
-            <w:shd w:val="clear" w:color="auto" w:fill="auto"/>
             <w:noWrap/>
             <w:vAlign w:val="bottom"/>
             <w:hideMark/>
@@ -4611,7 +4593,6 @@
               <w:bottom w:val="nil"/>
               <w:right w:val="nil"/>
             </w:tcBorders>
-            <w:shd w:val="clear" w:color="auto" w:fill="auto"/>
             <w:noWrap/>
             <w:vAlign w:val="bottom"/>
             <w:hideMark/>
@@ -4643,7 +4624,6 @@
               <w:bottom w:val="nil"/>
               <w:right w:val="nil"/>
             </w:tcBorders>
-            <w:shd w:val="clear" w:color="auto" w:fill="auto"/>
             <w:noWrap/>
             <w:vAlign w:val="bottom"/>
             <w:hideMark/>
@@ -4713,7 +4693,7 @@
           </mc:Choice>
           <mc:Fallback>
             <w:pict>
-              <v:shape w14:anchorId="56010E2E" id="Ink 94" o:spid="_x0000_s1026" type="#_x0000_t75" style="position:absolute;margin-left:37.6pt;margin-top:11.65pt;width:18.15pt;height:17.1pt;z-index:251830272;visibility:visible;mso-wrap-style:square;mso-wrap-distance-left:9pt;mso-wrap-distance-top:0;mso-wrap-distance-right:9pt;mso-wrap-distance-bottom:0;mso-position-horizontal:absolute;mso-position-horizontal-relative:text;mso-position-vertical:absolute;mso-position-vertical-relative:text" o:gfxdata="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">
+              <v:shape w14:anchorId="0E4053E8" id="Ink 94" o:spid="_x0000_s1026" type="#_x0000_t75" style="position:absolute;margin-left:37.6pt;margin-top:11.65pt;width:18.15pt;height:17.1pt;z-index:251830272;visibility:visible;mso-wrap-style:square;mso-wrap-distance-left:9pt;mso-wrap-distance-top:0;mso-wrap-distance-right:9pt;mso-wrap-distance-bottom:0;mso-position-horizontal:absolute;mso-position-horizontal-relative:text;mso-position-vertical:absolute;mso-position-vertical-relative:text" o:gfxdata="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">
                 <v:imagedata r:id="rId59" o:title=""/>
               </v:shape>
             </w:pict>
@@ -4759,7 +4739,7 @@
           </mc:Choice>
           <mc:Fallback>
             <w:pict>
-              <v:shape w14:anchorId="73A0A995" id="Ink 93" o:spid="_x0000_s1026" type="#_x0000_t75" style="position:absolute;margin-left:23.15pt;margin-top:17.15pt;width:11.85pt;height:13.25pt;z-index:251829248;visibility:visible;mso-wrap-style:square;mso-wrap-distance-left:9pt;mso-wrap-distance-top:0;mso-wrap-distance-right:9pt;mso-wrap-distance-bottom:0;mso-position-horizontal:absolute;mso-position-horizontal-relative:text;mso-position-vertical:absolute;mso-position-vertical-relative:text" o:gfxdata="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">
+              <v:shape w14:anchorId="2E3155C6" id="Ink 93" o:spid="_x0000_s1026" type="#_x0000_t75" style="position:absolute;margin-left:23.15pt;margin-top:17.15pt;width:11.85pt;height:13.25pt;z-index:251829248;visibility:visible;mso-wrap-style:square;mso-wrap-distance-left:9pt;mso-wrap-distance-top:0;mso-wrap-distance-right:9pt;mso-wrap-distance-bottom:0;mso-position-horizontal:absolute;mso-position-horizontal-relative:text;mso-position-vertical:absolute;mso-position-vertical-relative:text" o:gfxdata="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">
                 <v:imagedata r:id="rId61" o:title=""/>
               </v:shape>
             </w:pict>
@@ -4805,7 +4785,7 @@
           </mc:Choice>
           <mc:Fallback>
             <w:pict>
-              <v:shape w14:anchorId="3943F534" id="Ink 92" o:spid="_x0000_s1026" type="#_x0000_t75" style="position:absolute;margin-left:84.45pt;margin-top:.75pt;width:12.4pt;height:16.15pt;z-index:251828224;visibility:visible;mso-wrap-style:square;mso-wrap-distance-left:9pt;mso-wrap-distance-top:0;mso-wrap-distance-right:9pt;mso-wrap-distance-bottom:0;mso-position-horizontal:absolute;mso-position-horizontal-relative:text;mso-position-vertical:absolute;mso-position-vertical-relative:text" o:gfxdata="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">
+              <v:shape w14:anchorId="7A388256" id="Ink 92" o:spid="_x0000_s1026" type="#_x0000_t75" style="position:absolute;margin-left:84.45pt;margin-top:.75pt;width:12.4pt;height:16.15pt;z-index:251828224;visibility:visible;mso-wrap-style:square;mso-wrap-distance-left:9pt;mso-wrap-distance-top:0;mso-wrap-distance-right:9pt;mso-wrap-distance-bottom:0;mso-position-horizontal:absolute;mso-position-horizontal-relative:text;mso-position-vertical:absolute;mso-position-vertical-relative:text" o:gfxdata="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">
                 <v:imagedata r:id="rId63" o:title=""/>
               </v:shape>
             </w:pict>
@@ -4851,7 +4831,7 @@
           </mc:Choice>
           <mc:Fallback>
             <w:pict>
-              <v:shape w14:anchorId="09E643C8" id="Ink 91" o:spid="_x0000_s1026" type="#_x0000_t75" style="position:absolute;margin-left:83.15pt;margin-top:12.45pt;width:7.6pt;height:16.9pt;z-index:251827200;visibility:visible;mso-wrap-style:square;mso-wrap-distance-left:9pt;mso-wrap-distance-top:0;mso-wrap-distance-right:9pt;mso-wrap-distance-bottom:0;mso-position-horizontal:absolute;mso-position-horizontal-relative:text;mso-position-vertical:absolute;mso-position-vertical-relative:text" o:gfxdata="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">
+              <v:shape w14:anchorId="7A4922B6" id="Ink 91" o:spid="_x0000_s1026" type="#_x0000_t75" style="position:absolute;margin-left:83.15pt;margin-top:12.45pt;width:7.6pt;height:16.9pt;z-index:251827200;visibility:visible;mso-wrap-style:square;mso-wrap-distance-left:9pt;mso-wrap-distance-top:0;mso-wrap-distance-right:9pt;mso-wrap-distance-bottom:0;mso-position-horizontal:absolute;mso-position-horizontal-relative:text;mso-position-vertical:absolute;mso-position-vertical-relative:text" o:gfxdata="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">
                 <v:imagedata r:id="rId65" o:title=""/>
               </v:shape>
             </w:pict>
@@ -4897,7 +4877,7 @@
           </mc:Choice>
           <mc:Fallback>
             <w:pict>
-              <v:shape w14:anchorId="4FEA59BB" id="Ink 90" o:spid="_x0000_s1026" type="#_x0000_t75" style="position:absolute;margin-left:69.3pt;margin-top:13.65pt;width:9.75pt;height:23.35pt;z-index:251826176;visibility:visible;mso-wrap-style:square;mso-wrap-distance-left:9pt;mso-wrap-distance-top:0;mso-wrap-distance-right:9pt;mso-wrap-distance-bottom:0;mso-position-horizontal:absolute;mso-position-horizontal-relative:text;mso-position-vertical:absolute;mso-position-vertical-relative:text" o:gfxdata="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">
+              <v:shape w14:anchorId="568FE98A" id="Ink 90" o:spid="_x0000_s1026" type="#_x0000_t75" style="position:absolute;margin-left:69.3pt;margin-top:13.65pt;width:9.75pt;height:23.35pt;z-index:251826176;visibility:visible;mso-wrap-style:square;mso-wrap-distance-left:9pt;mso-wrap-distance-top:0;mso-wrap-distance-right:9pt;mso-wrap-distance-bottom:0;mso-position-horizontal:absolute;mso-position-horizontal-relative:text;mso-position-vertical:absolute;mso-position-vertical-relative:text" o:gfxdata="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">
                 <v:imagedata r:id="rId67" o:title=""/>
               </v:shape>
             </w:pict>
@@ -4943,7 +4923,7 @@
           </mc:Choice>
           <mc:Fallback>
             <w:pict>
-              <v:shape w14:anchorId="4882BA2C" id="Ink 89" o:spid="_x0000_s1026" type="#_x0000_t75" style="position:absolute;margin-left:129.3pt;margin-top:11.6pt;width:7pt;height:19.2pt;z-index:251825152;visibility:visible;mso-wrap-style:square;mso-wrap-distance-left:9pt;mso-wrap-distance-top:0;mso-wrap-distance-right:9pt;mso-wrap-distance-bottom:0;mso-position-horizontal:absolute;mso-position-horizontal-relative:text;mso-position-vertical:absolute;mso-position-vertical-relative:text" o:gfxdata="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">
+              <v:shape w14:anchorId="10898152" id="Ink 89" o:spid="_x0000_s1026" type="#_x0000_t75" style="position:absolute;margin-left:129.3pt;margin-top:11.6pt;width:7pt;height:19.2pt;z-index:251825152;visibility:visible;mso-wrap-style:square;mso-wrap-distance-left:9pt;mso-wrap-distance-top:0;mso-wrap-distance-right:9pt;mso-wrap-distance-bottom:0;mso-position-horizontal:absolute;mso-position-horizontal-relative:text;mso-position-vertical:absolute;mso-position-vertical-relative:text" o:gfxdata="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">
                 <v:imagedata r:id="rId69" o:title=""/>
               </v:shape>
             </w:pict>
@@ -4989,7 +4969,7 @@
           </mc:Choice>
           <mc:Fallback>
             <w:pict>
-              <v:shape w14:anchorId="68F27111" id="Ink 88" o:spid="_x0000_s1026" type="#_x0000_t75" style="position:absolute;margin-left:114.75pt;margin-top:16.95pt;width:12.35pt;height:20.85pt;z-index:251824128;visibility:visible;mso-wrap-style:square;mso-wrap-distance-left:9pt;mso-wrap-distance-top:0;mso-wrap-distance-right:9pt;mso-wrap-distance-bottom:0;mso-position-horizontal:absolute;mso-position-horizontal-relative:text;mso-position-vertical:absolute;mso-position-vertical-relative:text" o:gfxdata="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">
+              <v:shape w14:anchorId="2ED75BAC" id="Ink 88" o:spid="_x0000_s1026" type="#_x0000_t75" style="position:absolute;margin-left:114.75pt;margin-top:16.95pt;width:12.35pt;height:20.85pt;z-index:251824128;visibility:visible;mso-wrap-style:square;mso-wrap-distance-left:9pt;mso-wrap-distance-top:0;mso-wrap-distance-right:9pt;mso-wrap-distance-bottom:0;mso-position-horizontal:absolute;mso-position-horizontal-relative:text;mso-position-vertical:absolute;mso-position-vertical-relative:text" o:gfxdata="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">
                 <v:imagedata r:id="rId71" o:title=""/>
               </v:shape>
             </w:pict>
@@ -5035,7 +5015,7 @@
           </mc:Choice>
           <mc:Fallback>
             <w:pict>
-              <v:shape w14:anchorId="027B3FA1" id="Ink 87" o:spid="_x0000_s1026" type="#_x0000_t75" style="position:absolute;margin-left:164.55pt;margin-top:16pt;width:25.45pt;height:20.5pt;z-index:251823104;visibility:visible;mso-wrap-style:square;mso-wrap-distance-left:9pt;mso-wrap-distance-top:0;mso-wrap-distance-right:9pt;mso-wrap-distance-bottom:0;mso-position-horizontal:absolute;mso-position-horizontal-relative:text;mso-position-vertical:absolute;mso-position-vertical-relative:text" o:gfxdata="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">
+              <v:shape w14:anchorId="4FB5E6CD" id="Ink 87" o:spid="_x0000_s1026" type="#_x0000_t75" style="position:absolute;margin-left:164.55pt;margin-top:16pt;width:25.45pt;height:20.5pt;z-index:251823104;visibility:visible;mso-wrap-style:square;mso-wrap-distance-left:9pt;mso-wrap-distance-top:0;mso-wrap-distance-right:9pt;mso-wrap-distance-bottom:0;mso-position-horizontal:absolute;mso-position-horizontal-relative:text;mso-position-vertical:absolute;mso-position-vertical-relative:text" o:gfxdata="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">
                 <v:imagedata r:id="rId73" o:title=""/>
               </v:shape>
             </w:pict>
@@ -5081,7 +5061,7 @@
           </mc:Choice>
           <mc:Fallback>
             <w:pict>
-              <v:shape w14:anchorId="3A08A438" id="Ink 86" o:spid="_x0000_s1026" type="#_x0000_t75" style="position:absolute;margin-left:221.35pt;margin-top:13.15pt;width:16.8pt;height:16.15pt;z-index:251822080;visibility:visible;mso-wrap-style:square;mso-wrap-distance-left:9pt;mso-wrap-distance-top:0;mso-wrap-distance-right:9pt;mso-wrap-distance-bottom:0;mso-position-horizontal:absolute;mso-position-horizontal-relative:text;mso-position-vertical:absolute;mso-position-vertical-relative:text" o:gfxdata="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">
+              <v:shape w14:anchorId="7701F24F" id="Ink 86" o:spid="_x0000_s1026" type="#_x0000_t75" style="position:absolute;margin-left:221.35pt;margin-top:13.15pt;width:16.8pt;height:16.15pt;z-index:251822080;visibility:visible;mso-wrap-style:square;mso-wrap-distance-left:9pt;mso-wrap-distance-top:0;mso-wrap-distance-right:9pt;mso-wrap-distance-bottom:0;mso-position-horizontal:absolute;mso-position-horizontal-relative:text;mso-position-vertical:absolute;mso-position-vertical-relative:text" o:gfxdata="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">
                 <v:imagedata r:id="rId75" o:title=""/>
               </v:shape>
             </w:pict>
@@ -5127,7 +5107,7 @@
           </mc:Choice>
           <mc:Fallback>
             <w:pict>
-              <v:shape w14:anchorId="44827BF8" id="Ink 85" o:spid="_x0000_s1026" type="#_x0000_t75" style="position:absolute;margin-left:215.8pt;margin-top:17.75pt;width:8.3pt;height:14.65pt;z-index:251821056;visibility:visible;mso-wrap-style:square;mso-wrap-distance-left:9pt;mso-wrap-distance-top:0;mso-wrap-distance-right:9pt;mso-wrap-distance-bottom:0;mso-position-horizontal:absolute;mso-position-horizontal-relative:text;mso-position-vertical:absolute;mso-position-vertical-relative:text" o:gfxdata="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">
+              <v:shape w14:anchorId="2C4273AE" id="Ink 85" o:spid="_x0000_s1026" type="#_x0000_t75" style="position:absolute;margin-left:215.8pt;margin-top:17.75pt;width:8.3pt;height:14.65pt;z-index:251821056;visibility:visible;mso-wrap-style:square;mso-wrap-distance-left:9pt;mso-wrap-distance-top:0;mso-wrap-distance-right:9pt;mso-wrap-distance-bottom:0;mso-position-horizontal:absolute;mso-position-horizontal-relative:text;mso-position-vertical:absolute;mso-position-vertical-relative:text" o:gfxdata="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">
                 <v:imagedata r:id="rId77" o:title=""/>
               </v:shape>
             </w:pict>
@@ -5173,7 +5153,7 @@
           </mc:Choice>
           <mc:Fallback>
             <w:pict>
-              <v:shape w14:anchorId="68944D19" id="Ink 84" o:spid="_x0000_s1026" type="#_x0000_t75" style="position:absolute;margin-left:276.5pt;margin-top:6.65pt;width:9.85pt;height:9.65pt;z-index:251820032;visibility:visible;mso-wrap-style:square;mso-wrap-distance-left:9pt;mso-wrap-distance-top:0;mso-wrap-distance-right:9pt;mso-wrap-distance-bottom:0;mso-position-horizontal:absolute;mso-position-horizontal-relative:text;mso-position-vertical:absolute;mso-position-vertical-relative:text" o:gfxdata="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">
+              <v:shape w14:anchorId="4537E4BB" id="Ink 84" o:spid="_x0000_s1026" type="#_x0000_t75" style="position:absolute;margin-left:276.5pt;margin-top:6.65pt;width:9.85pt;height:9.65pt;z-index:251820032;visibility:visible;mso-wrap-style:square;mso-wrap-distance-left:9pt;mso-wrap-distance-top:0;mso-wrap-distance-right:9pt;mso-wrap-distance-bottom:0;mso-position-horizontal:absolute;mso-position-horizontal-relative:text;mso-position-vertical:absolute;mso-position-vertical-relative:text" o:gfxdata="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">
                 <v:imagedata r:id="rId79" o:title=""/>
               </v:shape>
             </w:pict>
@@ -5219,7 +5199,7 @@
           </mc:Choice>
           <mc:Fallback>
             <w:pict>
-              <v:shape w14:anchorId="1861003E" id="Ink 80" o:spid="_x0000_s1026" type="#_x0000_t75" style="position:absolute;margin-left:274.2pt;margin-top:14.05pt;width:9.4pt;height:14.5pt;z-index:251819008;visibility:visible;mso-wrap-style:square;mso-wrap-distance-left:9pt;mso-wrap-distance-top:0;mso-wrap-distance-right:9pt;mso-wrap-distance-bottom:0;mso-position-horizontal:absolute;mso-position-horizontal-relative:text;mso-position-vertical:absolute;mso-position-vertical-relative:text" o:gfxdata="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">
+              <v:shape w14:anchorId="05C1F164" id="Ink 80" o:spid="_x0000_s1026" type="#_x0000_t75" style="position:absolute;margin-left:274.2pt;margin-top:14.05pt;width:9.4pt;height:14.5pt;z-index:251819008;visibility:visible;mso-wrap-style:square;mso-wrap-distance-left:9pt;mso-wrap-distance-top:0;mso-wrap-distance-right:9pt;mso-wrap-distance-bottom:0;mso-position-horizontal:absolute;mso-position-horizontal-relative:text;mso-position-vertical:absolute;mso-position-vertical-relative:text" o:gfxdata="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">
                 <v:imagedata r:id="rId81" o:title=""/>
               </v:shape>
             </w:pict>
@@ -5265,7 +5245,7 @@
           </mc:Choice>
           <mc:Fallback>
             <w:pict>
-              <v:shape w14:anchorId="4217006E" id="Ink 79" o:spid="_x0000_s1026" type="#_x0000_t75" style="position:absolute;margin-left:266.6pt;margin-top:21.25pt;width:4.4pt;height:10.5pt;z-index:251817984;visibility:visible;mso-wrap-style:square;mso-wrap-distance-left:9pt;mso-wrap-distance-top:0;mso-wrap-distance-right:9pt;mso-wrap-distance-bottom:0;mso-position-horizontal:absolute;mso-position-horizontal-relative:text;mso-position-vertical:absolute;mso-position-vertical-relative:text" o:gfxdata="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">
+              <v:shape w14:anchorId="5D1BB7D9" id="Ink 79" o:spid="_x0000_s1026" type="#_x0000_t75" style="position:absolute;margin-left:266.6pt;margin-top:21.25pt;width:4.4pt;height:10.5pt;z-index:251817984;visibility:visible;mso-wrap-style:square;mso-wrap-distance-left:9pt;mso-wrap-distance-top:0;mso-wrap-distance-right:9pt;mso-wrap-distance-bottom:0;mso-position-horizontal:absolute;mso-position-horizontal-relative:text;mso-position-vertical:absolute;mso-position-vertical-relative:text" o:gfxdata="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">
                 <v:imagedata r:id="rId83" o:title=""/>
               </v:shape>
             </w:pict>
@@ -5311,7 +5291,7 @@
           </mc:Choice>
           <mc:Fallback>
             <w:pict>
-              <v:shape w14:anchorId="6B15AE22" id="Ink 78" o:spid="_x0000_s1026" type="#_x0000_t75" style="position:absolute;margin-left:260.7pt;margin-top:12.25pt;width:10.85pt;height:17.45pt;z-index:251816960;visibility:visible;mso-wrap-style:square;mso-wrap-distance-left:9pt;mso-wrap-distance-top:0;mso-wrap-distance-right:9pt;mso-wrap-distance-bottom:0;mso-position-horizontal:absolute;mso-position-horizontal-relative:text;mso-position-vertical:absolute;mso-position-vertical-relative:text" o:gfxdata="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">
+              <v:shape w14:anchorId="6ADFDD07" id="Ink 78" o:spid="_x0000_s1026" type="#_x0000_t75" style="position:absolute;margin-left:260.7pt;margin-top:12.25pt;width:10.85pt;height:17.45pt;z-index:251816960;visibility:visible;mso-wrap-style:square;mso-wrap-distance-left:9pt;mso-wrap-distance-top:0;mso-wrap-distance-right:9pt;mso-wrap-distance-bottom:0;mso-position-horizontal:absolute;mso-position-horizontal-relative:text;mso-position-vertical:absolute;mso-position-vertical-relative:text" o:gfxdata="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">
                 <v:imagedata r:id="rId85" o:title=""/>
               </v:shape>
             </w:pict>
@@ -5357,7 +5337,7 @@
           </mc:Choice>
           <mc:Fallback>
             <w:pict>
-              <v:shape w14:anchorId="13291D7F" id="Ink 77" o:spid="_x0000_s1026" type="#_x0000_t75" style="position:absolute;margin-left:321.45pt;margin-top:11.35pt;width:8.85pt;height:15.55pt;z-index:251815936;visibility:visible;mso-wrap-style:square;mso-wrap-distance-left:9pt;mso-wrap-distance-top:0;mso-wrap-distance-right:9pt;mso-wrap-distance-bottom:0;mso-position-horizontal:absolute;mso-position-horizontal-relative:text;mso-position-vertical:absolute;mso-position-vertical-relative:text" o:gfxdata="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">
+              <v:shape w14:anchorId="325C5660" id="Ink 77" o:spid="_x0000_s1026" type="#_x0000_t75" style="position:absolute;margin-left:321.45pt;margin-top:11.35pt;width:8.85pt;height:15.55pt;z-index:251815936;visibility:visible;mso-wrap-style:square;mso-wrap-distance-left:9pt;mso-wrap-distance-top:0;mso-wrap-distance-right:9pt;mso-wrap-distance-bottom:0;mso-position-horizontal:absolute;mso-position-horizontal-relative:text;mso-position-vertical:absolute;mso-position-vertical-relative:text" o:gfxdata="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">
                 <v:imagedata r:id="rId87" o:title=""/>
               </v:shape>
             </w:pict>
@@ -5403,7 +5383,7 @@
           </mc:Choice>
           <mc:Fallback>
             <w:pict>
-              <v:shape w14:anchorId="07F1CD4B" id="Ink 76" o:spid="_x0000_s1026" type="#_x0000_t75" style="position:absolute;margin-left:316.65pt;margin-top:18.15pt;width:5.45pt;height:10.35pt;z-index:251814912;visibility:visible;mso-wrap-style:square;mso-wrap-distance-left:9pt;mso-wrap-distance-top:0;mso-wrap-distance-right:9pt;mso-wrap-distance-bottom:0;mso-position-horizontal:absolute;mso-position-horizontal-relative:text;mso-position-vertical:absolute;mso-position-vertical-relative:text" o:gfxdata="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">
+              <v:shape w14:anchorId="03D39837" id="Ink 76" o:spid="_x0000_s1026" type="#_x0000_t75" style="position:absolute;margin-left:316.65pt;margin-top:18.15pt;width:5.45pt;height:10.35pt;z-index:251814912;visibility:visible;mso-wrap-style:square;mso-wrap-distance-left:9pt;mso-wrap-distance-top:0;mso-wrap-distance-right:9pt;mso-wrap-distance-bottom:0;mso-position-horizontal:absolute;mso-position-horizontal-relative:text;mso-position-vertical:absolute;mso-position-vertical-relative:text" o:gfxdata="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">
                 <v:imagedata r:id="rId89" o:title=""/>
               </v:shape>
             </w:pict>
@@ -5449,7 +5429,7 @@
           </mc:Choice>
           <mc:Fallback>
             <w:pict>
-              <v:shape w14:anchorId="3D0637A9" id="Ink 75" o:spid="_x0000_s1026" type="#_x0000_t75" style="position:absolute;margin-left:309.8pt;margin-top:11.4pt;width:7.95pt;height:15.55pt;z-index:251813888;visibility:visible;mso-wrap-style:square;mso-wrap-distance-left:9pt;mso-wrap-distance-top:0;mso-wrap-distance-right:9pt;mso-wrap-distance-bottom:0;mso-position-horizontal:absolute;mso-position-horizontal-relative:text;mso-position-vertical:absolute;mso-position-vertical-relative:text" o:gfxdata="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">
+              <v:shape w14:anchorId="157C8333" id="Ink 75" o:spid="_x0000_s1026" type="#_x0000_t75" style="position:absolute;margin-left:309.8pt;margin-top:11.4pt;width:7.95pt;height:15.55pt;z-index:251813888;visibility:visible;mso-wrap-style:square;mso-wrap-distance-left:9pt;mso-wrap-distance-top:0;mso-wrap-distance-right:9pt;mso-wrap-distance-bottom:0;mso-position-horizontal:absolute;mso-position-horizontal-relative:text;mso-position-vertical:absolute;mso-position-vertical-relative:text" o:gfxdata="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">
                 <v:imagedata r:id="rId91" o:title=""/>
               </v:shape>
             </w:pict>
@@ -5495,7 +5475,7 @@
           </mc:Choice>
           <mc:Fallback>
             <w:pict>
-              <v:shape w14:anchorId="6BB0D1A8" id="Ink 74" o:spid="_x0000_s1026" type="#_x0000_t75" style="position:absolute;margin-left:372.4pt;margin-top:8.2pt;width:8.85pt;height:18.4pt;z-index:251812864;visibility:visible;mso-wrap-style:square;mso-wrap-distance-left:9pt;mso-wrap-distance-top:0;mso-wrap-distance-right:9pt;mso-wrap-distance-bottom:0;mso-position-horizontal:absolute;mso-position-horizontal-relative:text;mso-position-vertical:absolute;mso-position-vertical-relative:text" o:gfxdata="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">
+              <v:shape w14:anchorId="51F53DC5" id="Ink 74" o:spid="_x0000_s1026" type="#_x0000_t75" style="position:absolute;margin-left:372.4pt;margin-top:8.2pt;width:8.85pt;height:18.4pt;z-index:251812864;visibility:visible;mso-wrap-style:square;mso-wrap-distance-left:9pt;mso-wrap-distance-top:0;mso-wrap-distance-right:9pt;mso-wrap-distance-bottom:0;mso-position-horizontal:absolute;mso-position-horizontal-relative:text;mso-position-vertical:absolute;mso-position-vertical-relative:text" o:gfxdata="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">
                 <v:imagedata r:id="rId93" o:title=""/>
               </v:shape>
             </w:pict>
@@ -5541,7 +5521,7 @@
           </mc:Choice>
           <mc:Fallback>
             <w:pict>
-              <v:shape w14:anchorId="1D25AC23" id="Ink 73" o:spid="_x0000_s1026" type="#_x0000_t75" style="position:absolute;margin-left:357.75pt;margin-top:11.05pt;width:7.7pt;height:18.9pt;z-index:251811840;visibility:visible;mso-wrap-style:square;mso-wrap-distance-left:9pt;mso-wrap-distance-top:0;mso-wrap-distance-right:9pt;mso-wrap-distance-bottom:0;mso-position-horizontal:absolute;mso-position-horizontal-relative:text;mso-position-vertical:absolute;mso-position-vertical-relative:text" o:gfxdata="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">
+              <v:shape w14:anchorId="255E4410" id="Ink 73" o:spid="_x0000_s1026" type="#_x0000_t75" style="position:absolute;margin-left:357.75pt;margin-top:11.05pt;width:7.7pt;height:18.9pt;z-index:251811840;visibility:visible;mso-wrap-style:square;mso-wrap-distance-left:9pt;mso-wrap-distance-top:0;mso-wrap-distance-right:9pt;mso-wrap-distance-bottom:0;mso-position-horizontal:absolute;mso-position-horizontal-relative:text;mso-position-vertical:absolute;mso-position-vertical-relative:text" o:gfxdata="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">
                 <v:imagedata r:id="rId95" o:title=""/>
               </v:shape>
             </w:pict>
@@ -5587,7 +5567,7 @@
           </mc:Choice>
           <mc:Fallback>
             <w:pict>
-              <v:shape w14:anchorId="60143680" id="Ink 72" o:spid="_x0000_s1026" type="#_x0000_t75" style="position:absolute;margin-left:420.5pt;margin-top:10.45pt;width:6.05pt;height:15.25pt;z-index:251810816;visibility:visible;mso-wrap-style:square;mso-wrap-distance-left:9pt;mso-wrap-distance-top:0;mso-wrap-distance-right:9pt;mso-wrap-distance-bottom:0;mso-position-horizontal:absolute;mso-position-horizontal-relative:text;mso-position-vertical:absolute;mso-position-vertical-relative:text" o:gfxdata="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">
+              <v:shape w14:anchorId="62DA5D94" id="Ink 72" o:spid="_x0000_s1026" type="#_x0000_t75" style="position:absolute;margin-left:420.5pt;margin-top:10.45pt;width:6.05pt;height:15.25pt;z-index:251810816;visibility:visible;mso-wrap-style:square;mso-wrap-distance-left:9pt;mso-wrap-distance-top:0;mso-wrap-distance-right:9pt;mso-wrap-distance-bottom:0;mso-position-horizontal:absolute;mso-position-horizontal-relative:text;mso-position-vertical:absolute;mso-position-vertical-relative:text" o:gfxdata="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">
                 <v:imagedata r:id="rId97" o:title=""/>
               </v:shape>
             </w:pict>
@@ -5633,7 +5613,7 @@
           </mc:Choice>
           <mc:Fallback>
             <w:pict>
-              <v:shape w14:anchorId="7B597B68" id="Ink 71" o:spid="_x0000_s1026" type="#_x0000_t75" style="position:absolute;margin-left:407.25pt;margin-top:11.55pt;width:11.25pt;height:15.55pt;z-index:251809792;visibility:visible;mso-wrap-style:square;mso-wrap-distance-left:9pt;mso-wrap-distance-top:0;mso-wrap-distance-right:9pt;mso-wrap-distance-bottom:0;mso-position-horizontal:absolute;mso-position-horizontal-relative:text;mso-position-vertical:absolute;mso-position-vertical-relative:text" o:gfxdata="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">
+              <v:shape w14:anchorId="3C833C76" id="Ink 71" o:spid="_x0000_s1026" type="#_x0000_t75" style="position:absolute;margin-left:407.25pt;margin-top:11.55pt;width:11.25pt;height:15.55pt;z-index:251809792;visibility:visible;mso-wrap-style:square;mso-wrap-distance-left:9pt;mso-wrap-distance-top:0;mso-wrap-distance-right:9pt;mso-wrap-distance-bottom:0;mso-position-horizontal:absolute;mso-position-horizontal-relative:text;mso-position-vertical:absolute;mso-position-vertical-relative:text" o:gfxdata="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">
                 <v:imagedata r:id="rId99" o:title=""/>
               </v:shape>
             </w:pict>
@@ -5679,7 +5659,7 @@
           </mc:Choice>
           <mc:Fallback>
             <w:pict>
-              <v:shape w14:anchorId="1D79599B" id="Ink 70" o:spid="_x0000_s1026" type="#_x0000_t75" style="position:absolute;margin-left:467.35pt;margin-top:7.4pt;width:17.85pt;height:20.95pt;z-index:251808768;visibility:visible;mso-wrap-style:square;mso-wrap-distance-left:9pt;mso-wrap-distance-top:0;mso-wrap-distance-right:9pt;mso-wrap-distance-bottom:0;mso-position-horizontal:absolute;mso-position-horizontal-relative:text;mso-position-vertical:absolute;mso-position-vertical-relative:text" o:gfxdata="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">
+              <v:shape w14:anchorId="5806D7B5" id="Ink 70" o:spid="_x0000_s1026" type="#_x0000_t75" style="position:absolute;margin-left:467.35pt;margin-top:7.4pt;width:17.85pt;height:20.95pt;z-index:251808768;visibility:visible;mso-wrap-style:square;mso-wrap-distance-left:9pt;mso-wrap-distance-top:0;mso-wrap-distance-right:9pt;mso-wrap-distance-bottom:0;mso-position-horizontal:absolute;mso-position-horizontal-relative:text;mso-position-vertical:absolute;mso-position-vertical-relative:text" o:gfxdata="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">
                 <v:imagedata r:id="rId101" o:title=""/>
               </v:shape>
             </w:pict>
@@ -5725,7 +5705,7 @@
           </mc:Choice>
           <mc:Fallback>
             <w:pict>
-              <v:shape w14:anchorId="16A66256" id="Ink 69" o:spid="_x0000_s1026" type="#_x0000_t75" style="position:absolute;margin-left:466.65pt;margin-top:13.25pt;width:8.4pt;height:13.35pt;z-index:251807744;visibility:visible;mso-wrap-style:square;mso-wrap-distance-left:9pt;mso-wrap-distance-top:0;mso-wrap-distance-right:9pt;mso-wrap-distance-bottom:0;mso-position-horizontal:absolute;mso-position-horizontal-relative:text;mso-position-vertical:absolute;mso-position-vertical-relative:text" o:gfxdata="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">
+              <v:shape w14:anchorId="30AEDF10" id="Ink 69" o:spid="_x0000_s1026" type="#_x0000_t75" style="position:absolute;margin-left:466.65pt;margin-top:13.25pt;width:8.4pt;height:13.35pt;z-index:251807744;visibility:visible;mso-wrap-style:square;mso-wrap-distance-left:9pt;mso-wrap-distance-top:0;mso-wrap-distance-right:9pt;mso-wrap-distance-bottom:0;mso-position-horizontal:absolute;mso-position-horizontal-relative:text;mso-position-vertical:absolute;mso-position-vertical-relative:text" o:gfxdata="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">
                 <v:imagedata r:id="rId103" o:title=""/>
               </v:shape>
             </w:pict>
@@ -5771,7 +5751,7 @@
           </mc:Choice>
           <mc:Fallback>
             <w:pict>
-              <v:shape w14:anchorId="21AE0458" id="Ink 68" o:spid="_x0000_s1026" type="#_x0000_t75" style="position:absolute;margin-left:457.55pt;margin-top:12.4pt;width:10.55pt;height:13pt;z-index:251806720;visibility:visible;mso-wrap-style:square;mso-wrap-distance-left:9pt;mso-wrap-distance-top:0;mso-wrap-distance-right:9pt;mso-wrap-distance-bottom:0;mso-position-horizontal:absolute;mso-position-horizontal-relative:text;mso-position-vertical:absolute;mso-position-vertical-relative:text" o:gfxdata="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">
+              <v:shape w14:anchorId="6DCD1D83" id="Ink 68" o:spid="_x0000_s1026" type="#_x0000_t75" style="position:absolute;margin-left:457.55pt;margin-top:12.4pt;width:10.55pt;height:13pt;z-index:251806720;visibility:visible;mso-wrap-style:square;mso-wrap-distance-left:9pt;mso-wrap-distance-top:0;mso-wrap-distance-right:9pt;mso-wrap-distance-bottom:0;mso-position-horizontal:absolute;mso-position-horizontal-relative:text;mso-position-vertical:absolute;mso-position-vertical-relative:text" o:gfxdata="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">
                 <v:imagedata r:id="rId105" o:title=""/>
               </v:shape>
             </w:pict>
@@ -5817,7 +5797,7 @@
           </mc:Choice>
           <mc:Fallback>
             <w:pict>
-              <v:shape w14:anchorId="643AB916" id="Ink 67" o:spid="_x0000_s1026" type="#_x0000_t75" style="position:absolute;margin-left:528pt;margin-top:4.55pt;width:10.1pt;height:22.7pt;z-index:251805696;visibility:visible;mso-wrap-style:square;mso-wrap-distance-left:9pt;mso-wrap-distance-top:0;mso-wrap-distance-right:9pt;mso-wrap-distance-bottom:0;mso-position-horizontal:absolute;mso-position-horizontal-relative:text;mso-position-vertical:absolute;mso-position-vertical-relative:text" o:gfxdata="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">
+              <v:shape w14:anchorId="3CFE3C9F" id="Ink 67" o:spid="_x0000_s1026" type="#_x0000_t75" style="position:absolute;margin-left:528pt;margin-top:4.55pt;width:10.1pt;height:22.7pt;z-index:251805696;visibility:visible;mso-wrap-style:square;mso-wrap-distance-left:9pt;mso-wrap-distance-top:0;mso-wrap-distance-right:9pt;mso-wrap-distance-bottom:0;mso-position-horizontal:absolute;mso-position-horizontal-relative:text;mso-position-vertical:absolute;mso-position-vertical-relative:text" o:gfxdata="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">
                 <v:imagedata r:id="rId107" o:title=""/>
               </v:shape>
             </w:pict>
@@ -5863,7 +5843,7 @@
           </mc:Choice>
           <mc:Fallback>
             <w:pict>
-              <v:shape w14:anchorId="33A25A87" id="Ink 66" o:spid="_x0000_s1026" type="#_x0000_t75" style="position:absolute;margin-left:518.35pt;margin-top:9.35pt;width:7.35pt;height:12.2pt;z-index:251804672;visibility:visible;mso-wrap-style:square;mso-wrap-distance-left:9pt;mso-wrap-distance-top:0;mso-wrap-distance-right:9pt;mso-wrap-distance-bottom:0;mso-position-horizontal:absolute;mso-position-horizontal-relative:text;mso-position-vertical:absolute;mso-position-vertical-relative:text" o:gfxdata="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">
+              <v:shape w14:anchorId="0A11FA77" id="Ink 66" o:spid="_x0000_s1026" type="#_x0000_t75" style="position:absolute;margin-left:518.35pt;margin-top:9.35pt;width:7.35pt;height:12.2pt;z-index:251804672;visibility:visible;mso-wrap-style:square;mso-wrap-distance-left:9pt;mso-wrap-distance-top:0;mso-wrap-distance-right:9pt;mso-wrap-distance-bottom:0;mso-position-horizontal:absolute;mso-position-horizontal-relative:text;mso-position-vertical:absolute;mso-position-vertical-relative:text" o:gfxdata="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">
                 <v:imagedata r:id="rId109" o:title=""/>
               </v:shape>
             </w:pict>
@@ -5909,7 +5889,7 @@
           </mc:Choice>
           <mc:Fallback>
             <w:pict>
-              <v:shape w14:anchorId="73954DBF" id="Ink 65" o:spid="_x0000_s1026" type="#_x0000_t75" style="position:absolute;margin-left:507.45pt;margin-top:9.9pt;width:9.1pt;height:12.8pt;z-index:251803648;visibility:visible;mso-wrap-style:square;mso-wrap-distance-left:9pt;mso-wrap-distance-top:0;mso-wrap-distance-right:9pt;mso-wrap-distance-bottom:0;mso-position-horizontal:absolute;mso-position-horizontal-relative:text;mso-position-vertical:absolute;mso-position-vertical-relative:text" o:gfxdata="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">
+              <v:shape w14:anchorId="695C5D87" id="Ink 65" o:spid="_x0000_s1026" type="#_x0000_t75" style="position:absolute;margin-left:507.45pt;margin-top:9.9pt;width:9.1pt;height:12.8pt;z-index:251803648;visibility:visible;mso-wrap-style:square;mso-wrap-distance-left:9pt;mso-wrap-distance-top:0;mso-wrap-distance-right:9pt;mso-wrap-distance-bottom:0;mso-position-horizontal:absolute;mso-position-horizontal-relative:text;mso-position-vertical:absolute;mso-position-vertical-relative:text" o:gfxdata="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">
                 <v:imagedata r:id="rId111" o:title=""/>
               </v:shape>
             </w:pict>
@@ -6056,9 +6036,9 @@
           <w:sz w:val="44"/>
         </w:rPr>
       </w:pPr>
-      <w:bookmarkStart w:id="0" w:name="_Hlk237110993"/>
-    </w:p>
-    <w:bookmarkEnd w:id="0"/>
+      <w:bookmarkStart w:id="1" w:name="_Hlk237110993"/>
+    </w:p>
+    <w:bookmarkEnd w:id="1"/>
     <w:p>
       <w:pPr>
         <w:rPr>
@@ -7770,7 +7750,7 @@
           </mc:Choice>
           <mc:Fallback>
             <w:pict>
-              <v:shape w14:anchorId="55535FF8" id="Ink 20" o:spid="_x0000_s1026" type="#_x0000_t75" style="position:absolute;margin-left:455.5pt;margin-top:33.8pt;width:1.05pt;height:1.05pt;z-index:251744256;visibility:visible;mso-wrap-style:square;mso-wrap-distance-left:9pt;mso-wrap-distance-top:0;mso-wrap-distance-right:9pt;mso-wrap-distance-bottom:0;mso-position-horizontal:absolute;mso-position-horizontal-relative:text;mso-position-vertical:absolute;mso-position-vertical-relative:text" o:gfxdata="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">
+              <v:shape w14:anchorId="0A84DB14" id="Ink 20" o:spid="_x0000_s1026" type="#_x0000_t75" style="position:absolute;margin-left:455.5pt;margin-top:33.8pt;width:1.05pt;height:1.05pt;z-index:251744256;visibility:visible;mso-wrap-style:square;mso-wrap-distance-left:9pt;mso-wrap-distance-top:0;mso-wrap-distance-right:9pt;mso-wrap-distance-bottom:0;mso-position-horizontal:absolute;mso-position-horizontal-relative:text;mso-position-vertical:absolute;mso-position-vertical-relative:text" o:gfxdata="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">
                 <v:imagedata r:id="rId116" o:title=""/>
               </v:shape>
             </w:pict>
@@ -7816,7 +7796,7 @@
           </mc:Choice>
           <mc:Fallback>
             <w:pict>
-              <v:shape w14:anchorId="5FE0E528" id="Ink 19" o:spid="_x0000_s1026" type="#_x0000_t75" style="position:absolute;margin-left:455.5pt;margin-top:33.8pt;width:1.05pt;height:1.05pt;z-index:251743232;visibility:visible;mso-wrap-style:square;mso-wrap-distance-left:9pt;mso-wrap-distance-top:0;mso-wrap-distance-right:9pt;mso-wrap-distance-bottom:0;mso-position-horizontal:absolute;mso-position-horizontal-relative:text;mso-position-vertical:absolute;mso-position-vertical-relative:text" o:gfxdata="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">
+              <v:shape w14:anchorId="718F64D5" id="Ink 19" o:spid="_x0000_s1026" type="#_x0000_t75" style="position:absolute;margin-left:455.5pt;margin-top:33.8pt;width:1.05pt;height:1.05pt;z-index:251743232;visibility:visible;mso-wrap-style:square;mso-wrap-distance-left:9pt;mso-wrap-distance-top:0;mso-wrap-distance-right:9pt;mso-wrap-distance-bottom:0;mso-position-horizontal:absolute;mso-position-horizontal-relative:text;mso-position-vertical:absolute;mso-position-vertical-relative:text" o:gfxdata="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">
                 <v:imagedata r:id="rId116" o:title=""/>
               </v:shape>
             </w:pict>
@@ -8800,7 +8780,7 @@
           </mc:Choice>
           <mc:Fallback>
             <w:pict>
-              <v:shape w14:anchorId="5D14C662" id="Ink 16" o:spid="_x0000_s1026" type="#_x0000_t75" style="position:absolute;margin-left:278.95pt;margin-top:1.6pt;width:18.2pt;height:20.9pt;z-index:251756544;visibility:visible;mso-wrap-style:square;mso-wrap-distance-left:9pt;mso-wrap-distance-top:0;mso-wrap-distance-right:9pt;mso-wrap-distance-bottom:0;mso-position-horizontal:absolute;mso-position-horizontal-relative:text;mso-position-vertical:absolute;mso-position-vertical-relative:text" o:gfxdata="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">
+              <v:shape w14:anchorId="3238BD67" id="Ink 16" o:spid="_x0000_s1026" type="#_x0000_t75" style="position:absolute;margin-left:278.95pt;margin-top:1.6pt;width:18.2pt;height:20.9pt;z-index:251756544;visibility:visible;mso-wrap-style:square;mso-wrap-distance-left:9pt;mso-wrap-distance-top:0;mso-wrap-distance-right:9pt;mso-wrap-distance-bottom:0;mso-position-horizontal:absolute;mso-position-horizontal-relative:text;mso-position-vertical:absolute;mso-position-vertical-relative:text" o:gfxdata="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">
                 <v:imagedata r:id="rId119" o:title=""/>
               </v:shape>
             </w:pict>
@@ -8846,7 +8826,7 @@
           </mc:Choice>
           <mc:Fallback>
             <w:pict>
-              <v:shape w14:anchorId="20AFAB13" id="Ink 15" o:spid="_x0000_s1026" type="#_x0000_t75" style="position:absolute;margin-left:253.65pt;margin-top:2.55pt;width:24.65pt;height:22.35pt;z-index:251755520;visibility:visible;mso-wrap-style:square;mso-wrap-distance-left:9pt;mso-wrap-distance-top:0;mso-wrap-distance-right:9pt;mso-wrap-distance-bottom:0;mso-position-horizontal:absolute;mso-position-horizontal-relative:text;mso-position-vertical:absolute;mso-position-vertical-relative:text" o:gfxdata="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">
+              <v:shape w14:anchorId="1701D489" id="Ink 15" o:spid="_x0000_s1026" type="#_x0000_t75" style="position:absolute;margin-left:253.65pt;margin-top:2.55pt;width:24.65pt;height:22.35pt;z-index:251755520;visibility:visible;mso-wrap-style:square;mso-wrap-distance-left:9pt;mso-wrap-distance-top:0;mso-wrap-distance-right:9pt;mso-wrap-distance-bottom:0;mso-position-horizontal:absolute;mso-position-horizontal-relative:text;mso-position-vertical:absolute;mso-position-vertical-relative:text" o:gfxdata="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">
                 <v:imagedata r:id="rId121" o:title=""/>
               </v:shape>
             </w:pict>
@@ -8892,7 +8872,7 @@
           </mc:Choice>
           <mc:Fallback>
             <w:pict>
-              <v:shape w14:anchorId="776366CC" id="Ink 14" o:spid="_x0000_s1026" type="#_x0000_t75" style="position:absolute;margin-left:236.5pt;margin-top:-14.25pt;width:80.6pt;height:60.85pt;z-index:251754496;visibility:visible;mso-wrap-style:square;mso-wrap-distance-left:9pt;mso-wrap-distance-top:0;mso-wrap-distance-right:9pt;mso-wrap-distance-bottom:0;mso-position-horizontal:absolute;mso-position-horizontal-relative:text;mso-position-vertical:absolute;mso-position-vertical-relative:text" o:gfxdata="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">
+              <v:shape w14:anchorId="2761731E" id="Ink 14" o:spid="_x0000_s1026" type="#_x0000_t75" style="position:absolute;margin-left:236.5pt;margin-top:-14.25pt;width:80.6pt;height:60.85pt;z-index:251754496;visibility:visible;mso-wrap-style:square;mso-wrap-distance-left:9pt;mso-wrap-distance-top:0;mso-wrap-distance-right:9pt;mso-wrap-distance-bottom:0;mso-position-horizontal:absolute;mso-position-horizontal-relative:text;mso-position-vertical:absolute;mso-position-vertical-relative:text" o:gfxdata="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">
                 <v:imagedata r:id="rId123" o:title=""/>
               </v:shape>
             </w:pict>
@@ -8938,7 +8918,7 @@
           </mc:Choice>
           <mc:Fallback>
             <w:pict>
-              <v:shape w14:anchorId="629B19B5" id="Ink 13" o:spid="_x0000_s1026" type="#_x0000_t75" style="position:absolute;margin-left:262.7pt;margin-top:26.35pt;width:11.9pt;height:9.95pt;z-index:251753472;visibility:visible;mso-wrap-style:square;mso-wrap-distance-left:9pt;mso-wrap-distance-top:0;mso-wrap-distance-right:9pt;mso-wrap-distance-bottom:0;mso-position-horizontal:absolute;mso-position-horizontal-relative:text;mso-position-vertical:absolute;mso-position-vertical-relative:text" o:gfxdata="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">
+              <v:shape w14:anchorId="0F856963" id="Ink 13" o:spid="_x0000_s1026" type="#_x0000_t75" style="position:absolute;margin-left:262.7pt;margin-top:26.35pt;width:11.9pt;height:9.95pt;z-index:251753472;visibility:visible;mso-wrap-style:square;mso-wrap-distance-left:9pt;mso-wrap-distance-top:0;mso-wrap-distance-right:9pt;mso-wrap-distance-bottom:0;mso-position-horizontal:absolute;mso-position-horizontal-relative:text;mso-position-vertical:absolute;mso-position-vertical-relative:text" o:gfxdata="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">
                 <v:imagedata r:id="rId125" o:title=""/>
               </v:shape>
             </w:pict>
@@ -8991,7 +8971,7 @@
           </mc:Choice>
           <mc:Fallback>
             <w:pict>
-              <v:shape w14:anchorId="096D2AE7" id="Ink 49" o:spid="_x0000_s1026" type="#_x0000_t75" style="position:absolute;margin-left:251.85pt;margin-top:2.3pt;width:15.3pt;height:24.75pt;z-index:251834368;visibility:visible;mso-wrap-style:square;mso-wrap-distance-left:9pt;mso-wrap-distance-top:0;mso-wrap-distance-right:9pt;mso-wrap-distance-bottom:0;mso-position-horizontal:absolute;mso-position-horizontal-relative:text;mso-position-vertical:absolute;mso-position-vertical-relative:text" o:gfxdata="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">
+              <v:shape w14:anchorId="01C790F5" id="Ink 49" o:spid="_x0000_s1026" type="#_x0000_t75" style="position:absolute;margin-left:251.85pt;margin-top:2.3pt;width:15.3pt;height:24.75pt;z-index:251834368;visibility:visible;mso-wrap-style:square;mso-wrap-distance-left:9pt;mso-wrap-distance-top:0;mso-wrap-distance-right:9pt;mso-wrap-distance-bottom:0;mso-position-horizontal:absolute;mso-position-horizontal-relative:text;mso-position-vertical:absolute;mso-position-vertical-relative:text" o:gfxdata="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">
                 <v:imagedata r:id="rId127" o:title=""/>
               </v:shape>
             </w:pict>
@@ -9037,7 +9017,7 @@
           </mc:Choice>
           <mc:Fallback>
             <w:pict>
-              <v:shape w14:anchorId="3158929A" id="Ink 48" o:spid="_x0000_s1026" type="#_x0000_t75" style="position:absolute;margin-left:233.1pt;margin-top:8.75pt;width:7.95pt;height:12.85pt;z-index:251833344;visibility:visible;mso-wrap-style:square;mso-wrap-distance-left:9pt;mso-wrap-distance-top:0;mso-wrap-distance-right:9pt;mso-wrap-distance-bottom:0;mso-position-horizontal:absolute;mso-position-horizontal-relative:text;mso-position-vertical:absolute;mso-position-vertical-relative:text" o:gfxdata="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">
+              <v:shape w14:anchorId="107CBFF6" id="Ink 48" o:spid="_x0000_s1026" type="#_x0000_t75" style="position:absolute;margin-left:233.1pt;margin-top:8.75pt;width:7.95pt;height:12.85pt;z-index:251833344;visibility:visible;mso-wrap-style:square;mso-wrap-distance-left:9pt;mso-wrap-distance-top:0;mso-wrap-distance-right:9pt;mso-wrap-distance-bottom:0;mso-position-horizontal:absolute;mso-position-horizontal-relative:text;mso-position-vertical:absolute;mso-position-vertical-relative:text" o:gfxdata="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">
                 <v:imagedata r:id="rId129" o:title=""/>
               </v:shape>
             </w:pict>
@@ -9083,7 +9063,7 @@
           </mc:Choice>
           <mc:Fallback>
             <w:pict>
-              <v:shape w14:anchorId="183FA37B" id="Ink 47" o:spid="_x0000_s1026" type="#_x0000_t75" style="position:absolute;margin-left:218.95pt;margin-top:8.55pt;width:13.3pt;height:12.5pt;z-index:251832320;visibility:visible;mso-wrap-style:square;mso-wrap-distance-left:9pt;mso-wrap-distance-top:0;mso-wrap-distance-right:9pt;mso-wrap-distance-bottom:0;mso-position-horizontal:absolute;mso-position-horizontal-relative:text;mso-position-vertical:absolute;mso-position-vertical-relative:text" o:gfxdata="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">
+              <v:shape w14:anchorId="573FEC33" id="Ink 47" o:spid="_x0000_s1026" type="#_x0000_t75" style="position:absolute;margin-left:218.95pt;margin-top:8.55pt;width:13.3pt;height:12.5pt;z-index:251832320;visibility:visible;mso-wrap-style:square;mso-wrap-distance-left:9pt;mso-wrap-distance-top:0;mso-wrap-distance-right:9pt;mso-wrap-distance-bottom:0;mso-position-horizontal:absolute;mso-position-horizontal-relative:text;mso-position-vertical:absolute;mso-position-vertical-relative:text" o:gfxdata="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">
                 <v:imagedata r:id="rId131" o:title=""/>
               </v:shape>
             </w:pict>
@@ -9129,7 +9109,7 @@
           </mc:Choice>
           <mc:Fallback>
             <w:pict>
-              <v:shape w14:anchorId="3EEF1512" id="Ink 26" o:spid="_x0000_s1026" type="#_x0000_t75" style="position:absolute;margin-left:274.15pt;margin-top:-6.95pt;width:63.05pt;height:26.25pt;z-index:251831296;visibility:visible;mso-wrap-style:square;mso-wrap-distance-left:9pt;mso-wrap-distance-top:0;mso-wrap-distance-right:9pt;mso-wrap-distance-bottom:0;mso-position-horizontal:absolute;mso-position-horizontal-relative:text;mso-position-vertical:absolute;mso-position-vertical-relative:text" o:gfxdata="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">
+              <v:shape w14:anchorId="310A979F" id="Ink 26" o:spid="_x0000_s1026" type="#_x0000_t75" style="position:absolute;margin-left:274.15pt;margin-top:-6.95pt;width:63.05pt;height:26.25pt;z-index:251831296;visibility:visible;mso-wrap-style:square;mso-wrap-distance-left:9pt;mso-wrap-distance-top:0;mso-wrap-distance-right:9pt;mso-wrap-distance-bottom:0;mso-position-horizontal:absolute;mso-position-horizontal-relative:text;mso-position-vertical:absolute;mso-position-vertical-relative:text" o:gfxdata="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">
                 <v:imagedata r:id="rId133" o:title=""/>
               </v:shape>
             </w:pict>
@@ -9175,7 +9155,7 @@
           </mc:Choice>
           <mc:Fallback>
             <w:pict>
-              <v:shape w14:anchorId="6D98B4B2" id="Ink 12" o:spid="_x0000_s1026" type="#_x0000_t75" style="position:absolute;margin-left:264.7pt;margin-top:21.5pt;width:13.75pt;height:13.4pt;z-index:251752448;visibility:visible;mso-wrap-style:square;mso-wrap-distance-left:9pt;mso-wrap-distance-top:0;mso-wrap-distance-right:9pt;mso-wrap-distance-bottom:0;mso-position-horizontal:absolute;mso-position-horizontal-relative:text;mso-position-vertical:absolute;mso-position-vertical-relative:text" o:gfxdata="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">
+              <v:shape w14:anchorId="00A5274F" id="Ink 12" o:spid="_x0000_s1026" type="#_x0000_t75" style="position:absolute;margin-left:264.7pt;margin-top:21.5pt;width:13.75pt;height:13.4pt;z-index:251752448;visibility:visible;mso-wrap-style:square;mso-wrap-distance-left:9pt;mso-wrap-distance-top:0;mso-wrap-distance-right:9pt;mso-wrap-distance-bottom:0;mso-position-horizontal:absolute;mso-position-horizontal-relative:text;mso-position-vertical:absolute;mso-position-vertical-relative:text" o:gfxdata="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">
                 <v:imagedata r:id="rId135" o:title=""/>
               </v:shape>
             </w:pict>
@@ -9221,7 +9201,7 @@
           </mc:Choice>
           <mc:Fallback>
             <w:pict>
-              <v:shape w14:anchorId="4D91DCA4" id="Ink 11" o:spid="_x0000_s1026" type="#_x0000_t75" style="position:absolute;margin-left:267.45pt;margin-top:-11.05pt;width:3.8pt;height:37.75pt;z-index:251751424;visibility:visible;mso-wrap-style:square;mso-wrap-distance-left:9pt;mso-wrap-distance-top:0;mso-wrap-distance-right:9pt;mso-wrap-distance-bottom:0;mso-position-horizontal:absolute;mso-position-horizontal-relative:text;mso-position-vertical:absolute;mso-position-vertical-relative:text" o:gfxdata="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">
+              <v:shape w14:anchorId="43DD8FF4" id="Ink 11" o:spid="_x0000_s1026" type="#_x0000_t75" style="position:absolute;margin-left:267.45pt;margin-top:-11.05pt;width:3.8pt;height:37.75pt;z-index:251751424;visibility:visible;mso-wrap-style:square;mso-wrap-distance-left:9pt;mso-wrap-distance-top:0;mso-wrap-distance-right:9pt;mso-wrap-distance-bottom:0;mso-position-horizontal:absolute;mso-position-horizontal-relative:text;mso-position-vertical:absolute;mso-position-vertical-relative:text" o:gfxdata="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">
                 <v:imagedata r:id="rId137" o:title=""/>
               </v:shape>
             </w:pict>
@@ -9281,7 +9261,7 @@
           </mc:Choice>
           <mc:Fallback>
             <w:pict>
-              <v:shape w14:anchorId="2CEDB22C" id="Ink 46" o:spid="_x0000_s1026" type="#_x0000_t75" style="position:absolute;margin-left:312.15pt;margin-top:-3.2pt;width:13.1pt;height:29.8pt;z-index:251783168;visibility:visible;mso-wrap-style:square;mso-wrap-distance-left:9pt;mso-wrap-distance-top:0;mso-wrap-distance-right:9pt;mso-wrap-distance-bottom:0;mso-position-horizontal:absolute;mso-position-horizontal-relative:text;mso-position-vertical:absolute;mso-position-vertical-relative:text" o:gfxdata="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">
+              <v:shape w14:anchorId="696D116B" id="Ink 46" o:spid="_x0000_s1026" type="#_x0000_t75" style="position:absolute;margin-left:312.15pt;margin-top:-3.2pt;width:13.1pt;height:29.8pt;z-index:251783168;visibility:visible;mso-wrap-style:square;mso-wrap-distance-left:9pt;mso-wrap-distance-top:0;mso-wrap-distance-right:9pt;mso-wrap-distance-bottom:0;mso-position-horizontal:absolute;mso-position-horizontal-relative:text;mso-position-vertical:absolute;mso-position-vertical-relative:text" o:gfxdata="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">
                 <v:imagedata r:id="rId139" o:title=""/>
               </v:shape>
             </w:pict>
@@ -9327,7 +9307,7 @@
           </mc:Choice>
           <mc:Fallback>
             <w:pict>
-              <v:shape w14:anchorId="10A5BA0B" id="Ink 45" o:spid="_x0000_s1026" type="#_x0000_t75" style="position:absolute;margin-left:305.6pt;margin-top:-.8pt;width:13.45pt;height:57.15pt;z-index:251782144;visibility:visible;mso-wrap-style:square;mso-wrap-distance-left:9pt;mso-wrap-distance-top:0;mso-wrap-distance-right:9pt;mso-wrap-distance-bottom:0;mso-position-horizontal:absolute;mso-position-horizontal-relative:text;mso-position-vertical:absolute;mso-position-vertical-relative:text" o:gfxdata="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">
+              <v:shape w14:anchorId="11CBE316" id="Ink 45" o:spid="_x0000_s1026" type="#_x0000_t75" style="position:absolute;margin-left:305.6pt;margin-top:-.8pt;width:13.45pt;height:57.15pt;z-index:251782144;visibility:visible;mso-wrap-style:square;mso-wrap-distance-left:9pt;mso-wrap-distance-top:0;mso-wrap-distance-right:9pt;mso-wrap-distance-bottom:0;mso-position-horizontal:absolute;mso-position-horizontal-relative:text;mso-position-vertical:absolute;mso-position-vertical-relative:text" o:gfxdata="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">
                 <v:imagedata r:id="rId141" o:title=""/>
               </v:shape>
             </w:pict>
@@ -9373,7 +9353,7 @@
           </mc:Choice>
           <mc:Fallback>
             <w:pict>
-              <v:shape w14:anchorId="6E09EB25" id="Ink 23" o:spid="_x0000_s1026" type="#_x0000_t75" style="position:absolute;margin-left:450.9pt;margin-top:-5.95pt;width:23.75pt;height:43.5pt;z-index:251763712;visibility:visible;mso-wrap-style:square;mso-wrap-distance-left:9pt;mso-wrap-distance-top:0;mso-wrap-distance-right:9pt;mso-wrap-distance-bottom:0;mso-position-horizontal:absolute;mso-position-horizontal-relative:text;mso-position-vertical:absolute;mso-position-vertical-relative:text" o:gfxdata="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">
+              <v:shape w14:anchorId="3A8ED1A2" id="Ink 23" o:spid="_x0000_s1026" type="#_x0000_t75" style="position:absolute;margin-left:450.9pt;margin-top:-5.95pt;width:23.75pt;height:43.5pt;z-index:251763712;visibility:visible;mso-wrap-style:square;mso-wrap-distance-left:9pt;mso-wrap-distance-top:0;mso-wrap-distance-right:9pt;mso-wrap-distance-bottom:0;mso-position-horizontal:absolute;mso-position-horizontal-relative:text;mso-position-vertical:absolute;mso-position-vertical-relative:text" o:gfxdata="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">
                 <v:imagedata r:id="rId143" o:title=""/>
               </v:shape>
             </w:pict>
@@ -9419,7 +9399,7 @@
           </mc:Choice>
           <mc:Fallback>
             <w:pict>
-              <v:shape w14:anchorId="2688DF4E" id="Ink 22" o:spid="_x0000_s1026" type="#_x0000_t75" style="position:absolute;margin-left:456.5pt;margin-top:-1.45pt;width:9.6pt;height:3.9pt;z-index:251762688;visibility:visible;mso-wrap-style:square;mso-wrap-distance-left:9pt;mso-wrap-distance-top:0;mso-wrap-distance-right:9pt;mso-wrap-distance-bottom:0;mso-position-horizontal:absolute;mso-position-horizontal-relative:text;mso-position-vertical:absolute;mso-position-vertical-relative:text" o:gfxdata="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">
+              <v:shape w14:anchorId="7C858549" id="Ink 22" o:spid="_x0000_s1026" type="#_x0000_t75" style="position:absolute;margin-left:456.5pt;margin-top:-1.45pt;width:9.6pt;height:3.9pt;z-index:251762688;visibility:visible;mso-wrap-style:square;mso-wrap-distance-left:9pt;mso-wrap-distance-top:0;mso-wrap-distance-right:9pt;mso-wrap-distance-bottom:0;mso-position-horizontal:absolute;mso-position-horizontal-relative:text;mso-position-vertical:absolute;mso-position-vertical-relative:text" o:gfxdata="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">
                 <v:imagedata r:id="rId145" o:title=""/>
               </v:shape>
             </w:pict>
@@ -9465,7 +9445,7 @@
           </mc:Choice>
           <mc:Fallback>
             <w:pict>
-              <v:shape w14:anchorId="7981C1C2" id="Ink 21" o:spid="_x0000_s1026" type="#_x0000_t75" style="position:absolute;margin-left:415.3pt;margin-top:-5.6pt;width:20.6pt;height:34.85pt;z-index:251761664;visibility:visible;mso-wrap-style:square;mso-wrap-distance-left:9pt;mso-wrap-distance-top:0;mso-wrap-distance-right:9pt;mso-wrap-distance-bottom:0;mso-position-horizontal:absolute;mso-position-horizontal-relative:text;mso-position-vertical:absolute;mso-position-vertical-relative:text" o:gfxdata="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">
+              <v:shape w14:anchorId="24C24A92" id="Ink 21" o:spid="_x0000_s1026" type="#_x0000_t75" style="position:absolute;margin-left:415.3pt;margin-top:-5.6pt;width:20.6pt;height:34.85pt;z-index:251761664;visibility:visible;mso-wrap-style:square;mso-wrap-distance-left:9pt;mso-wrap-distance-top:0;mso-wrap-distance-right:9pt;mso-wrap-distance-bottom:0;mso-position-horizontal:absolute;mso-position-horizontal-relative:text;mso-position-vertical:absolute;mso-position-vertical-relative:text" o:gfxdata="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">
                 <v:imagedata r:id="rId147" o:title=""/>
               </v:shape>
             </w:pict>
@@ -9511,7 +9491,7 @@
           </mc:Choice>
           <mc:Fallback>
             <w:pict>
-              <v:shape w14:anchorId="77216FFC" id="Ink 20" o:spid="_x0000_s1026" type="#_x0000_t75" style="position:absolute;margin-left:357.3pt;margin-top:3.3pt;width:70.85pt;height:16.45pt;z-index:251760640;visibility:visible;mso-wrap-style:square;mso-wrap-distance-left:9pt;mso-wrap-distance-top:0;mso-wrap-distance-right:9pt;mso-wrap-distance-bottom:0;mso-position-horizontal:absolute;mso-position-horizontal-relative:text;mso-position-vertical:absolute;mso-position-vertical-relative:text" o:gfxdata="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">
+              <v:shape w14:anchorId="3A93CEC7" id="Ink 20" o:spid="_x0000_s1026" type="#_x0000_t75" style="position:absolute;margin-left:357.3pt;margin-top:3.3pt;width:70.85pt;height:16.45pt;z-index:251760640;visibility:visible;mso-wrap-style:square;mso-wrap-distance-left:9pt;mso-wrap-distance-top:0;mso-wrap-distance-right:9pt;mso-wrap-distance-bottom:0;mso-position-horizontal:absolute;mso-position-horizontal-relative:text;mso-position-vertical:absolute;mso-position-vertical-relative:text" o:gfxdata="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">
                 <v:imagedata r:id="rId149" o:title=""/>
               </v:shape>
             </w:pict>
@@ -9557,7 +9537,7 @@
           </mc:Choice>
           <mc:Fallback>
             <w:pict>
-              <v:shape w14:anchorId="654DDE09" id="Ink 19" o:spid="_x0000_s1026" type="#_x0000_t75" style="position:absolute;margin-left:276.95pt;margin-top:-10.35pt;width:11.05pt;height:32.1pt;z-index:251759616;visibility:visible;mso-wrap-style:square;mso-wrap-distance-left:9pt;mso-wrap-distance-top:0;mso-wrap-distance-right:9pt;mso-wrap-distance-bottom:0;mso-position-horizontal:absolute;mso-position-horizontal-relative:text;mso-position-vertical:absolute;mso-position-vertical-relative:text" o:gfxdata="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">
+              <v:shape w14:anchorId="206C66C2" id="Ink 19" o:spid="_x0000_s1026" type="#_x0000_t75" style="position:absolute;margin-left:276.95pt;margin-top:-10.35pt;width:11.05pt;height:32.1pt;z-index:251759616;visibility:visible;mso-wrap-style:square;mso-wrap-distance-left:9pt;mso-wrap-distance-top:0;mso-wrap-distance-right:9pt;mso-wrap-distance-bottom:0;mso-position-horizontal:absolute;mso-position-horizontal-relative:text;mso-position-vertical:absolute;mso-position-vertical-relative:text" o:gfxdata="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">
                 <v:imagedata r:id="rId151" o:title=""/>
               </v:shape>
             </w:pict>
@@ -9603,7 +9583,7 @@
           </mc:Choice>
           <mc:Fallback>
             <w:pict>
-              <v:shape w14:anchorId="3F712F3C" id="Ink 18" o:spid="_x0000_s1026" type="#_x0000_t75" style="position:absolute;margin-left:290.7pt;margin-top:18.8pt;width:4.3pt;height:8.45pt;z-index:251758592;visibility:visible;mso-wrap-style:square;mso-wrap-distance-left:9pt;mso-wrap-distance-top:0;mso-wrap-distance-right:9pt;mso-wrap-distance-bottom:0;mso-position-horizontal:absolute;mso-position-horizontal-relative:text;mso-position-vertical:absolute;mso-position-vertical-relative:text" o:gfxdata="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">
+              <v:shape w14:anchorId="5DAE2D2B" id="Ink 18" o:spid="_x0000_s1026" type="#_x0000_t75" style="position:absolute;margin-left:290.7pt;margin-top:18.8pt;width:4.3pt;height:8.45pt;z-index:251758592;visibility:visible;mso-wrap-style:square;mso-wrap-distance-left:9pt;mso-wrap-distance-top:0;mso-wrap-distance-right:9pt;mso-wrap-distance-bottom:0;mso-position-horizontal:absolute;mso-position-horizontal-relative:text;mso-position-vertical:absolute;mso-position-vertical-relative:text" o:gfxdata="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">
                 <v:imagedata r:id="rId153" o:title=""/>
               </v:shape>
             </w:pict>
@@ -9649,7 +9629,7 @@
           </mc:Choice>
           <mc:Fallback>
             <w:pict>
-              <v:shape w14:anchorId="313A284C" id="Ink 17" o:spid="_x0000_s1026" type="#_x0000_t75" style="position:absolute;margin-left:257.2pt;margin-top:7.85pt;width:37.7pt;height:42.7pt;z-index:251757568;visibility:visible;mso-wrap-style:square;mso-wrap-distance-left:9pt;mso-wrap-distance-top:0;mso-wrap-distance-right:9pt;mso-wrap-distance-bottom:0;mso-position-horizontal:absolute;mso-position-horizontal-relative:text;mso-position-vertical:absolute;mso-position-vertical-relative:text" o:gfxdata="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">
+              <v:shape w14:anchorId="6FEDBB81" id="Ink 17" o:spid="_x0000_s1026" type="#_x0000_t75" style="position:absolute;margin-left:257.2pt;margin-top:7.85pt;width:37.7pt;height:42.7pt;z-index:251757568;visibility:visible;mso-wrap-style:square;mso-wrap-distance-left:9pt;mso-wrap-distance-top:0;mso-wrap-distance-right:9pt;mso-wrap-distance-bottom:0;mso-position-horizontal:absolute;mso-position-horizontal-relative:text;mso-position-vertical:absolute;mso-position-vertical-relative:text" o:gfxdata="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">
                 <v:imagedata r:id="rId155" o:title=""/>
               </v:shape>
             </w:pict>
@@ -9695,7 +9675,7 @@
           </mc:Choice>
           <mc:Fallback>
             <w:pict>
-              <v:shape w14:anchorId="7BC1BD17" id="Ink 10" o:spid="_x0000_s1026" type="#_x0000_t75" style="position:absolute;margin-left:60.35pt;margin-top:26.85pt;width:34.85pt;height:14.85pt;z-index:251750400;visibility:visible;mso-wrap-style:square;mso-wrap-distance-left:9pt;mso-wrap-distance-top:0;mso-wrap-distance-right:9pt;mso-wrap-distance-bottom:0;mso-position-horizontal:absolute;mso-position-horizontal-relative:text;mso-position-vertical:absolute;mso-position-vertical-relative:text" o:gfxdata="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">
+              <v:shape w14:anchorId="7EFC2EE0" id="Ink 10" o:spid="_x0000_s1026" type="#_x0000_t75" style="position:absolute;margin-left:60.35pt;margin-top:26.85pt;width:34.85pt;height:14.85pt;z-index:251750400;visibility:visible;mso-wrap-style:square;mso-wrap-distance-left:9pt;mso-wrap-distance-top:0;mso-wrap-distance-right:9pt;mso-wrap-distance-bottom:0;mso-position-horizontal:absolute;mso-position-horizontal-relative:text;mso-position-vertical:absolute;mso-position-vertical-relative:text" o:gfxdata="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">
                 <v:imagedata r:id="rId157" o:title=""/>
               </v:shape>
             </w:pict>
@@ -9741,7 +9721,7 @@
           </mc:Choice>
           <mc:Fallback>
             <w:pict>
-              <v:shape w14:anchorId="77B10DEC" id="Ink 9" o:spid="_x0000_s1026" type="#_x0000_t75" style="position:absolute;margin-left:72.65pt;margin-top:16.9pt;width:16.2pt;height:46.1pt;z-index:251749376;visibility:visible;mso-wrap-style:square;mso-wrap-distance-left:9pt;mso-wrap-distance-top:0;mso-wrap-distance-right:9pt;mso-wrap-distance-bottom:0;mso-position-horizontal:absolute;mso-position-horizontal-relative:text;mso-position-vertical:absolute;mso-position-vertical-relative:text" o:gfxdata="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">
+              <v:shape w14:anchorId="727A38D4" id="Ink 9" o:spid="_x0000_s1026" type="#_x0000_t75" style="position:absolute;margin-left:72.65pt;margin-top:16.9pt;width:16.2pt;height:46.1pt;z-index:251749376;visibility:visible;mso-wrap-style:square;mso-wrap-distance-left:9pt;mso-wrap-distance-top:0;mso-wrap-distance-right:9pt;mso-wrap-distance-bottom:0;mso-position-horizontal:absolute;mso-position-horizontal-relative:text;mso-position-vertical:absolute;mso-position-vertical-relative:text" o:gfxdata="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">
                 <v:imagedata r:id="rId159" o:title=""/>
               </v:shape>
             </w:pict>
@@ -9787,7 +9767,7 @@
           </mc:Choice>
           <mc:Fallback>
             <w:pict>
-              <v:shape w14:anchorId="3F630346" id="Ink 8" o:spid="_x0000_s1026" type="#_x0000_t75" style="position:absolute;margin-left:187.8pt;margin-top:26.2pt;width:13.85pt;height:17.85pt;z-index:251748352;visibility:visible;mso-wrap-style:square;mso-wrap-distance-left:9pt;mso-wrap-distance-top:0;mso-wrap-distance-right:9pt;mso-wrap-distance-bottom:0;mso-position-horizontal:absolute;mso-position-horizontal-relative:text;mso-position-vertical:absolute;mso-position-vertical-relative:text" o:gfxdata="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">
+              <v:shape w14:anchorId="3E1C155F" id="Ink 8" o:spid="_x0000_s1026" type="#_x0000_t75" style="position:absolute;margin-left:187.8pt;margin-top:26.2pt;width:13.85pt;height:17.85pt;z-index:251748352;visibility:visible;mso-wrap-style:square;mso-wrap-distance-left:9pt;mso-wrap-distance-top:0;mso-wrap-distance-right:9pt;mso-wrap-distance-bottom:0;mso-position-horizontal:absolute;mso-position-horizontal-relative:text;mso-position-vertical:absolute;mso-position-vertical-relative:text" o:gfxdata="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">
                 <v:imagedata r:id="rId161" o:title=""/>
               </v:shape>
             </w:pict>
@@ -9833,7 +9813,7 @@
           </mc:Choice>
           <mc:Fallback>
             <w:pict>
-              <v:shape w14:anchorId="5D40F542" id="Ink 7" o:spid="_x0000_s1026" type="#_x0000_t75" style="position:absolute;margin-left:122.45pt;margin-top:30.35pt;width:80.8pt;height:12.7pt;z-index:251747328;visibility:visible;mso-wrap-style:square;mso-wrap-distance-left:9pt;mso-wrap-distance-top:0;mso-wrap-distance-right:9pt;mso-wrap-distance-bottom:0;mso-position-horizontal:absolute;mso-position-horizontal-relative:text;mso-position-vertical:absolute;mso-position-vertical-relative:text" o:gfxdata="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">
+              <v:shape w14:anchorId="7896D433" id="Ink 7" o:spid="_x0000_s1026" type="#_x0000_t75" style="position:absolute;margin-left:122.45pt;margin-top:30.35pt;width:80.8pt;height:12.7pt;z-index:251747328;visibility:visible;mso-wrap-style:square;mso-wrap-distance-left:9pt;mso-wrap-distance-top:0;mso-wrap-distance-right:9pt;mso-wrap-distance-bottom:0;mso-position-horizontal:absolute;mso-position-horizontal-relative:text;mso-position-vertical:absolute;mso-position-vertical-relative:text" o:gfxdata="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">
                 <v:imagedata r:id="rId163" o:title=""/>
               </v:shape>
             </w:pict>
@@ -9879,7 +9859,7 @@
           </mc:Choice>
           <mc:Fallback>
             <w:pict>
-              <v:shape w14:anchorId="690C9335" id="Ink 6" o:spid="_x0000_s1026" type="#_x0000_t75" style="position:absolute;margin-left:198.5pt;margin-top:-55.1pt;width:154.5pt;height:154.05pt;z-index:251746304;visibility:visible;mso-wrap-style:square;mso-wrap-distance-left:9pt;mso-wrap-distance-top:0;mso-wrap-distance-right:9pt;mso-wrap-distance-bottom:0;mso-position-horizontal:absolute;mso-position-horizontal-relative:text;mso-position-vertical:absolute;mso-position-vertical-relative:text" o:gfxdata="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">
+              <v:shape w14:anchorId="5191FBD6" id="Ink 6" o:spid="_x0000_s1026" type="#_x0000_t75" style="position:absolute;margin-left:198.5pt;margin-top:-55.1pt;width:154.5pt;height:154.05pt;z-index:251746304;visibility:visible;mso-wrap-style:square;mso-wrap-distance-left:9pt;mso-wrap-distance-top:0;mso-wrap-distance-right:9pt;mso-wrap-distance-bottom:0;mso-position-horizontal:absolute;mso-position-horizontal-relative:text;mso-position-vertical:absolute;mso-position-vertical-relative:text" o:gfxdata="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">
                 <v:imagedata r:id="rId165" o:title=""/>
               </v:shape>
             </w:pict>
@@ -9925,7 +9905,7 @@
           </mc:Choice>
           <mc:Fallback>
             <w:pict>
-              <v:shape w14:anchorId="1647B7A6" id="Ink 5" o:spid="_x0000_s1026" type="#_x0000_t75" style="position:absolute;margin-left:196.05pt;margin-top:-35.8pt;width:8.5pt;height:119.4pt;z-index:251745280;visibility:visible;mso-wrap-style:square;mso-wrap-distance-left:9pt;mso-wrap-distance-top:0;mso-wrap-distance-right:9pt;mso-wrap-distance-bottom:0;mso-position-horizontal:absolute;mso-position-horizontal-relative:text;mso-position-vertical:absolute;mso-position-vertical-relative:text" o:gfxdata="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">
+              <v:shape w14:anchorId="0A630671" id="Ink 5" o:spid="_x0000_s1026" type="#_x0000_t75" style="position:absolute;margin-left:196.05pt;margin-top:-35.8pt;width:8.5pt;height:119.4pt;z-index:251745280;visibility:visible;mso-wrap-style:square;mso-wrap-distance-left:9pt;mso-wrap-distance-top:0;mso-wrap-distance-right:9pt;mso-wrap-distance-bottom:0;mso-position-horizontal:absolute;mso-position-horizontal-relative:text;mso-position-vertical:absolute;mso-position-vertical-relative:text" o:gfxdata="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">
                 <v:imagedata r:id="rId167" o:title=""/>
               </v:shape>
             </w:pict>
@@ -9992,7 +9972,7 @@
           </mc:Choice>
           <mc:Fallback>
             <w:pict>
-              <v:shape w14:anchorId="21E42B1A" id="Ink 33" o:spid="_x0000_s1026" type="#_x0000_t75" style="position:absolute;margin-left:381.85pt;margin-top:16.05pt;width:5.6pt;height:29.4pt;z-index:251769856;visibility:visible;mso-wrap-style:square;mso-wrap-distance-left:9pt;mso-wrap-distance-top:0;mso-wrap-distance-right:9pt;mso-wrap-distance-bottom:0;mso-position-horizontal:absolute;mso-position-horizontal-relative:text;mso-position-vertical:absolute;mso-position-vertical-relative:text" o:gfxdata="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">
+              <v:shape w14:anchorId="70F103F1" id="Ink 33" o:spid="_x0000_s1026" type="#_x0000_t75" style="position:absolute;margin-left:381.85pt;margin-top:16.05pt;width:5.6pt;height:29.4pt;z-index:251769856;visibility:visible;mso-wrap-style:square;mso-wrap-distance-left:9pt;mso-wrap-distance-top:0;mso-wrap-distance-right:9pt;mso-wrap-distance-bottom:0;mso-position-horizontal:absolute;mso-position-horizontal-relative:text;mso-position-vertical:absolute;mso-position-vertical-relative:text" o:gfxdata="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">
                 <v:imagedata r:id="rId169" o:title=""/>
               </v:shape>
             </w:pict>
@@ -10038,7 +10018,7 @@
           </mc:Choice>
           <mc:Fallback>
             <w:pict>
-              <v:shape w14:anchorId="4E09E273" id="Ink 32" o:spid="_x0000_s1026" type="#_x0000_t75" style="position:absolute;margin-left:333.5pt;margin-top:23.05pt;width:8.35pt;height:21.45pt;z-index:251768832;visibility:visible;mso-wrap-style:square;mso-wrap-distance-left:9pt;mso-wrap-distance-top:0;mso-wrap-distance-right:9pt;mso-wrap-distance-bottom:0;mso-position-horizontal:absolute;mso-position-horizontal-relative:text;mso-position-vertical:absolute;mso-position-vertical-relative:text" o:gfxdata="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">
+              <v:shape w14:anchorId="01E73FEB" id="Ink 32" o:spid="_x0000_s1026" type="#_x0000_t75" style="position:absolute;margin-left:333.5pt;margin-top:23.05pt;width:8.35pt;height:21.45pt;z-index:251768832;visibility:visible;mso-wrap-style:square;mso-wrap-distance-left:9pt;mso-wrap-distance-top:0;mso-wrap-distance-right:9pt;mso-wrap-distance-bottom:0;mso-position-horizontal:absolute;mso-position-horizontal-relative:text;mso-position-vertical:absolute;mso-position-vertical-relative:text" o:gfxdata="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">
                 <v:imagedata r:id="rId171" o:title=""/>
               </v:shape>
             </w:pict>
@@ -10084,7 +10064,7 @@
           </mc:Choice>
           <mc:Fallback>
             <w:pict>
-              <v:shape w14:anchorId="5410E906" id="Ink 30" o:spid="_x0000_s1026" type="#_x0000_t75" style="position:absolute;margin-left:354.85pt;margin-top:20.3pt;width:4pt;height:16.7pt;z-index:251766784;visibility:visible;mso-wrap-style:square;mso-wrap-distance-left:9pt;mso-wrap-distance-top:0;mso-wrap-distance-right:9pt;mso-wrap-distance-bottom:0;mso-position-horizontal:absolute;mso-position-horizontal-relative:text;mso-position-vertical:absolute;mso-position-vertical-relative:text" o:gfxdata="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">
+              <v:shape w14:anchorId="24148381" id="Ink 30" o:spid="_x0000_s1026" type="#_x0000_t75" style="position:absolute;margin-left:354.85pt;margin-top:20.3pt;width:4pt;height:16.7pt;z-index:251766784;visibility:visible;mso-wrap-style:square;mso-wrap-distance-left:9pt;mso-wrap-distance-top:0;mso-wrap-distance-right:9pt;mso-wrap-distance-bottom:0;mso-position-horizontal:absolute;mso-position-horizontal-relative:text;mso-position-vertical:absolute;mso-position-vertical-relative:text" o:gfxdata="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">
                 <v:imagedata r:id="rId173" o:title=""/>
               </v:shape>
             </w:pict>
@@ -10130,7 +10110,7 @@
           </mc:Choice>
           <mc:Fallback>
             <w:pict>
-              <v:shape w14:anchorId="5B0E5973" id="Ink 29" o:spid="_x0000_s1026" type="#_x0000_t75" style="position:absolute;margin-left:155.25pt;margin-top:18.65pt;width:326.4pt;height:26.6pt;z-index:251765760;visibility:visible;mso-wrap-style:square;mso-wrap-distance-left:9pt;mso-wrap-distance-top:0;mso-wrap-distance-right:9pt;mso-wrap-distance-bottom:0;mso-position-horizontal:absolute;mso-position-horizontal-relative:text;mso-position-vertical:absolute;mso-position-vertical-relative:text" o:gfxdata="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">
+              <v:shape w14:anchorId="0E097330" id="Ink 29" o:spid="_x0000_s1026" type="#_x0000_t75" style="position:absolute;margin-left:155.25pt;margin-top:18.65pt;width:326.4pt;height:26.6pt;z-index:251765760;visibility:visible;mso-wrap-style:square;mso-wrap-distance-left:9pt;mso-wrap-distance-top:0;mso-wrap-distance-right:9pt;mso-wrap-distance-bottom:0;mso-position-horizontal:absolute;mso-position-horizontal-relative:text;mso-position-vertical:absolute;mso-position-vertical-relative:text" o:gfxdata="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">
                 <v:imagedata r:id="rId175" o:title=""/>
               </v:shape>
             </w:pict>
@@ -10176,7 +10156,7 @@
           </mc:Choice>
           <mc:Fallback>
             <w:pict>
-              <v:shape w14:anchorId="04E777DA" id="Ink 27" o:spid="_x0000_s1026" type="#_x0000_t75" style="position:absolute;margin-left:258.15pt;margin-top:-14.35pt;width:7.85pt;height:87.95pt;z-index:251764736;visibility:visible;mso-wrap-style:square;mso-wrap-distance-left:9pt;mso-wrap-distance-top:0;mso-wrap-distance-right:9pt;mso-wrap-distance-bottom:0;mso-position-horizontal:absolute;mso-position-horizontal-relative:text;mso-position-vertical:absolute;mso-position-vertical-relative:text" o:gfxdata="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">
+              <v:shape w14:anchorId="2FCE4FC6" id="Ink 27" o:spid="_x0000_s1026" type="#_x0000_t75" style="position:absolute;margin-left:258.15pt;margin-top:-14.35pt;width:7.85pt;height:87.95pt;z-index:251764736;visibility:visible;mso-wrap-style:square;mso-wrap-distance-left:9pt;mso-wrap-distance-top:0;mso-wrap-distance-right:9pt;mso-wrap-distance-bottom:0;mso-position-horizontal:absolute;mso-position-horizontal-relative:text;mso-position-vertical:absolute;mso-position-vertical-relative:text" o:gfxdata="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">
                 <v:imagedata r:id="rId177" o:title=""/>
               </v:shape>
             </w:pict>
@@ -10229,7 +10209,7 @@
           </mc:Choice>
           <mc:Fallback>
             <w:pict>
-              <v:shape w14:anchorId="427921C8" id="Ink 44" o:spid="_x0000_s1026" type="#_x0000_t75" style="position:absolute;margin-left:409.9pt;margin-top:-9.95pt;width:25.95pt;height:25.55pt;z-index:251781120;visibility:visible;mso-wrap-style:square;mso-wrap-distance-left:9pt;mso-wrap-distance-top:0;mso-wrap-distance-right:9pt;mso-wrap-distance-bottom:0;mso-position-horizontal:absolute;mso-position-horizontal-relative:text;mso-position-vertical:absolute;mso-position-vertical-relative:text" o:gfxdata="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">
+              <v:shape w14:anchorId="6EB49363" id="Ink 44" o:spid="_x0000_s1026" type="#_x0000_t75" style="position:absolute;margin-left:409.9pt;margin-top:-9.95pt;width:25.95pt;height:25.55pt;z-index:251781120;visibility:visible;mso-wrap-style:square;mso-wrap-distance-left:9pt;mso-wrap-distance-top:0;mso-wrap-distance-right:9pt;mso-wrap-distance-bottom:0;mso-position-horizontal:absolute;mso-position-horizontal-relative:text;mso-position-vertical:absolute;mso-position-vertical-relative:text" o:gfxdata="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">
                 <v:imagedata r:id="rId179" o:title=""/>
               </v:shape>
             </w:pict>
@@ -10275,7 +10255,7 @@
           </mc:Choice>
           <mc:Fallback>
             <w:pict>
-              <v:shape w14:anchorId="40241260" id="Ink 43" o:spid="_x0000_s1026" type="#_x0000_t75" style="position:absolute;margin-left:411.45pt;margin-top:10.1pt;width:6.15pt;height:17.6pt;z-index:251780096;visibility:visible;mso-wrap-style:square;mso-wrap-distance-left:9pt;mso-wrap-distance-top:0;mso-wrap-distance-right:9pt;mso-wrap-distance-bottom:0;mso-position-horizontal:absolute;mso-position-horizontal-relative:text;mso-position-vertical:absolute;mso-position-vertical-relative:text" o:gfxdata="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">
+              <v:shape w14:anchorId="56DC912C" id="Ink 43" o:spid="_x0000_s1026" type="#_x0000_t75" style="position:absolute;margin-left:411.45pt;margin-top:10.1pt;width:6.15pt;height:17.6pt;z-index:251780096;visibility:visible;mso-wrap-style:square;mso-wrap-distance-left:9pt;mso-wrap-distance-top:0;mso-wrap-distance-right:9pt;mso-wrap-distance-bottom:0;mso-position-horizontal:absolute;mso-position-horizontal-relative:text;mso-position-vertical:absolute;mso-position-vertical-relative:text" o:gfxdata="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">
                 <v:imagedata r:id="rId181" o:title=""/>
               </v:shape>
             </w:pict>
@@ -10321,7 +10301,7 @@
           </mc:Choice>
           <mc:Fallback>
             <w:pict>
-              <v:shape w14:anchorId="2B889F7E" id="Ink 42" o:spid="_x0000_s1026" type="#_x0000_t75" style="position:absolute;margin-left:403.65pt;margin-top:15.35pt;width:2.8pt;height:7.6pt;z-index:251779072;visibility:visible;mso-wrap-style:square;mso-wrap-distance-left:9pt;mso-wrap-distance-top:0;mso-wrap-distance-right:9pt;mso-wrap-distance-bottom:0;mso-position-horizontal:absolute;mso-position-horizontal-relative:text;mso-position-vertical:absolute;mso-position-vertical-relative:text" o:gfxdata="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">
+              <v:shape w14:anchorId="24B4E7F4" id="Ink 42" o:spid="_x0000_s1026" type="#_x0000_t75" style="position:absolute;margin-left:403.65pt;margin-top:15.35pt;width:2.8pt;height:7.6pt;z-index:251779072;visibility:visible;mso-wrap-style:square;mso-wrap-distance-left:9pt;mso-wrap-distance-top:0;mso-wrap-distance-right:9pt;mso-wrap-distance-bottom:0;mso-position-horizontal:absolute;mso-position-horizontal-relative:text;mso-position-vertical:absolute;mso-position-vertical-relative:text" o:gfxdata="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">
                 <v:imagedata r:id="rId183" o:title=""/>
               </v:shape>
             </w:pict>
@@ -10367,7 +10347,7 @@
           </mc:Choice>
           <mc:Fallback>
             <w:pict>
-              <v:shape w14:anchorId="26ECDDF5" id="Ink 41" o:spid="_x0000_s1026" type="#_x0000_t75" style="position:absolute;margin-left:401.35pt;margin-top:17.9pt;width:6.25pt;height:2.25pt;z-index:251778048;visibility:visible;mso-wrap-style:square;mso-wrap-distance-left:9pt;mso-wrap-distance-top:0;mso-wrap-distance-right:9pt;mso-wrap-distance-bottom:0;mso-position-horizontal:absolute;mso-position-horizontal-relative:text;mso-position-vertical:absolute;mso-position-vertical-relative:text" o:gfxdata="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">
+              <v:shape w14:anchorId="1897A982" id="Ink 41" o:spid="_x0000_s1026" type="#_x0000_t75" style="position:absolute;margin-left:401.35pt;margin-top:17.9pt;width:6.25pt;height:2.25pt;z-index:251778048;visibility:visible;mso-wrap-style:square;mso-wrap-distance-left:9pt;mso-wrap-distance-top:0;mso-wrap-distance-right:9pt;mso-wrap-distance-bottom:0;mso-position-horizontal:absolute;mso-position-horizontal-relative:text;mso-position-vertical:absolute;mso-position-vertical-relative:text" o:gfxdata="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">
                 <v:imagedata r:id="rId185" o:title=""/>
               </v:shape>
             </w:pict>
@@ -10413,7 +10393,7 @@
           </mc:Choice>
           <mc:Fallback>
             <w:pict>
-              <v:shape w14:anchorId="0E4FF2DA" id="Ink 40" o:spid="_x0000_s1026" type="#_x0000_t75" style="position:absolute;margin-left:386.2pt;margin-top:17.95pt;width:9.2pt;height:3.05pt;z-index:251777024;visibility:visible;mso-wrap-style:square;mso-wrap-distance-left:9pt;mso-wrap-distance-top:0;mso-wrap-distance-right:9pt;mso-wrap-distance-bottom:0;mso-position-horizontal:absolute;mso-position-horizontal-relative:text;mso-position-vertical:absolute;mso-position-vertical-relative:text" o:gfxdata="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">
+              <v:shape w14:anchorId="4164EF7B" id="Ink 40" o:spid="_x0000_s1026" type="#_x0000_t75" style="position:absolute;margin-left:386.2pt;margin-top:17.95pt;width:9.2pt;height:3.05pt;z-index:251777024;visibility:visible;mso-wrap-style:square;mso-wrap-distance-left:9pt;mso-wrap-distance-top:0;mso-wrap-distance-right:9pt;mso-wrap-distance-bottom:0;mso-position-horizontal:absolute;mso-position-horizontal-relative:text;mso-position-vertical:absolute;mso-position-vertical-relative:text" o:gfxdata="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">
                 <v:imagedata r:id="rId187" o:title=""/>
               </v:shape>
             </w:pict>
@@ -10459,7 +10439,7 @@
           </mc:Choice>
           <mc:Fallback>
             <w:pict>
-              <v:shape w14:anchorId="52470269" id="Ink 39" o:spid="_x0000_s1026" type="#_x0000_t75" style="position:absolute;margin-left:383.15pt;margin-top:8.55pt;width:10pt;height:19.45pt;z-index:251776000;visibility:visible;mso-wrap-style:square;mso-wrap-distance-left:9pt;mso-wrap-distance-top:0;mso-wrap-distance-right:9pt;mso-wrap-distance-bottom:0;mso-position-horizontal:absolute;mso-position-horizontal-relative:text;mso-position-vertical:absolute;mso-position-vertical-relative:text" o:gfxdata="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">
+              <v:shape w14:anchorId="2B80BB88" id="Ink 39" o:spid="_x0000_s1026" type="#_x0000_t75" style="position:absolute;margin-left:383.15pt;margin-top:8.55pt;width:10pt;height:19.45pt;z-index:251776000;visibility:visible;mso-wrap-style:square;mso-wrap-distance-left:9pt;mso-wrap-distance-top:0;mso-wrap-distance-right:9pt;mso-wrap-distance-bottom:0;mso-position-horizontal:absolute;mso-position-horizontal-relative:text;mso-position-vertical:absolute;mso-position-vertical-relative:text" o:gfxdata="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">
                 <v:imagedata r:id="rId189" o:title=""/>
               </v:shape>
             </w:pict>
@@ -10505,7 +10485,7 @@
           </mc:Choice>
           <mc:Fallback>
             <w:pict>
-              <v:shape w14:anchorId="386126C8" id="Ink 38" o:spid="_x0000_s1026" type="#_x0000_t75" style="position:absolute;margin-left:328pt;margin-top:8.5pt;width:23.2pt;height:11.75pt;z-index:251774976;visibility:visible;mso-wrap-style:square;mso-wrap-distance-left:9pt;mso-wrap-distance-top:0;mso-wrap-distance-right:9pt;mso-wrap-distance-bottom:0;mso-position-horizontal:absolute;mso-position-horizontal-relative:text;mso-position-vertical:absolute;mso-position-vertical-relative:text" o:gfxdata="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">
+              <v:shape w14:anchorId="79A97FC8" id="Ink 38" o:spid="_x0000_s1026" type="#_x0000_t75" style="position:absolute;margin-left:328pt;margin-top:8.5pt;width:23.2pt;height:11.75pt;z-index:251774976;visibility:visible;mso-wrap-style:square;mso-wrap-distance-left:9pt;mso-wrap-distance-top:0;mso-wrap-distance-right:9pt;mso-wrap-distance-bottom:0;mso-position-horizontal:absolute;mso-position-horizontal-relative:text;mso-position-vertical:absolute;mso-position-vertical-relative:text" o:gfxdata="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">
                 <v:imagedata r:id="rId191" o:title=""/>
               </v:shape>
             </w:pict>
@@ -10551,7 +10531,7 @@
           </mc:Choice>
           <mc:Fallback>
             <w:pict>
-              <v:shape w14:anchorId="13B813C0" id="Ink 37" o:spid="_x0000_s1026" type="#_x0000_t75" style="position:absolute;margin-left:330.25pt;margin-top:15.15pt;width:5.5pt;height:12.3pt;z-index:251773952;visibility:visible;mso-wrap-style:square;mso-wrap-distance-left:9pt;mso-wrap-distance-top:0;mso-wrap-distance-right:9pt;mso-wrap-distance-bottom:0;mso-position-horizontal:absolute;mso-position-horizontal-relative:text;mso-position-vertical:absolute;mso-position-vertical-relative:text" o:gfxdata="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">
+              <v:shape w14:anchorId="368B6011" id="Ink 37" o:spid="_x0000_s1026" type="#_x0000_t75" style="position:absolute;margin-left:330.25pt;margin-top:15.15pt;width:5.5pt;height:12.3pt;z-index:251773952;visibility:visible;mso-wrap-style:square;mso-wrap-distance-left:9pt;mso-wrap-distance-top:0;mso-wrap-distance-right:9pt;mso-wrap-distance-bottom:0;mso-position-horizontal:absolute;mso-position-horizontal-relative:text;mso-position-vertical:absolute;mso-position-vertical-relative:text" o:gfxdata="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">
                 <v:imagedata r:id="rId193" o:title=""/>
               </v:shape>
             </w:pict>
@@ -10597,7 +10577,7 @@
           </mc:Choice>
           <mc:Fallback>
             <w:pict>
-              <v:shape w14:anchorId="089E0284" id="Ink 36" o:spid="_x0000_s1026" type="#_x0000_t75" style="position:absolute;margin-left:328.05pt;margin-top:18.7pt;width:3.65pt;height:2.05pt;z-index:251772928;visibility:visible;mso-wrap-style:square;mso-wrap-distance-left:9pt;mso-wrap-distance-top:0;mso-wrap-distance-right:9pt;mso-wrap-distance-bottom:0;mso-position-horizontal:absolute;mso-position-horizontal-relative:text;mso-position-vertical:absolute;mso-position-vertical-relative:text" o:gfxdata="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">
+              <v:shape w14:anchorId="1F6D6E1F" id="Ink 36" o:spid="_x0000_s1026" type="#_x0000_t75" style="position:absolute;margin-left:328.05pt;margin-top:18.7pt;width:3.65pt;height:2.05pt;z-index:251772928;visibility:visible;mso-wrap-style:square;mso-wrap-distance-left:9pt;mso-wrap-distance-top:0;mso-wrap-distance-right:9pt;mso-wrap-distance-bottom:0;mso-position-horizontal:absolute;mso-position-horizontal-relative:text;mso-position-vertical:absolute;mso-position-vertical-relative:text" o:gfxdata="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">
                 <v:imagedata r:id="rId195" o:title=""/>
               </v:shape>
             </w:pict>
@@ -10643,7 +10623,7 @@
           </mc:Choice>
           <mc:Fallback>
             <w:pict>
-              <v:shape w14:anchorId="3420F492" id="Ink 35" o:spid="_x0000_s1026" type="#_x0000_t75" style="position:absolute;margin-left:315.55pt;margin-top:18.15pt;width:8.1pt;height:4.1pt;z-index:251771904;visibility:visible;mso-wrap-style:square;mso-wrap-distance-left:9pt;mso-wrap-distance-top:0;mso-wrap-distance-right:9pt;mso-wrap-distance-bottom:0;mso-position-horizontal:absolute;mso-position-horizontal-relative:text;mso-position-vertical:absolute;mso-position-vertical-relative:text" o:gfxdata="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">
+              <v:shape w14:anchorId="01900E61" id="Ink 35" o:spid="_x0000_s1026" type="#_x0000_t75" style="position:absolute;margin-left:315.55pt;margin-top:18.15pt;width:8.1pt;height:4.1pt;z-index:251771904;visibility:visible;mso-wrap-style:square;mso-wrap-distance-left:9pt;mso-wrap-distance-top:0;mso-wrap-distance-right:9pt;mso-wrap-distance-bottom:0;mso-position-horizontal:absolute;mso-position-horizontal-relative:text;mso-position-vertical:absolute;mso-position-vertical-relative:text" o:gfxdata="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">
                 <v:imagedata r:id="rId197" o:title=""/>
               </v:shape>
             </w:pict>
@@ -10689,7 +10669,7 @@
           </mc:Choice>
           <mc:Fallback>
             <w:pict>
-              <v:shape w14:anchorId="77293F10" id="Ink 34" o:spid="_x0000_s1026" type="#_x0000_t75" style="position:absolute;margin-left:313.65pt;margin-top:8.15pt;width:13.25pt;height:20.9pt;z-index:251770880;visibility:visible;mso-wrap-style:square;mso-wrap-distance-left:9pt;mso-wrap-distance-top:0;mso-wrap-distance-right:9pt;mso-wrap-distance-bottom:0;mso-position-horizontal:absolute;mso-position-horizontal-relative:text;mso-position-vertical:absolute;mso-position-vertical-relative:text" o:gfxdata="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">
+              <v:shape w14:anchorId="15E3D2FE" id="Ink 34" o:spid="_x0000_s1026" type="#_x0000_t75" style="position:absolute;margin-left:313.65pt;margin-top:8.15pt;width:13.25pt;height:20.9pt;z-index:251770880;visibility:visible;mso-wrap-style:square;mso-wrap-distance-left:9pt;mso-wrap-distance-top:0;mso-wrap-distance-right:9pt;mso-wrap-distance-bottom:0;mso-position-horizontal:absolute;mso-position-horizontal-relative:text;mso-position-vertical:absolute;mso-position-vertical-relative:text" o:gfxdata="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">
                 <v:imagedata r:id="rId199" o:title=""/>
               </v:shape>
             </w:pict>
@@ -10735,7 +10715,7 @@
           </mc:Choice>
           <mc:Fallback>
             <w:pict>
-              <v:shape w14:anchorId="2193F633" id="Ink 31" o:spid="_x0000_s1026" type="#_x0000_t75" style="position:absolute;margin-left:349.1pt;margin-top:3pt;width:19.8pt;height:24.45pt;z-index:251767808;visibility:visible;mso-wrap-style:square;mso-wrap-distance-left:9pt;mso-wrap-distance-top:0;mso-wrap-distance-right:9pt;mso-wrap-distance-bottom:0;mso-position-horizontal:absolute;mso-position-horizontal-relative:text;mso-position-vertical:absolute;mso-position-vertical-relative:text" o:gfxdata="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">
+              <v:shape w14:anchorId="2F5C074A" id="Ink 31" o:spid="_x0000_s1026" type="#_x0000_t75" style="position:absolute;margin-left:349.1pt;margin-top:3pt;width:19.8pt;height:24.45pt;z-index:251767808;visibility:visible;mso-wrap-style:square;mso-wrap-distance-left:9pt;mso-wrap-distance-top:0;mso-wrap-distance-right:9pt;mso-wrap-distance-bottom:0;mso-position-horizontal:absolute;mso-position-horizontal-relative:text;mso-position-vertical:absolute;mso-position-vertical-relative:text" o:gfxdata="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">
                 <v:imagedata r:id="rId201" o:title=""/>
               </v:shape>
             </w:pict>
@@ -11576,7 +11556,7 @@
           <w:sz w:val="44"/>
         </w:rPr>
       </w:pPr>
-      <w:bookmarkStart w:id="1" w:name="_Hlk237275529"/>
+      <w:bookmarkStart w:id="2" w:name="_Hlk237275529"/>
       <w:r>
         <w:rPr>
           <w:sz w:val="44"/>
@@ -11663,7 +11643,7 @@
         <w:t>”)</w:t>
       </w:r>
     </w:p>
-    <w:bookmarkEnd w:id="1"/>
+    <w:bookmarkEnd w:id="2"/>
     <w:p>
       <w:pPr>
         <w:pStyle w:val="ListParagraph"/>
@@ -11870,7 +11850,7 @@
         </w:rPr>
         <w:t>: (“</w:t>
       </w:r>
-      <w:bookmarkStart w:id="2" w:name="_Hlk237275554"/>
+      <w:bookmarkStart w:id="3" w:name="_Hlk237275554"/>
       <w:r>
         <w:rPr>
           <w:sz w:val="44"/>
@@ -11899,7 +11879,7 @@
         </w:rPr>
         <w:t>test</w:t>
       </w:r>
-      <w:bookmarkEnd w:id="2"/>
+      <w:bookmarkEnd w:id="3"/>
       <w:r>
         <w:rPr>
           <w:sz w:val="44"/>
@@ -11959,7 +11939,7 @@
           </mc:Choice>
           <mc:Fallback>
             <w:pict>
-              <v:shape w14:anchorId="6EF5439D" id="Ink 24" o:spid="_x0000_s1026" type="#_x0000_t75" style="position:absolute;margin-left:154.6pt;margin-top:23.75pt;width:1.75pt;height:4.15pt;z-index:251681792;visibility:visible;mso-wrap-style:square;mso-wrap-distance-left:9pt;mso-wrap-distance-top:0;mso-wrap-distance-right:9pt;mso-wrap-distance-bottom:0;mso-position-horizontal:absolute;mso-position-horizontal-relative:text;mso-position-vertical:absolute;mso-position-vertical-relative:text" o:gfxdata="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">
+              <v:shape w14:anchorId="7A9F2BE3" id="Ink 24" o:spid="_x0000_s1026" type="#_x0000_t75" style="position:absolute;margin-left:154.6pt;margin-top:23.75pt;width:1.75pt;height:4.15pt;z-index:251681792;visibility:visible;mso-wrap-style:square;mso-wrap-distance-left:9pt;mso-wrap-distance-top:0;mso-wrap-distance-right:9pt;mso-wrap-distance-bottom:0;mso-position-horizontal:absolute;mso-position-horizontal-relative:text;mso-position-vertical:absolute;mso-position-vertical-relative:text" o:gfxdata="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">
                 <v:imagedata r:id="rId205" o:title=""/>
               </v:shape>
             </w:pict>
@@ -12592,7 +12572,7 @@
 </file>
 
 <file path=word/numbering.xml><?xml version="1.0" encoding="utf-8"?>
-<w:numbering xmlns:wpc="http://schemas.microsoft.com/office/word/2010/wordprocessingCanvas" xmlns:cx="http://schemas.microsoft.com/office/drawing/2014/chartex" xmlns:cx1="http://schemas.microsoft.com/office/drawing/2015/9/8/chartex" xmlns:cx2="http://schemas.microsoft.com/office/drawing/2015/10/21/chartex" xmlns:cx3="http://schemas.microsoft.com/office/drawing/2016/5/9/chartex" xmlns:cx4="http://schemas.microsoft.com/office/drawing/2016/5/10/chartex" xmlns:cx5="http://schemas.microsoft.com/office/drawing/2016/5/11/chartex" xmlns:cx6="http://schemas.microsoft.com/office/drawing/2016/5/12/chartex" xmlns:cx7="http://schemas.microsoft.com/office/drawing/2016/5/13/chartex" xmlns:cx8="http://schemas.microsoft.com/office/drawing/2016/5/14/chartex" xmlns:mc="http://schemas.openxmlformats.org/markup-compatibility/2006" xmlns:aink="http://schemas.microsoft.com/office/drawing/2016/ink" xmlns:am3d="http://schemas.microsoft.com/office/drawing/2017/model3d" xmlns:o="urn:schemas-microsoft-com:office:office" xmlns:oel="http://schemas.microsoft.com/office/2019/extlst" xmlns:r="http://schemas.openxmlformats.org/officeDocument/2006/relationships" xmlns:m="http://schemas.openxmlformats.org/officeDocument/2006/math" xmlns:v="urn:schemas-microsoft-com:vml" xmlns:wp14="http://schemas.microsoft.com/office/word/2010/wordprocessingDrawing" xmlns:wp="http://schemas.openxmlformats.org/drawingml/2006/wordprocessingDrawing" xmlns:w10="urn:schemas-microsoft-com:office:word" xmlns:w="http://schemas.openxmlformats.org/wordprocessingml/2006/main" xmlns:w14="http://schemas.microsoft.com/office/word/2010/wordml" xmlns:w15="http://schemas.microsoft.com/office/word/2012/wordml" xmlns:w16cex="http://schemas.microsoft.com/office/word/2018/wordml/cex" xmlns:w16cid="http://schemas.microsoft.com/office/word/2016/wordml/cid" xmlns:w16="http://schemas.microsoft.com/office/word/2018/wordml" xmlns:w16du="http://schemas.microsoft.com/office/word/2023/wordml/word16du" xmlns:w16sdtdh="http://schemas.microsoft.com/office/word/2020/wordml/sdtdatahash" xmlns:w16se="http://schemas.microsoft.com/office/word/2015/wordml/symex" xmlns:wpg="http://schemas.microsoft.com/office/word/2010/wordprocessingGroup" xmlns:wpi="http://schemas.microsoft.com/office/word/2010/wordprocessingInk" xmlns:wne="http://schemas.microsoft.com/office/word/2006/wordml" xmlns:wps="http://schemas.microsoft.com/office/word/2010/wordprocessingShape" mc:Ignorable="w14 w15 w16se w16cid w16 w16cex w16sdtdh w16du wp14">
+<w:numbering xmlns:wpc="http://schemas.microsoft.com/office/word/2010/wordprocessingCanvas" xmlns:cx="http://schemas.microsoft.com/office/drawing/2014/chartex" xmlns:cx1="http://schemas.microsoft.com/office/drawing/2015/9/8/chartex" xmlns:cx2="http://schemas.microsoft.com/office/drawing/2015/10/21/chartex" xmlns:cx3="http://schemas.microsoft.com/office/drawing/2016/5/9/chartex" xmlns:cx4="http://schemas.microsoft.com/office/drawing/2016/5/10/chartex" xmlns:cx5="http://schemas.microsoft.com/office/drawing/2016/5/11/chartex" xmlns:cx6="http://schemas.microsoft.com/office/drawing/2016/5/12/chartex" xmlns:cx7="http://schemas.microsoft.com/office/drawing/2016/5/13/chartex" xmlns:cx8="http://schemas.microsoft.com/office/drawing/2016/5/14/chartex" xmlns:mc="http://schemas.openxmlformats.org/markup-compatibility/2006" xmlns:aink="http://schemas.microsoft.com/office/drawing/2016/ink" xmlns:am3d="http://schemas.microsoft.com/office/drawing/2017/model3d" xmlns:o="urn:schemas-microsoft-com:office:office" xmlns:oel="http://schemas.microsoft.com/office/2019/extlst" xmlns:r="http://schemas.openxmlformats.org/officeDocument/2006/relationships" xmlns:m="http://schemas.openxmlformats.org/officeDocument/2006/math" xmlns:v="urn:schemas-microsoft-com:vml" xmlns:wp14="http://schemas.microsoft.com/office/word/2010/wordprocessingDrawing" xmlns:wp="http://schemas.openxmlformats.org/drawingml/2006/wordprocessingDrawing" xmlns:w10="urn:schemas-microsoft-com:office:word" xmlns:w="http://schemas.openxmlformats.org/wordprocessingml/2006/main" xmlns:w14="http://schemas.microsoft.com/office/word/2010/wordml" xmlns:w15="http://schemas.microsoft.com/office/word/2012/wordml" xmlns:w16cex="http://schemas.microsoft.com/office/word/2018/wordml/cex" xmlns:w16cid="http://schemas.microsoft.com/office/word/2016/wordml/cid" xmlns:w16="http://schemas.microsoft.com/office/word/2018/wordml" xmlns:w16du="http://schemas.microsoft.com/office/word/2023/wordml/word16du" xmlns:w16sdtdh="http://schemas.microsoft.com/office/word/2020/wordml/sdtdatahash" xmlns:w16sdtfl="http://schemas.microsoft.com/office/word/2024/wordml/sdtformatlock" xmlns:w16se="http://schemas.microsoft.com/office/word/2015/wordml/symex" xmlns:wpg="http://schemas.microsoft.com/office/word/2010/wordprocessingGroup" xmlns:wpi="http://schemas.microsoft.com/office/word/2010/wordprocessingInk" xmlns:wne="http://schemas.microsoft.com/office/word/2006/wordml" xmlns:wps="http://schemas.microsoft.com/office/word/2010/wordprocessingShape" mc:Ignorable="w14 w15 w16se w16cid w16 w16cex w16sdtdh w16sdtfl w16du wp14">
   <w:abstractNum w:abstractNumId="0" w15:restartNumberingAfterBreak="0">
     <w:nsid w:val="0265043E"/>
     <w:multiLevelType w:val="hybridMultilevel"/>
@@ -12827,7 +12807,7 @@
 </file>
 
 <file path=word/styles.xml><?xml version="1.0" encoding="utf-8"?>
-<w:styles xmlns:mc="http://schemas.openxmlformats.org/markup-compatibility/2006" xmlns:r="http://schemas.openxmlformats.org/officeDocument/2006/relationships" xmlns:w="http://schemas.openxmlformats.org/wordprocessingml/2006/main" xmlns:w14="http://schemas.microsoft.com/office/word/2010/wordml" xmlns:w15="http://schemas.microsoft.com/office/word/2012/wordml" xmlns:w16cex="http://schemas.microsoft.com/office/word/2018/wordml/cex" xmlns:w16cid="http://schemas.microsoft.com/office/word/2016/wordml/cid" xmlns:w16="http://schemas.microsoft.com/office/word/2018/wordml" xmlns:w16du="http://schemas.microsoft.com/office/word/2023/wordml/word16du" xmlns:w16sdtdh="http://schemas.microsoft.com/office/word/2020/wordml/sdtdatahash" xmlns:w16se="http://schemas.microsoft.com/office/word/2015/wordml/symex" mc:Ignorable="w14 w15 w16se w16cid w16 w16cex w16sdtdh w16du">
+<w:styles xmlns:mc="http://schemas.openxmlformats.org/markup-compatibility/2006" xmlns:r="http://schemas.openxmlformats.org/officeDocument/2006/relationships" xmlns:w="http://schemas.openxmlformats.org/wordprocessingml/2006/main" xmlns:w14="http://schemas.microsoft.com/office/word/2010/wordml" xmlns:w15="http://schemas.microsoft.com/office/word/2012/wordml" xmlns:w16cex="http://schemas.microsoft.com/office/word/2018/wordml/cex" xmlns:w16cid="http://schemas.microsoft.com/office/word/2016/wordml/cid" xmlns:w16="http://schemas.microsoft.com/office/word/2018/wordml" xmlns:w16du="http://schemas.microsoft.com/office/word/2023/wordml/word16du" xmlns:w16sdtdh="http://schemas.microsoft.com/office/word/2020/wordml/sdtdatahash" xmlns:w16sdtfl="http://schemas.microsoft.com/office/word/2024/wordml/sdtformatlock" xmlns:w16se="http://schemas.microsoft.com/office/word/2015/wordml/symex" mc:Ignorable="w14 w15 w16se w16cid w16 w16cex w16sdtdh w16sdtfl w16du">
   <w:docDefaults>
     <w:rPrDefault>
       <w:rPr>

</xml_diff>

<commit_message>
Updates Arduino examples document content
Adjusts session timings and identifiers for various examples. Refines detailed descriptions, including specific Proteus components for LCD I2C, updates controlled LED segments from 'g' to 'a', and corrects switch references (SW2 to SW3). Also adds a condition for speed lock and renames an exercise for clarity.
</commit_message>
<xml_diff>
--- a/Material/drive-download-20260820T004134Z-1-001/2. Vi du Arduino - 2026.docx
+++ b/Material/drive-download-20260820T004134Z-1-001/2. Vi du Arduino - 2026.docx
@@ -1,6 +1,6 @@
 
 <file path=word/document.xml><?xml version="1.0" encoding="utf-8"?>
-<w:document xmlns:wpc="http://schemas.microsoft.com/office/word/2010/wordprocessingCanvas" xmlns:cx="http://schemas.microsoft.com/office/drawing/2014/chartex" xmlns:cx1="http://schemas.microsoft.com/office/drawing/2015/9/8/chartex" xmlns:cx2="http://schemas.microsoft.com/office/drawing/2015/10/21/chartex" xmlns:cx3="http://schemas.microsoft.com/office/drawing/2016/5/9/chartex" xmlns:cx4="http://schemas.microsoft.com/office/drawing/2016/5/10/chartex" xmlns:cx5="http://schemas.microsoft.com/office/drawing/2016/5/11/chartex" xmlns:cx6="http://schemas.microsoft.com/office/drawing/2016/5/12/chartex" xmlns:cx7="http://schemas.microsoft.com/office/drawing/2016/5/13/chartex" xmlns:cx8="http://schemas.microsoft.com/office/drawing/2016/5/14/chartex" xmlns:mc="http://schemas.openxmlformats.org/markup-compatibility/2006" xmlns:aink="http://schemas.microsoft.com/office/drawing/2016/ink" xmlns:am3d="http://schemas.microsoft.com/office/drawing/2017/model3d" xmlns:o="urn:schemas-microsoft-com:office:office" xmlns:oel="http://schemas.microsoft.com/office/2019/extlst" xmlns:r="http://schemas.openxmlformats.org/officeDocument/2006/relationships" xmlns:m="http://schemas.openxmlformats.org/officeDocument/2006/math" xmlns:v="urn:schemas-microsoft-com:vml" xmlns:wp14="http://schemas.microsoft.com/office/word/2010/wordprocessingDrawing" xmlns:wp="http://schemas.openxmlformats.org/drawingml/2006/wordprocessingDrawing" xmlns:w10="urn:schemas-microsoft-com:office:word" xmlns:w="http://schemas.openxmlformats.org/wordprocessingml/2006/main" xmlns:w14="http://schemas.microsoft.com/office/word/2010/wordml" xmlns:w15="http://schemas.microsoft.com/office/word/2012/wordml" xmlns:w16cex="http://schemas.microsoft.com/office/word/2018/wordml/cex" xmlns:w16cid="http://schemas.microsoft.com/office/word/2016/wordml/cid" xmlns:w16="http://schemas.microsoft.com/office/word/2018/wordml" xmlns:w16du="http://schemas.microsoft.com/office/word/2023/wordml/word16du" xmlns:w16sdtdh="http://schemas.microsoft.com/office/word/2020/wordml/sdtdatahash" xmlns:w16sdtfl="http://schemas.microsoft.com/office/word/2024/wordml/sdtformatlock" xmlns:w16se="http://schemas.microsoft.com/office/word/2015/wordml/symex" xmlns:wpg="http://schemas.microsoft.com/office/word/2010/wordprocessingGroup" xmlns:wpi="http://schemas.microsoft.com/office/word/2010/wordprocessingInk" xmlns:wne="http://schemas.microsoft.com/office/word/2006/wordml" xmlns:wps="http://schemas.microsoft.com/office/word/2010/wordprocessingShape" mc:Ignorable="w14 w15 w16se w16cid w16 w16cex w16sdtdh w16sdtfl w16du wp14">
+<w:document xmlns:wpc="http://schemas.microsoft.com/office/word/2010/wordprocessingCanvas" xmlns:cx="http://schemas.microsoft.com/office/drawing/2014/chartex" xmlns:mc="http://schemas.openxmlformats.org/markup-compatibility/2006" xmlns:o="urn:schemas-microsoft-com:office:office" xmlns:r="http://schemas.openxmlformats.org/officeDocument/2006/relationships" xmlns:m="http://schemas.openxmlformats.org/officeDocument/2006/math" xmlns:v="urn:schemas-microsoft-com:vml" xmlns:wp14="http://schemas.microsoft.com/office/word/2010/wordprocessingDrawing" xmlns:wp="http://schemas.openxmlformats.org/drawingml/2006/wordprocessingDrawing" xmlns:w10="urn:schemas-microsoft-com:office:word" xmlns:w="http://schemas.openxmlformats.org/wordprocessingml/2006/main" xmlns:w14="http://schemas.microsoft.com/office/word/2010/wordml" xmlns:w15="http://schemas.microsoft.com/office/word/2012/wordml" xmlns:w16se="http://schemas.microsoft.com/office/word/2015/wordml/symex" xmlns:wpg="http://schemas.microsoft.com/office/word/2010/wordprocessingGroup" xmlns:wpi="http://schemas.microsoft.com/office/word/2010/wordprocessingInk" xmlns:wne="http://schemas.microsoft.com/office/word/2006/wordml" xmlns:wps="http://schemas.microsoft.com/office/word/2010/wordprocessingShape" mc:Ignorable="w14 w15 w16se wp14">
   <w:body>
     <w:p>
       <w:pPr>
@@ -15,7 +15,6 @@
           <w:noProof/>
           <w:sz w:val="28"/>
           <w:szCs w:val="28"/>
-          <w:lang w:val="vi-VN"/>
         </w:rPr>
         <w:drawing>
           <wp:inline distT="0" distB="0" distL="0" distR="0" wp14:anchorId="5509915D" wp14:editId="6B1A725A">
@@ -88,7 +87,6 @@
           <w:noProof/>
           <w:sz w:val="28"/>
           <w:szCs w:val="28"/>
-          <w:lang w:val="vi-VN"/>
         </w:rPr>
         <w:drawing>
           <wp:inline distT="0" distB="0" distL="0" distR="0" wp14:anchorId="4C477C9D" wp14:editId="6D84733E">
@@ -153,7 +151,6 @@
           <w:noProof/>
           <w:sz w:val="28"/>
           <w:szCs w:val="28"/>
-          <w:lang w:val="vi-VN"/>
         </w:rPr>
         <w:lastRenderedPageBreak/>
         <w:drawing>
@@ -776,19 +773,7 @@
         <w:rPr>
           <w:sz w:val="44"/>
         </w:rPr>
-        <w:t>Buổ</w:t>
-      </w:r>
-      <w:r>
-        <w:rPr>
-          <w:sz w:val="44"/>
-        </w:rPr>
-        <w:t>i 2</w:t>
-      </w:r>
-      <w:r>
-        <w:rPr>
-          <w:sz w:val="44"/>
-        </w:rPr>
-        <w:t>S</w:t>
+        <w:t>14h30 B2c</w:t>
       </w:r>
     </w:p>
     <w:p>
@@ -953,11 +938,19 @@
         </w:rPr>
         <w:tab/>
       </w:r>
-      <w:r>
-        <w:rPr>
-          <w:sz w:val="44"/>
-        </w:rPr>
-        <w:t>pinMode(6, OUTPUT);</w:t>
+      <w:proofErr w:type="gramStart"/>
+      <w:r>
+        <w:rPr>
+          <w:sz w:val="44"/>
+        </w:rPr>
+        <w:t>pinMode(</w:t>
+      </w:r>
+      <w:proofErr w:type="gramEnd"/>
+      <w:r>
+        <w:rPr>
+          <w:sz w:val="44"/>
+        </w:rPr>
+        <w:t>6, OUTPUT);</w:t>
       </w:r>
     </w:p>
     <w:p>
@@ -976,7 +969,21 @@
         <w:rPr>
           <w:sz w:val="44"/>
         </w:rPr>
-        <w:t>digitalWrite(6,HIGH);</w:t>
+        <w:t>digitalWrite(</w:t>
+      </w:r>
+      <w:proofErr w:type="gramStart"/>
+      <w:r>
+        <w:rPr>
+          <w:sz w:val="44"/>
+        </w:rPr>
+        <w:t>6,HIGH</w:t>
+      </w:r>
+      <w:proofErr w:type="gramEnd"/>
+      <w:r>
+        <w:rPr>
+          <w:sz w:val="44"/>
+        </w:rPr>
+        <w:t>);</w:t>
       </w:r>
     </w:p>
     <w:p>
@@ -992,7 +999,6 @@
           <w:noProof/>
           <w:sz w:val="28"/>
           <w:szCs w:val="28"/>
-          <w:lang w:val="vi-VN"/>
         </w:rPr>
         <w:lastRenderedPageBreak/>
         <w:drawing>
@@ -1062,7 +1068,13 @@
         <w:rPr>
           <w:sz w:val="44"/>
         </w:rPr>
-        <w:t>9</w:t>
+        <w:t>1</w:t>
+      </w:r>
+      <w:r>
+        <w:rPr>
+          <w:sz w:val="44"/>
+        </w:rPr>
+        <w:t>5</w:t>
       </w:r>
       <w:r>
         <w:rPr>
@@ -1074,19 +1086,19 @@
         <w:rPr>
           <w:sz w:val="44"/>
         </w:rPr>
-        <w:t>4</w:t>
-      </w:r>
-      <w:r>
-        <w:rPr>
-          <w:sz w:val="44"/>
-        </w:rPr>
-        <w:t>0 B3</w:t>
-      </w:r>
-      <w:r>
-        <w:rPr>
-          <w:sz w:val="44"/>
-        </w:rPr>
-        <w:t>s</w:t>
+        <w:t>3</w:t>
+      </w:r>
+      <w:r>
+        <w:rPr>
+          <w:sz w:val="44"/>
+        </w:rPr>
+        <w:t xml:space="preserve">0 </w:t>
+      </w:r>
+      <w:r>
+        <w:rPr>
+          <w:sz w:val="44"/>
+        </w:rPr>
+        <w:t>B2c</w:t>
       </w:r>
     </w:p>
     <w:p>
@@ -1148,7 +1160,6 @@
           <w:noProof/>
           <w:sz w:val="28"/>
           <w:szCs w:val="28"/>
-          <w:lang w:val="vi-VN"/>
         </w:rPr>
         <w:drawing>
           <wp:inline distT="0" distB="0" distL="0" distR="0" wp14:anchorId="19ED17A1" wp14:editId="37B03AF4">
@@ -1217,7 +1228,7 @@
         <w:rPr>
           <w:sz w:val="44"/>
         </w:rPr>
-        <w:t>10</w:t>
+        <w:t>16</w:t>
       </w:r>
       <w:r>
         <w:rPr>
@@ -1229,13 +1240,7 @@
         <w:rPr>
           <w:sz w:val="44"/>
         </w:rPr>
-        <w:t>17</w:t>
-      </w:r>
-      <w:r>
-        <w:rPr>
-          <w:sz w:val="44"/>
-        </w:rPr>
-        <w:t xml:space="preserve"> B3s</w:t>
+        <w:t>11 B2c</w:t>
       </w:r>
     </w:p>
     <w:p>
@@ -1317,19 +1322,7 @@
         <w:rPr>
           <w:sz w:val="44"/>
         </w:rPr>
-        <w:t xml:space="preserve">vẽ thêm LCD </w:t>
-      </w:r>
-      <w:r>
-        <w:rPr>
-          <w:sz w:val="44"/>
-        </w:rPr>
-        <w:t>I2C.</w:t>
-      </w:r>
-      <w:r>
-        <w:rPr>
-          <w:sz w:val="44"/>
-        </w:rPr>
-        <w:t xml:space="preserve"> SDA-A4, SCL-A5</w:t>
+        <w:t>LM016, PCF8574</w:t>
       </w:r>
     </w:p>
     <w:p>
@@ -1490,7 +1483,6 @@
           <w:noProof/>
           <w:sz w:val="28"/>
           <w:szCs w:val="28"/>
-          <w:lang w:val="vi-VN"/>
         </w:rPr>
         <w:drawing>
           <wp:inline distT="0" distB="0" distL="0" distR="0" wp14:anchorId="180E6F03" wp14:editId="7CC58507">
@@ -1561,7 +1553,19 @@
         <w:rPr>
           <w:sz w:val="44"/>
         </w:rPr>
-        <w:t>7h40</w:t>
+        <w:t>8</w:t>
+      </w:r>
+      <w:r>
+        <w:rPr>
+          <w:sz w:val="44"/>
+        </w:rPr>
+        <w:t>h</w:t>
+      </w:r>
+      <w:r>
+        <w:rPr>
+          <w:sz w:val="44"/>
+        </w:rPr>
+        <w:t>30-9h15</w:t>
       </w:r>
       <w:r>
         <w:rPr>
@@ -1573,7 +1577,19 @@
         <w:rPr>
           <w:sz w:val="44"/>
         </w:rPr>
-        <w:t>B4</w:t>
+        <w:t>B</w:t>
+      </w:r>
+      <w:r>
+        <w:rPr>
+          <w:sz w:val="44"/>
+        </w:rPr>
+        <w:t>3</w:t>
+      </w:r>
+      <w:r>
+        <w:rPr>
+          <w:sz w:val="44"/>
+        </w:rPr>
+        <w:t>s</w:t>
       </w:r>
     </w:p>
     <w:p>
@@ -1719,7 +1735,13 @@
         <w:rPr>
           <w:sz w:val="44"/>
         </w:rPr>
-        <w:t>8h05 N4</w:t>
+        <w:t>9</w:t>
+      </w:r>
+      <w:r>
+        <w:rPr>
+          <w:sz w:val="44"/>
+        </w:rPr>
+        <w:t>h45 B3s</w:t>
       </w:r>
     </w:p>
     <w:p>
@@ -2106,7 +2128,6 @@
         </w:rPr>
         <w:t>: (“</w:t>
       </w:r>
-      <w:bookmarkStart w:id="0" w:name="OLE_LINK1"/>
       <w:r>
         <w:rPr>
           <w:sz w:val="44"/>
@@ -2142,7 +2163,6 @@
         </w:rPr>
         <w:t>dSo</w:t>
       </w:r>
-      <w:bookmarkEnd w:id="0"/>
       <w:r>
         <w:rPr>
           <w:sz w:val="44"/>
@@ -2321,11 +2341,19 @@
         </w:rPr>
         <w:t>6</w:t>
       </w:r>
-      <w:r>
-        <w:rPr>
-          <w:sz w:val="44"/>
-        </w:rPr>
-        <w:t>:  (“</w:t>
+      <w:proofErr w:type="gramStart"/>
+      <w:r>
+        <w:rPr>
+          <w:sz w:val="44"/>
+        </w:rPr>
+        <w:t>:  (</w:t>
+      </w:r>
+      <w:proofErr w:type="gramEnd"/>
+      <w:r>
+        <w:rPr>
+          <w:sz w:val="44"/>
+        </w:rPr>
+        <w:t>“</w:t>
       </w:r>
       <w:r>
         <w:rPr>
@@ -2415,19 +2443,7 @@
         <w:rPr>
           <w:sz w:val="44"/>
         </w:rPr>
-        <w:t>Nhấn SW</w:t>
-      </w:r>
-      <w:r>
-        <w:rPr>
-          <w:sz w:val="44"/>
-        </w:rPr>
-        <w:t>2</w:t>
-      </w:r>
-      <w:r>
-        <w:rPr>
-          <w:sz w:val="44"/>
-        </w:rPr>
-        <w:t xml:space="preserve"> thì DEN2 (máy tính) đổi trạng thái SÁNG/TẮT.  </w:t>
+        <w:t xml:space="preserve">Nhấn SW3 thì DEN2 (máy tính) đổi trạng thái SÁNG/TẮT.  </w:t>
       </w:r>
     </w:p>
     <w:p>
@@ -2945,18 +2961,6 @@
           <w:sz w:val="44"/>
         </w:rPr>
       </w:pPr>
-      <w:r>
-        <w:rPr>
-          <w:sz w:val="44"/>
-        </w:rPr>
-        <w:t>5 - 7h3</w:t>
-      </w:r>
-      <w:r>
-        <w:rPr>
-          <w:sz w:val="44"/>
-        </w:rPr>
-        <w:t xml:space="preserve">0 </w:t>
-      </w:r>
     </w:p>
     <w:p>
       <w:pPr>
@@ -3062,7 +3066,7 @@
           </mc:Choice>
           <mc:Fallback>
             <w:pict>
-              <v:shapetype w14:anchorId="4B5F290E" id="_x0000_t75" coordsize="21600,21600" o:spt="75" o:preferrelative="t" path="m@4@5l@4@11@9@11@9@5xe" filled="f" stroked="f">
+              <v:shapetype w14:anchorId="3AC584E6" id="_x0000_t75" coordsize="21600,21600" o:spt="75" o:preferrelative="t" path="m@4@5l@4@11@9@11@9@5xe" filled="f" stroked="f">
                 <v:stroke joinstyle="miter"/>
                 <v:formulas>
                   <v:f eqn="if lineDrawn pixelLineWidth 0"/>
@@ -3081,7 +3085,7 @@
                 <v:path o:extrusionok="f" gradientshapeok="t" o:connecttype="rect"/>
                 <o:lock v:ext="edit" aspectratio="t"/>
               </v:shapetype>
-              <v:shape id="Ink 64" o:spid="_x0000_s1026" type="#_x0000_t75" style="position:absolute;margin-left:47.3pt;margin-top:20.5pt;width:16.05pt;height:31.85pt;z-index:251802624;visibility:visible;mso-wrap-style:square;mso-wrap-distance-left:9pt;mso-wrap-distance-top:0;mso-wrap-distance-right:9pt;mso-wrap-distance-bottom:0;mso-position-horizontal:absolute;mso-position-horizontal-relative:text;mso-position-vertical:absolute;mso-position-vertical-relative:text" o:gfxdata="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">
+              <v:shape id="Ink 64" o:spid="_x0000_s1026" type="#_x0000_t75" style="position:absolute;margin-left:48pt;margin-top:21.35pt;width:15.15pt;height:30.4pt;z-index:251802624;visibility:visible;mso-wrap-style:square;mso-wrap-distance-left:9pt;mso-wrap-distance-top:0;mso-wrap-distance-right:9pt;mso-wrap-distance-bottom:0;mso-position-horizontal:absolute;mso-position-horizontal-relative:text;mso-position-vertical:absolute;mso-position-vertical-relative:text" o:gfxdata="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">
                 <v:imagedata r:id="rId21" o:title=""/>
               </v:shape>
             </w:pict>
@@ -3127,7 +3131,7 @@
           </mc:Choice>
           <mc:Fallback>
             <w:pict>
-              <v:shape w14:anchorId="4C2DE691" id="Ink 63" o:spid="_x0000_s1026" type="#_x0000_t75" style="position:absolute;margin-left:97.1pt;margin-top:20.65pt;width:10.35pt;height:25.05pt;z-index:251801600;visibility:visible;mso-wrap-style:square;mso-wrap-distance-left:9pt;mso-wrap-distance-top:0;mso-wrap-distance-right:9pt;mso-wrap-distance-bottom:0;mso-position-horizontal:absolute;mso-position-horizontal-relative:text;mso-position-vertical:absolute;mso-position-vertical-relative:text" o:gfxdata="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">
+              <v:shape w14:anchorId="456447A1" id="Ink 63" o:spid="_x0000_s1026" type="#_x0000_t75" style="position:absolute;margin-left:97.95pt;margin-top:21.4pt;width:8.85pt;height:24.05pt;z-index:251801600;visibility:visible;mso-wrap-style:square;mso-wrap-distance-left:9pt;mso-wrap-distance-top:0;mso-wrap-distance-right:9pt;mso-wrap-distance-bottom:0;mso-position-horizontal:absolute;mso-position-horizontal-relative:text;mso-position-vertical:absolute;mso-position-vertical-relative:text" o:gfxdata="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">
                 <v:imagedata r:id="rId23" o:title=""/>
               </v:shape>
             </w:pict>
@@ -3173,7 +3177,7 @@
           </mc:Choice>
           <mc:Fallback>
             <w:pict>
-              <v:shape w14:anchorId="0DE49662" id="Ink 62" o:spid="_x0000_s1026" type="#_x0000_t75" style="position:absolute;margin-left:146.35pt;margin-top:25.4pt;width:12.2pt;height:16.4pt;z-index:251800576;visibility:visible;mso-wrap-style:square;mso-wrap-distance-left:9pt;mso-wrap-distance-top:0;mso-wrap-distance-right:9pt;mso-wrap-distance-bottom:0;mso-position-horizontal:absolute;mso-position-horizontal-relative:text;mso-position-vertical:absolute;mso-position-vertical-relative:text" o:gfxdata="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">
+              <v:shape w14:anchorId="08298313" id="Ink 62" o:spid="_x0000_s1026" type="#_x0000_t75" style="position:absolute;margin-left:147pt;margin-top:26.15pt;width:10.85pt;height:15pt;z-index:251800576;visibility:visible;mso-wrap-style:square;mso-wrap-distance-left:9pt;mso-wrap-distance-top:0;mso-wrap-distance-right:9pt;mso-wrap-distance-bottom:0;mso-position-horizontal:absolute;mso-position-horizontal-relative:text;mso-position-vertical:absolute;mso-position-vertical-relative:text" o:gfxdata="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">
                 <v:imagedata r:id="rId25" o:title=""/>
               </v:shape>
             </w:pict>
@@ -3219,7 +3223,7 @@
           </mc:Choice>
           <mc:Fallback>
             <w:pict>
-              <v:shape w14:anchorId="06B0502F" id="Ink 61" o:spid="_x0000_s1026" type="#_x0000_t75" style="position:absolute;margin-left:139.35pt;margin-top:25.55pt;width:16.2pt;height:20pt;z-index:251799552;visibility:visible;mso-wrap-style:square;mso-wrap-distance-left:9pt;mso-wrap-distance-top:0;mso-wrap-distance-right:9pt;mso-wrap-distance-bottom:0;mso-position-horizontal:absolute;mso-position-horizontal-relative:text;mso-position-vertical:absolute;mso-position-vertical-relative:text" o:gfxdata="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">
+              <v:shape w14:anchorId="0B2CAA57" id="Ink 61" o:spid="_x0000_s1026" type="#_x0000_t75" style="position:absolute;margin-left:140.15pt;margin-top:26.25pt;width:15.2pt;height:18.8pt;z-index:251799552;visibility:visible;mso-wrap-style:square;mso-wrap-distance-left:9pt;mso-wrap-distance-top:0;mso-wrap-distance-right:9pt;mso-wrap-distance-bottom:0;mso-position-horizontal:absolute;mso-position-horizontal-relative:text;mso-position-vertical:absolute;mso-position-vertical-relative:text" o:gfxdata="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">
                 <v:imagedata r:id="rId27" o:title=""/>
               </v:shape>
             </w:pict>
@@ -3265,7 +3269,7 @@
           </mc:Choice>
           <mc:Fallback>
             <w:pict>
-              <v:shape w14:anchorId="47BD2BE2" id="Ink 60" o:spid="_x0000_s1026" type="#_x0000_t75" style="position:absolute;margin-left:196.25pt;margin-top:23.95pt;width:13.65pt;height:25.7pt;z-index:251798528;visibility:visible;mso-wrap-style:square;mso-wrap-distance-left:9pt;mso-wrap-distance-top:0;mso-wrap-distance-right:9pt;mso-wrap-distance-bottom:0;mso-position-horizontal:absolute;mso-position-horizontal-relative:text;mso-position-vertical:absolute;mso-position-vertical-relative:text" o:gfxdata="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">
+              <v:shape w14:anchorId="52012729" id="Ink 60" o:spid="_x0000_s1026" type="#_x0000_t75" style="position:absolute;margin-left:197pt;margin-top:24.7pt;width:12.7pt;height:24.25pt;z-index:251798528;visibility:visible;mso-wrap-style:square;mso-wrap-distance-left:9pt;mso-wrap-distance-top:0;mso-wrap-distance-right:9pt;mso-wrap-distance-bottom:0;mso-position-horizontal:absolute;mso-position-horizontal-relative:text;mso-position-vertical:absolute;mso-position-vertical-relative:text" o:gfxdata="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">
                 <v:imagedata r:id="rId29" o:title=""/>
               </v:shape>
             </w:pict>
@@ -3311,7 +3315,7 @@
           </mc:Choice>
           <mc:Fallback>
             <w:pict>
-              <v:shape w14:anchorId="30738DA2" id="Ink 59" o:spid="_x0000_s1026" type="#_x0000_t75" style="position:absolute;margin-left:247.7pt;margin-top:18.75pt;width:16pt;height:11.95pt;z-index:251797504;visibility:visible;mso-wrap-style:square;mso-wrap-distance-left:9pt;mso-wrap-distance-top:0;mso-wrap-distance-right:9pt;mso-wrap-distance-bottom:0;mso-position-horizontal:absolute;mso-position-horizontal-relative:text;mso-position-vertical:absolute;mso-position-vertical-relative:text" o:gfxdata="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">
+              <v:shape w14:anchorId="2C477866" id="Ink 59" o:spid="_x0000_s1026" type="#_x0000_t75" style="position:absolute;margin-left:248.35pt;margin-top:19.5pt;width:14.65pt;height:10.6pt;z-index:251797504;visibility:visible;mso-wrap-style:square;mso-wrap-distance-left:9pt;mso-wrap-distance-top:0;mso-wrap-distance-right:9pt;mso-wrap-distance-bottom:0;mso-position-horizontal:absolute;mso-position-horizontal-relative:text;mso-position-vertical:absolute;mso-position-vertical-relative:text" o:gfxdata="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">
                 <v:imagedata r:id="rId31" o:title=""/>
               </v:shape>
             </w:pict>
@@ -3357,7 +3361,7 @@
           </mc:Choice>
           <mc:Fallback>
             <w:pict>
-              <v:shape w14:anchorId="40CD3380" id="Ink 58" o:spid="_x0000_s1026" type="#_x0000_t75" style="position:absolute;margin-left:248.05pt;margin-top:25.55pt;width:8.55pt;height:16.5pt;z-index:251796480;visibility:visible;mso-wrap-style:square;mso-wrap-distance-left:9pt;mso-wrap-distance-top:0;mso-wrap-distance-right:9pt;mso-wrap-distance-bottom:0;mso-position-horizontal:absolute;mso-position-horizontal-relative:text;mso-position-vertical:absolute;mso-position-vertical-relative:text" o:gfxdata="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">
+              <v:shape w14:anchorId="5961CB8C" id="Ink 58" o:spid="_x0000_s1026" type="#_x0000_t75" style="position:absolute;margin-left:248.4pt;margin-top:26.25pt;width:8pt;height:15.6pt;z-index:251796480;visibility:visible;mso-wrap-style:square;mso-wrap-distance-left:9pt;mso-wrap-distance-top:0;mso-wrap-distance-right:9pt;mso-wrap-distance-bottom:0;mso-position-horizontal:absolute;mso-position-horizontal-relative:text;mso-position-vertical:absolute;mso-position-vertical-relative:text" o:gfxdata="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">
                 <v:imagedata r:id="rId33" o:title=""/>
               </v:shape>
             </w:pict>
@@ -3403,7 +3407,7 @@
           </mc:Choice>
           <mc:Fallback>
             <w:pict>
-              <v:shape w14:anchorId="0B520E7A" id="Ink 57" o:spid="_x0000_s1026" type="#_x0000_t75" style="position:absolute;margin-left:294.8pt;margin-top:24.95pt;width:6pt;height:20.15pt;z-index:251795456;visibility:visible;mso-wrap-style:square;mso-wrap-distance-left:9pt;mso-wrap-distance-top:0;mso-wrap-distance-right:9pt;mso-wrap-distance-bottom:0;mso-position-horizontal:absolute;mso-position-horizontal-relative:text;mso-position-vertical:absolute;mso-position-vertical-relative:text" o:gfxdata="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">
+              <v:shape w14:anchorId="5F97309B" id="Ink 57" o:spid="_x0000_s1026" type="#_x0000_t75" style="position:absolute;margin-left:295.55pt;margin-top:25.65pt;width:4.7pt;height:18.75pt;z-index:251795456;visibility:visible;mso-wrap-style:square;mso-wrap-distance-left:9pt;mso-wrap-distance-top:0;mso-wrap-distance-right:9pt;mso-wrap-distance-bottom:0;mso-position-horizontal:absolute;mso-position-horizontal-relative:text;mso-position-vertical:absolute;mso-position-vertical-relative:text" o:gfxdata="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">
                 <v:imagedata r:id="rId35" o:title=""/>
               </v:shape>
             </w:pict>
@@ -3449,7 +3453,7 @@
           </mc:Choice>
           <mc:Fallback>
             <w:pict>
-              <v:shape w14:anchorId="2217F8DA" id="Ink 56" o:spid="_x0000_s1026" type="#_x0000_t75" style="position:absolute;margin-left:289.75pt;margin-top:15.05pt;width:11.25pt;height:19.9pt;z-index:251794432;visibility:visible;mso-wrap-style:square;mso-wrap-distance-left:9pt;mso-wrap-distance-top:0;mso-wrap-distance-right:9pt;mso-wrap-distance-bottom:0;mso-position-horizontal:absolute;mso-position-horizontal-relative:text;mso-position-vertical:absolute;mso-position-vertical-relative:text" o:gfxdata="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">
+              <v:shape w14:anchorId="3A5F7BF4" id="Ink 56" o:spid="_x0000_s1026" type="#_x0000_t75" style="position:absolute;margin-left:290.05pt;margin-top:15.8pt;width:10.25pt;height:19.05pt;z-index:251794432;visibility:visible;mso-wrap-style:square;mso-wrap-distance-left:9pt;mso-wrap-distance-top:0;mso-wrap-distance-right:9pt;mso-wrap-distance-bottom:0;mso-position-horizontal:absolute;mso-position-horizontal-relative:text;mso-position-vertical:absolute;mso-position-vertical-relative:text" o:gfxdata="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">
                 <v:imagedata r:id="rId37" o:title=""/>
               </v:shape>
             </w:pict>
@@ -3495,7 +3499,7 @@
           </mc:Choice>
           <mc:Fallback>
             <w:pict>
-              <v:shape w14:anchorId="49DA95CC" id="Ink 55" o:spid="_x0000_s1026" type="#_x0000_t75" style="position:absolute;margin-left:341.65pt;margin-top:16.45pt;width:8.35pt;height:17.4pt;z-index:251793408;visibility:visible;mso-wrap-style:square;mso-wrap-distance-left:9pt;mso-wrap-distance-top:0;mso-wrap-distance-right:9pt;mso-wrap-distance-bottom:0;mso-position-horizontal:absolute;mso-position-horizontal-relative:text;mso-position-vertical:absolute;mso-position-vertical-relative:text" o:gfxdata="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">
+              <v:shape w14:anchorId="757647B2" id="Ink 55" o:spid="_x0000_s1026" type="#_x0000_t75" style="position:absolute;margin-left:342.05pt;margin-top:17.15pt;width:7.3pt;height:16.35pt;z-index:251793408;visibility:visible;mso-wrap-style:square;mso-wrap-distance-left:9pt;mso-wrap-distance-top:0;mso-wrap-distance-right:9pt;mso-wrap-distance-bottom:0;mso-position-horizontal:absolute;mso-position-horizontal-relative:text;mso-position-vertical:absolute;mso-position-vertical-relative:text" o:gfxdata="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">
                 <v:imagedata r:id="rId39" o:title=""/>
               </v:shape>
             </w:pict>
@@ -3541,7 +3545,7 @@
           </mc:Choice>
           <mc:Fallback>
             <w:pict>
-              <v:shape w14:anchorId="4EED9541" id="Ink 54" o:spid="_x0000_s1026" type="#_x0000_t75" style="position:absolute;margin-left:389.45pt;margin-top:13.1pt;width:17.3pt;height:19.1pt;z-index:251792384;visibility:visible;mso-wrap-style:square;mso-wrap-distance-left:9pt;mso-wrap-distance-top:0;mso-wrap-distance-right:9pt;mso-wrap-distance-bottom:0;mso-position-horizontal:absolute;mso-position-horizontal-relative:text;mso-position-vertical:absolute;mso-position-vertical-relative:text" o:gfxdata="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">
+              <v:shape w14:anchorId="16EEB2A6" id="Ink 54" o:spid="_x0000_s1026" type="#_x0000_t75" style="position:absolute;margin-left:389.95pt;margin-top:13.6pt;width:16.1pt;height:18.35pt;z-index:251792384;visibility:visible;mso-wrap-style:square;mso-wrap-distance-left:9pt;mso-wrap-distance-top:0;mso-wrap-distance-right:9pt;mso-wrap-distance-bottom:0;mso-position-horizontal:absolute;mso-position-horizontal-relative:text;mso-position-vertical:absolute;mso-position-vertical-relative:text" o:gfxdata="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">
                 <v:imagedata r:id="rId41" o:title=""/>
               </v:shape>
             </w:pict>
@@ -3587,7 +3591,7 @@
           </mc:Choice>
           <mc:Fallback>
             <w:pict>
-              <v:shape w14:anchorId="05AA36E0" id="Ink 53" o:spid="_x0000_s1026" type="#_x0000_t75" style="position:absolute;margin-left:439.15pt;margin-top:8.45pt;width:5.7pt;height:13.55pt;z-index:251791360;visibility:visible;mso-wrap-style:square;mso-wrap-distance-left:9pt;mso-wrap-distance-top:0;mso-wrap-distance-right:9pt;mso-wrap-distance-bottom:0;mso-position-horizontal:absolute;mso-position-horizontal-relative:text;mso-position-vertical:absolute;mso-position-vertical-relative:text" o:gfxdata="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">
+              <v:shape w14:anchorId="4F7563C9" id="Ink 53" o:spid="_x0000_s1026" type="#_x0000_t75" style="position:absolute;margin-left:439.5pt;margin-top:8.75pt;width:5.1pt;height:13pt;z-index:251791360;visibility:visible;mso-wrap-style:square;mso-wrap-distance-left:9pt;mso-wrap-distance-top:0;mso-wrap-distance-right:9pt;mso-wrap-distance-bottom:0;mso-position-horizontal:absolute;mso-position-horizontal-relative:text;mso-position-vertical:absolute;mso-position-vertical-relative:text" o:gfxdata="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">
                 <v:imagedata r:id="rId43" o:title=""/>
               </v:shape>
             </w:pict>
@@ -3633,7 +3637,7 @@
           </mc:Choice>
           <mc:Fallback>
             <w:pict>
-              <v:shape w14:anchorId="6CF9581A" id="Ink 52" o:spid="_x0000_s1026" type="#_x0000_t75" style="position:absolute;margin-left:425.1pt;margin-top:29.5pt;width:39.7pt;height:20.65pt;z-index:251790336;visibility:visible;mso-wrap-style:square;mso-wrap-distance-left:9pt;mso-wrap-distance-top:0;mso-wrap-distance-right:9pt;mso-wrap-distance-bottom:0;mso-position-horizontal:absolute;mso-position-horizontal-relative:text;mso-position-vertical:absolute;mso-position-vertical-relative:text" o:gfxdata="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">
+              <v:shape w14:anchorId="605FE0BD" id="Ink 52" o:spid="_x0000_s1026" type="#_x0000_t75" style="position:absolute;margin-left:425.35pt;margin-top:29.7pt;width:38.9pt;height:20.25pt;z-index:251790336;visibility:visible;mso-wrap-style:square;mso-wrap-distance-left:9pt;mso-wrap-distance-top:0;mso-wrap-distance-right:9pt;mso-wrap-distance-bottom:0;mso-position-horizontal:absolute;mso-position-horizontal-relative:text;mso-position-vertical:absolute;mso-position-vertical-relative:text" o:gfxdata="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">
                 <v:imagedata r:id="rId45" o:title=""/>
               </v:shape>
             </w:pict>
@@ -3679,7 +3683,7 @@
           </mc:Choice>
           <mc:Fallback>
             <w:pict>
-              <v:shape w14:anchorId="70D64F5F" id="Ink 51" o:spid="_x0000_s1026" type="#_x0000_t75" style="position:absolute;margin-left:493.8pt;margin-top:20.8pt;width:11.7pt;height:13.05pt;z-index:251789312;visibility:visible;mso-wrap-style:square;mso-wrap-distance-left:9pt;mso-wrap-distance-top:0;mso-wrap-distance-right:9pt;mso-wrap-distance-bottom:0;mso-position-horizontal:absolute;mso-position-horizontal-relative:text;mso-position-vertical:absolute;mso-position-vertical-relative:text" o:gfxdata="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">
+              <v:shape w14:anchorId="1FD5A674" id="Ink 51" o:spid="_x0000_s1026" type="#_x0000_t75" style="position:absolute;margin-left:494pt;margin-top:21.25pt;width:11.35pt;height:12.4pt;z-index:251789312;visibility:visible;mso-wrap-style:square;mso-wrap-distance-left:9pt;mso-wrap-distance-top:0;mso-wrap-distance-right:9pt;mso-wrap-distance-bottom:0;mso-position-horizontal:absolute;mso-position-horizontal-relative:text;mso-position-vertical:absolute;mso-position-vertical-relative:text" o:gfxdata="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">
                 <v:imagedata r:id="rId47" o:title=""/>
               </v:shape>
             </w:pict>
@@ -3725,7 +3729,7 @@
           </mc:Choice>
           <mc:Fallback>
             <w:pict>
-              <v:shape w14:anchorId="1A888211" id="Ink 4" o:spid="_x0000_s1026" type="#_x0000_t75" style="position:absolute;margin-left:-7.65pt;margin-top:62.85pt;width:10.8pt;height:10.3pt;z-index:251786240;visibility:visible;mso-wrap-style:square;mso-wrap-distance-left:9pt;mso-wrap-distance-top:0;mso-wrap-distance-right:9pt;mso-wrap-distance-bottom:0;mso-position-horizontal:absolute;mso-position-horizontal-relative:text;mso-position-vertical:absolute;mso-position-vertical-relative:text" o:gfxdata="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">
+              <v:shape w14:anchorId="226208CD" id="Ink 4" o:spid="_x0000_s1026" type="#_x0000_t75" style="position:absolute;margin-left:-7.15pt;margin-top:63.6pt;width:9.7pt;height:9.4pt;z-index:251786240;visibility:visible;mso-wrap-style:square;mso-wrap-distance-left:9pt;mso-wrap-distance-top:0;mso-wrap-distance-right:9pt;mso-wrap-distance-bottom:0;mso-position-horizontal:absolute;mso-position-horizontal-relative:text;mso-position-vertical:absolute;mso-position-vertical-relative:text" o:gfxdata="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">
                 <v:imagedata r:id="rId49" o:title=""/>
               </v:shape>
             </w:pict>
@@ -3771,7 +3775,7 @@
           </mc:Choice>
           <mc:Fallback>
             <w:pict>
-              <v:shape w14:anchorId="5DCE8191" id="Ink 3" o:spid="_x0000_s1026" type="#_x0000_t75" style="position:absolute;margin-left:-8.85pt;margin-top:39.4pt;width:19.65pt;height:8.75pt;z-index:251785216;visibility:visible;mso-wrap-style:square;mso-wrap-distance-left:9pt;mso-wrap-distance-top:0;mso-wrap-distance-right:9pt;mso-wrap-distance-bottom:0;mso-position-horizontal:absolute;mso-position-horizontal-relative:text;mso-position-vertical:absolute;mso-position-vertical-relative:text" o:gfxdata="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">
+              <v:shape w14:anchorId="74759F4A" id="Ink 3" o:spid="_x0000_s1026" type="#_x0000_t75" style="position:absolute;margin-left:-8.2pt;margin-top:39.55pt;width:18.9pt;height:8.05pt;z-index:251785216;visibility:visible;mso-wrap-style:square;mso-wrap-distance-left:9pt;mso-wrap-distance-top:0;mso-wrap-distance-right:9pt;mso-wrap-distance-bottom:0;mso-position-horizontal:absolute;mso-position-horizontal-relative:text;mso-position-vertical:absolute;mso-position-vertical-relative:text" o:gfxdata="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">
                 <v:imagedata r:id="rId51" o:title=""/>
               </v:shape>
             </w:pict>
@@ -3817,6 +3821,7 @@
               <w:bottom w:val="nil"/>
               <w:right w:val="nil"/>
             </w:tcBorders>
+            <w:shd w:val="clear" w:color="auto" w:fill="auto"/>
             <w:noWrap/>
             <w:vAlign w:val="bottom"/>
             <w:hideMark/>
@@ -3870,7 +3875,7 @@
                 </mc:Choice>
                 <mc:Fallback>
                   <w:pict>
-                    <v:shape w14:anchorId="493954B4" id="Ink 2" o:spid="_x0000_s1026" type="#_x0000_t75" style="position:absolute;margin-left:-5.3pt;margin-top:-5pt;width:10.45pt;height:22.35pt;z-index:251784192;visibility:visible;mso-wrap-style:square;mso-wrap-distance-left:9pt;mso-wrap-distance-top:0;mso-wrap-distance-right:9pt;mso-wrap-distance-bottom:0;mso-position-horizontal:absolute;mso-position-horizontal-relative:text;mso-position-vertical:absolute;mso-position-vertical-relative:text" o:gfxdata="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">
+                    <v:shape w14:anchorId="342F3EF6" id="Ink 2" o:spid="_x0000_s1026" type="#_x0000_t75" style="position:absolute;margin-left:-4.9pt;margin-top:-4.6pt;width:10pt;height:21.85pt;z-index:251784192;visibility:visible;mso-wrap-style:square;mso-wrap-distance-left:9pt;mso-wrap-distance-top:0;mso-wrap-distance-right:9pt;mso-wrap-distance-bottom:0;mso-position-horizontal:absolute;mso-position-horizontal-relative:text;mso-position-vertical:absolute;mso-position-vertical-relative:text" o:gfxdata="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">
                       <v:imagedata r:id="rId53" o:title=""/>
                     </v:shape>
                   </w:pict>
@@ -3905,6 +3910,7 @@
               <w:bottom w:val="nil"/>
               <w:right w:val="nil"/>
             </w:tcBorders>
+            <w:shd w:val="clear" w:color="auto" w:fill="auto"/>
             <w:noWrap/>
             <w:vAlign w:val="bottom"/>
             <w:hideMark/>
@@ -3936,6 +3942,7 @@
               <w:bottom w:val="nil"/>
               <w:right w:val="nil"/>
             </w:tcBorders>
+            <w:shd w:val="clear" w:color="auto" w:fill="auto"/>
             <w:noWrap/>
             <w:vAlign w:val="bottom"/>
             <w:hideMark/>
@@ -3967,6 +3974,7 @@
               <w:bottom w:val="nil"/>
               <w:right w:val="nil"/>
             </w:tcBorders>
+            <w:shd w:val="clear" w:color="auto" w:fill="auto"/>
             <w:noWrap/>
             <w:vAlign w:val="bottom"/>
             <w:hideMark/>
@@ -3998,6 +4006,7 @@
               <w:bottom w:val="nil"/>
               <w:right w:val="nil"/>
             </w:tcBorders>
+            <w:shd w:val="clear" w:color="auto" w:fill="auto"/>
             <w:noWrap/>
             <w:vAlign w:val="bottom"/>
             <w:hideMark/>
@@ -4029,6 +4038,7 @@
               <w:bottom w:val="nil"/>
               <w:right w:val="nil"/>
             </w:tcBorders>
+            <w:shd w:val="clear" w:color="auto" w:fill="auto"/>
             <w:noWrap/>
             <w:vAlign w:val="bottom"/>
             <w:hideMark/>
@@ -4060,6 +4070,7 @@
               <w:bottom w:val="nil"/>
               <w:right w:val="nil"/>
             </w:tcBorders>
+            <w:shd w:val="clear" w:color="auto" w:fill="auto"/>
             <w:noWrap/>
             <w:vAlign w:val="bottom"/>
             <w:hideMark/>
@@ -4091,6 +4102,7 @@
               <w:bottom w:val="nil"/>
               <w:right w:val="nil"/>
             </w:tcBorders>
+            <w:shd w:val="clear" w:color="auto" w:fill="auto"/>
             <w:noWrap/>
             <w:vAlign w:val="bottom"/>
             <w:hideMark/>
@@ -4122,6 +4134,7 @@
               <w:bottom w:val="nil"/>
               <w:right w:val="nil"/>
             </w:tcBorders>
+            <w:shd w:val="clear" w:color="auto" w:fill="auto"/>
             <w:noWrap/>
             <w:vAlign w:val="bottom"/>
             <w:hideMark/>
@@ -4153,6 +4166,7 @@
               <w:bottom w:val="nil"/>
               <w:right w:val="nil"/>
             </w:tcBorders>
+            <w:shd w:val="clear" w:color="auto" w:fill="auto"/>
             <w:noWrap/>
             <w:vAlign w:val="bottom"/>
             <w:hideMark/>
@@ -4184,6 +4198,7 @@
               <w:bottom w:val="nil"/>
               <w:right w:val="nil"/>
             </w:tcBorders>
+            <w:shd w:val="clear" w:color="auto" w:fill="auto"/>
             <w:noWrap/>
             <w:vAlign w:val="bottom"/>
             <w:hideMark/>
@@ -4237,7 +4252,7 @@
                 </mc:Choice>
                 <mc:Fallback>
                   <w:pict>
-                    <v:shape w14:anchorId="5F3B2294" id="Ink 50" o:spid="_x0000_s1026" type="#_x0000_t75" style="position:absolute;margin-left:-2.25pt;margin-top:-4.45pt;width:32.7pt;height:10.85pt;z-index:251788288;visibility:visible;mso-wrap-style:square;mso-wrap-distance-left:9pt;mso-wrap-distance-top:0;mso-wrap-distance-right:9pt;mso-wrap-distance-bottom:0;mso-position-horizontal:absolute;mso-position-horizontal-relative:text;mso-position-vertical:absolute;mso-position-vertical-relative:text" o:gfxdata="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">
+                    <v:shape w14:anchorId="466318DF" id="Ink 50" o:spid="_x0000_s1026" type="#_x0000_t75" style="position:absolute;margin-left:-2.25pt;margin-top:-4.3pt;width:32.25pt;height:10.7pt;z-index:251788288;visibility:visible;mso-wrap-style:square;mso-wrap-distance-left:9pt;mso-wrap-distance-top:0;mso-wrap-distance-right:9pt;mso-wrap-distance-bottom:0;mso-position-horizontal:absolute;mso-position-horizontal-relative:text;mso-position-vertical:absolute;mso-position-vertical-relative:text" o:gfxdata="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">
                       <v:imagedata r:id="rId55" o:title=""/>
                     </v:shape>
                   </w:pict>
@@ -4267,6 +4282,7 @@
               <w:bottom w:val="nil"/>
               <w:right w:val="nil"/>
             </w:tcBorders>
+            <w:shd w:val="clear" w:color="auto" w:fill="auto"/>
             <w:noWrap/>
             <w:vAlign w:val="bottom"/>
             <w:hideMark/>
@@ -4320,7 +4336,7 @@
                 </mc:Choice>
                 <mc:Fallback>
                   <w:pict>
-                    <v:shape w14:anchorId="6BDBF869" id="Ink 25" o:spid="_x0000_s1026" type="#_x0000_t75" style="position:absolute;margin-left:-4.35pt;margin-top:2.75pt;width:11.6pt;height:14.8pt;z-index:251787264;visibility:visible;mso-wrap-style:square;mso-wrap-distance-left:9pt;mso-wrap-distance-top:0;mso-wrap-distance-right:9pt;mso-wrap-distance-bottom:0;mso-position-horizontal:absolute;mso-position-horizontal-relative:text;mso-position-vertical:absolute;mso-position-vertical-relative:text" o:gfxdata="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">
+                    <v:shape w14:anchorId="2516DBCF" id="Ink 25" o:spid="_x0000_s1026" type="#_x0000_t75" style="position:absolute;margin-left:-4.15pt;margin-top:3.3pt;width:10.75pt;height:14.2pt;z-index:251787264;visibility:visible;mso-wrap-style:square;mso-wrap-distance-left:9pt;mso-wrap-distance-top:0;mso-wrap-distance-right:9pt;mso-wrap-distance-bottom:0;mso-position-horizontal:absolute;mso-position-horizontal-relative:text;mso-position-vertical:absolute;mso-position-vertical-relative:text" o:gfxdata="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">
                       <v:imagedata r:id="rId57" o:title=""/>
                     </v:shape>
                   </w:pict>
@@ -4345,6 +4361,7 @@
               <w:bottom w:val="nil"/>
               <w:right w:val="nil"/>
             </w:tcBorders>
+            <w:shd w:val="clear" w:color="auto" w:fill="auto"/>
             <w:noWrap/>
             <w:vAlign w:val="bottom"/>
             <w:hideMark/>
@@ -4376,6 +4393,7 @@
               <w:bottom w:val="nil"/>
               <w:right w:val="nil"/>
             </w:tcBorders>
+            <w:shd w:val="clear" w:color="auto" w:fill="auto"/>
             <w:noWrap/>
             <w:vAlign w:val="bottom"/>
             <w:hideMark/>
@@ -4407,6 +4425,7 @@
               <w:bottom w:val="nil"/>
               <w:right w:val="nil"/>
             </w:tcBorders>
+            <w:shd w:val="clear" w:color="auto" w:fill="auto"/>
             <w:noWrap/>
             <w:vAlign w:val="bottom"/>
             <w:hideMark/>
@@ -4438,6 +4457,7 @@
               <w:bottom w:val="nil"/>
               <w:right w:val="nil"/>
             </w:tcBorders>
+            <w:shd w:val="clear" w:color="auto" w:fill="auto"/>
             <w:noWrap/>
             <w:vAlign w:val="bottom"/>
             <w:hideMark/>
@@ -4469,6 +4489,7 @@
               <w:bottom w:val="nil"/>
               <w:right w:val="nil"/>
             </w:tcBorders>
+            <w:shd w:val="clear" w:color="auto" w:fill="auto"/>
             <w:noWrap/>
             <w:vAlign w:val="bottom"/>
             <w:hideMark/>
@@ -4500,6 +4521,7 @@
               <w:bottom w:val="nil"/>
               <w:right w:val="nil"/>
             </w:tcBorders>
+            <w:shd w:val="clear" w:color="auto" w:fill="auto"/>
             <w:noWrap/>
             <w:vAlign w:val="bottom"/>
             <w:hideMark/>
@@ -4531,6 +4553,7 @@
               <w:bottom w:val="nil"/>
               <w:right w:val="nil"/>
             </w:tcBorders>
+            <w:shd w:val="clear" w:color="auto" w:fill="auto"/>
             <w:noWrap/>
             <w:vAlign w:val="bottom"/>
             <w:hideMark/>
@@ -4562,6 +4585,7 @@
               <w:bottom w:val="nil"/>
               <w:right w:val="nil"/>
             </w:tcBorders>
+            <w:shd w:val="clear" w:color="auto" w:fill="auto"/>
             <w:noWrap/>
             <w:vAlign w:val="bottom"/>
             <w:hideMark/>
@@ -4593,6 +4617,7 @@
               <w:bottom w:val="nil"/>
               <w:right w:val="nil"/>
             </w:tcBorders>
+            <w:shd w:val="clear" w:color="auto" w:fill="auto"/>
             <w:noWrap/>
             <w:vAlign w:val="bottom"/>
             <w:hideMark/>
@@ -4624,6 +4649,7 @@
               <w:bottom w:val="nil"/>
               <w:right w:val="nil"/>
             </w:tcBorders>
+            <w:shd w:val="clear" w:color="auto" w:fill="auto"/>
             <w:noWrap/>
             <w:vAlign w:val="bottom"/>
             <w:hideMark/>
@@ -4693,7 +4719,7 @@
           </mc:Choice>
           <mc:Fallback>
             <w:pict>
-              <v:shape w14:anchorId="0E4053E8" id="Ink 94" o:spid="_x0000_s1026" type="#_x0000_t75" style="position:absolute;margin-left:37.6pt;margin-top:11.65pt;width:18.15pt;height:17.1pt;z-index:251830272;visibility:visible;mso-wrap-style:square;mso-wrap-distance-left:9pt;mso-wrap-distance-top:0;mso-wrap-distance-right:9pt;mso-wrap-distance-bottom:0;mso-position-horizontal:absolute;mso-position-horizontal-relative:text;mso-position-vertical:absolute;mso-position-vertical-relative:text" o:gfxdata="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">
+              <v:shape w14:anchorId="77A28167" id="Ink 94" o:spid="_x0000_s1026" type="#_x0000_t75" style="position:absolute;margin-left:38.05pt;margin-top:12pt;width:17.45pt;height:16.4pt;z-index:251830272;visibility:visible;mso-wrap-style:square;mso-wrap-distance-left:9pt;mso-wrap-distance-top:0;mso-wrap-distance-right:9pt;mso-wrap-distance-bottom:0;mso-position-horizontal:absolute;mso-position-horizontal-relative:text;mso-position-vertical:absolute;mso-position-vertical-relative:text" o:gfxdata="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">
                 <v:imagedata r:id="rId59" o:title=""/>
               </v:shape>
             </w:pict>
@@ -4739,7 +4765,7 @@
           </mc:Choice>
           <mc:Fallback>
             <w:pict>
-              <v:shape w14:anchorId="2E3155C6" id="Ink 93" o:spid="_x0000_s1026" type="#_x0000_t75" style="position:absolute;margin-left:23.15pt;margin-top:17.15pt;width:11.85pt;height:13.25pt;z-index:251829248;visibility:visible;mso-wrap-style:square;mso-wrap-distance-left:9pt;mso-wrap-distance-top:0;mso-wrap-distance-right:9pt;mso-wrap-distance-bottom:0;mso-position-horizontal:absolute;mso-position-horizontal-relative:text;mso-position-vertical:absolute;mso-position-vertical-relative:text" o:gfxdata="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">
+              <v:shape w14:anchorId="79F5E085" id="Ink 93" o:spid="_x0000_s1026" type="#_x0000_t75" style="position:absolute;margin-left:23.85pt;margin-top:17.6pt;width:10.5pt;height:12.2pt;z-index:251829248;visibility:visible;mso-wrap-style:square;mso-wrap-distance-left:9pt;mso-wrap-distance-top:0;mso-wrap-distance-right:9pt;mso-wrap-distance-bottom:0;mso-position-horizontal:absolute;mso-position-horizontal-relative:text;mso-position-vertical:absolute;mso-position-vertical-relative:text" o:gfxdata="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">
                 <v:imagedata r:id="rId61" o:title=""/>
               </v:shape>
             </w:pict>
@@ -4785,7 +4811,7 @@
           </mc:Choice>
           <mc:Fallback>
             <w:pict>
-              <v:shape w14:anchorId="7A388256" id="Ink 92" o:spid="_x0000_s1026" type="#_x0000_t75" style="position:absolute;margin-left:84.45pt;margin-top:.75pt;width:12.4pt;height:16.15pt;z-index:251828224;visibility:visible;mso-wrap-style:square;mso-wrap-distance-left:9pt;mso-wrap-distance-top:0;mso-wrap-distance-right:9pt;mso-wrap-distance-bottom:0;mso-position-horizontal:absolute;mso-position-horizontal-relative:text;mso-position-vertical:absolute;mso-position-vertical-relative:text" o:gfxdata="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">
+              <v:shape w14:anchorId="7E36C94D" id="Ink 92" o:spid="_x0000_s1026" type="#_x0000_t75" style="position:absolute;margin-left:85.05pt;margin-top:1.5pt;width:11.1pt;height:14.8pt;z-index:251828224;visibility:visible;mso-wrap-style:square;mso-wrap-distance-left:9pt;mso-wrap-distance-top:0;mso-wrap-distance-right:9pt;mso-wrap-distance-bottom:0;mso-position-horizontal:absolute;mso-position-horizontal-relative:text;mso-position-vertical:absolute;mso-position-vertical-relative:text" o:gfxdata="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">
                 <v:imagedata r:id="rId63" o:title=""/>
               </v:shape>
             </w:pict>
@@ -4831,7 +4857,7 @@
           </mc:Choice>
           <mc:Fallback>
             <w:pict>
-              <v:shape w14:anchorId="7A4922B6" id="Ink 91" o:spid="_x0000_s1026" type="#_x0000_t75" style="position:absolute;margin-left:83.15pt;margin-top:12.45pt;width:7.6pt;height:16.9pt;z-index:251827200;visibility:visible;mso-wrap-style:square;mso-wrap-distance-left:9pt;mso-wrap-distance-top:0;mso-wrap-distance-right:9pt;mso-wrap-distance-bottom:0;mso-position-horizontal:absolute;mso-position-horizontal-relative:text;mso-position-vertical:absolute;mso-position-vertical-relative:text" o:gfxdata="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">
+              <v:shape w14:anchorId="4FC83939" id="Ink 91" o:spid="_x0000_s1026" type="#_x0000_t75" style="position:absolute;margin-left:83.55pt;margin-top:13.1pt;width:6.9pt;height:15.65pt;z-index:251827200;visibility:visible;mso-wrap-style:square;mso-wrap-distance-left:9pt;mso-wrap-distance-top:0;mso-wrap-distance-right:9pt;mso-wrap-distance-bottom:0;mso-position-horizontal:absolute;mso-position-horizontal-relative:text;mso-position-vertical:absolute;mso-position-vertical-relative:text" o:gfxdata="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">
                 <v:imagedata r:id="rId65" o:title=""/>
               </v:shape>
             </w:pict>
@@ -4877,7 +4903,7 @@
           </mc:Choice>
           <mc:Fallback>
             <w:pict>
-              <v:shape w14:anchorId="568FE98A" id="Ink 90" o:spid="_x0000_s1026" type="#_x0000_t75" style="position:absolute;margin-left:69.3pt;margin-top:13.65pt;width:9.75pt;height:23.35pt;z-index:251826176;visibility:visible;mso-wrap-style:square;mso-wrap-distance-left:9pt;mso-wrap-distance-top:0;mso-wrap-distance-right:9pt;mso-wrap-distance-bottom:0;mso-position-horizontal:absolute;mso-position-horizontal-relative:text;mso-position-vertical:absolute;mso-position-vertical-relative:text" o:gfxdata="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">
+              <v:shape w14:anchorId="62D1C34A" id="Ink 90" o:spid="_x0000_s1026" type="#_x0000_t75" style="position:absolute;margin-left:69.75pt;margin-top:14.1pt;width:9.15pt;height:22.8pt;z-index:251826176;visibility:visible;mso-wrap-style:square;mso-wrap-distance-left:9pt;mso-wrap-distance-top:0;mso-wrap-distance-right:9pt;mso-wrap-distance-bottom:0;mso-position-horizontal:absolute;mso-position-horizontal-relative:text;mso-position-vertical:absolute;mso-position-vertical-relative:text" o:gfxdata="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">
                 <v:imagedata r:id="rId67" o:title=""/>
               </v:shape>
             </w:pict>
@@ -4923,7 +4949,7 @@
           </mc:Choice>
           <mc:Fallback>
             <w:pict>
-              <v:shape w14:anchorId="10898152" id="Ink 89" o:spid="_x0000_s1026" type="#_x0000_t75" style="position:absolute;margin-left:129.3pt;margin-top:11.6pt;width:7pt;height:19.2pt;z-index:251825152;visibility:visible;mso-wrap-style:square;mso-wrap-distance-left:9pt;mso-wrap-distance-top:0;mso-wrap-distance-right:9pt;mso-wrap-distance-bottom:0;mso-position-horizontal:absolute;mso-position-horizontal-relative:text;mso-position-vertical:absolute;mso-position-vertical-relative:text" o:gfxdata="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">
+              <v:shape w14:anchorId="33122325" id="Ink 89" o:spid="_x0000_s1026" type="#_x0000_t75" style="position:absolute;margin-left:129.75pt;margin-top:12.3pt;width:6.55pt;height:18.2pt;z-index:251825152;visibility:visible;mso-wrap-style:square;mso-wrap-distance-left:9pt;mso-wrap-distance-top:0;mso-wrap-distance-right:9pt;mso-wrap-distance-bottom:0;mso-position-horizontal:absolute;mso-position-horizontal-relative:text;mso-position-vertical:absolute;mso-position-vertical-relative:text" o:gfxdata="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">
                 <v:imagedata r:id="rId69" o:title=""/>
               </v:shape>
             </w:pict>
@@ -4969,7 +4995,7 @@
           </mc:Choice>
           <mc:Fallback>
             <w:pict>
-              <v:shape w14:anchorId="2ED75BAC" id="Ink 88" o:spid="_x0000_s1026" type="#_x0000_t75" style="position:absolute;margin-left:114.75pt;margin-top:16.95pt;width:12.35pt;height:20.85pt;z-index:251824128;visibility:visible;mso-wrap-style:square;mso-wrap-distance-left:9pt;mso-wrap-distance-top:0;mso-wrap-distance-right:9pt;mso-wrap-distance-bottom:0;mso-position-horizontal:absolute;mso-position-horizontal-relative:text;mso-position-vertical:absolute;mso-position-vertical-relative:text" o:gfxdata="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">
+              <v:shape w14:anchorId="21352FD4" id="Ink 88" o:spid="_x0000_s1026" type="#_x0000_t75" style="position:absolute;margin-left:115.3pt;margin-top:17.7pt;width:11.1pt;height:19.95pt;z-index:251824128;visibility:visible;mso-wrap-style:square;mso-wrap-distance-left:9pt;mso-wrap-distance-top:0;mso-wrap-distance-right:9pt;mso-wrap-distance-bottom:0;mso-position-horizontal:absolute;mso-position-horizontal-relative:text;mso-position-vertical:absolute;mso-position-vertical-relative:text" o:gfxdata="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">
                 <v:imagedata r:id="rId71" o:title=""/>
               </v:shape>
             </w:pict>
@@ -5015,7 +5041,7 @@
           </mc:Choice>
           <mc:Fallback>
             <w:pict>
-              <v:shape w14:anchorId="4FB5E6CD" id="Ink 87" o:spid="_x0000_s1026" type="#_x0000_t75" style="position:absolute;margin-left:164.55pt;margin-top:16pt;width:25.45pt;height:20.5pt;z-index:251823104;visibility:visible;mso-wrap-style:square;mso-wrap-distance-left:9pt;mso-wrap-distance-top:0;mso-wrap-distance-right:9pt;mso-wrap-distance-bottom:0;mso-position-horizontal:absolute;mso-position-horizontal-relative:text;mso-position-vertical:absolute;mso-position-vertical-relative:text" o:gfxdata="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">
+              <v:shape w14:anchorId="536B198E" id="Ink 87" o:spid="_x0000_s1026" type="#_x0000_t75" style="position:absolute;margin-left:165.15pt;margin-top:16.3pt;width:24.85pt;height:20.1pt;z-index:251823104;visibility:visible;mso-wrap-style:square;mso-wrap-distance-left:9pt;mso-wrap-distance-top:0;mso-wrap-distance-right:9pt;mso-wrap-distance-bottom:0;mso-position-horizontal:absolute;mso-position-horizontal-relative:text;mso-position-vertical:absolute;mso-position-vertical-relative:text" o:gfxdata="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">
                 <v:imagedata r:id="rId73" o:title=""/>
               </v:shape>
             </w:pict>
@@ -5061,7 +5087,7 @@
           </mc:Choice>
           <mc:Fallback>
             <w:pict>
-              <v:shape w14:anchorId="7701F24F" id="Ink 86" o:spid="_x0000_s1026" type="#_x0000_t75" style="position:absolute;margin-left:221.35pt;margin-top:13.15pt;width:16.8pt;height:16.15pt;z-index:251822080;visibility:visible;mso-wrap-style:square;mso-wrap-distance-left:9pt;mso-wrap-distance-top:0;mso-wrap-distance-right:9pt;mso-wrap-distance-bottom:0;mso-position-horizontal:absolute;mso-position-horizontal-relative:text;mso-position-vertical:absolute;mso-position-vertical-relative:text" o:gfxdata="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">
+              <v:shape w14:anchorId="263207F9" id="Ink 86" o:spid="_x0000_s1026" type="#_x0000_t75" style="position:absolute;margin-left:222.05pt;margin-top:13.85pt;width:16.1pt;height:15.4pt;z-index:251822080;visibility:visible;mso-wrap-style:square;mso-wrap-distance-left:9pt;mso-wrap-distance-top:0;mso-wrap-distance-right:9pt;mso-wrap-distance-bottom:0;mso-position-horizontal:absolute;mso-position-horizontal-relative:text;mso-position-vertical:absolute;mso-position-vertical-relative:text" o:gfxdata="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">
                 <v:imagedata r:id="rId75" o:title=""/>
               </v:shape>
             </w:pict>
@@ -5107,7 +5133,7 @@
           </mc:Choice>
           <mc:Fallback>
             <w:pict>
-              <v:shape w14:anchorId="2C4273AE" id="Ink 85" o:spid="_x0000_s1026" type="#_x0000_t75" style="position:absolute;margin-left:215.8pt;margin-top:17.75pt;width:8.3pt;height:14.65pt;z-index:251821056;visibility:visible;mso-wrap-style:square;mso-wrap-distance-left:9pt;mso-wrap-distance-top:0;mso-wrap-distance-right:9pt;mso-wrap-distance-bottom:0;mso-position-horizontal:absolute;mso-position-horizontal-relative:text;mso-position-vertical:absolute;mso-position-vertical-relative:text" o:gfxdata="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">
+              <v:shape w14:anchorId="555866A6" id="Ink 85" o:spid="_x0000_s1026" type="#_x0000_t75" style="position:absolute;margin-left:216.4pt;margin-top:18.5pt;width:7.5pt;height:13.65pt;z-index:251821056;visibility:visible;mso-wrap-style:square;mso-wrap-distance-left:9pt;mso-wrap-distance-top:0;mso-wrap-distance-right:9pt;mso-wrap-distance-bottom:0;mso-position-horizontal:absolute;mso-position-horizontal-relative:text;mso-position-vertical:absolute;mso-position-vertical-relative:text" o:gfxdata="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">
                 <v:imagedata r:id="rId77" o:title=""/>
               </v:shape>
             </w:pict>
@@ -5153,7 +5179,7 @@
           </mc:Choice>
           <mc:Fallback>
             <w:pict>
-              <v:shape w14:anchorId="4537E4BB" id="Ink 84" o:spid="_x0000_s1026" type="#_x0000_t75" style="position:absolute;margin-left:276.5pt;margin-top:6.65pt;width:9.85pt;height:9.65pt;z-index:251820032;visibility:visible;mso-wrap-style:square;mso-wrap-distance-left:9pt;mso-wrap-distance-top:0;mso-wrap-distance-right:9pt;mso-wrap-distance-bottom:0;mso-position-horizontal:absolute;mso-position-horizontal-relative:text;mso-position-vertical:absolute;mso-position-vertical-relative:text" o:gfxdata="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">
+              <v:shape w14:anchorId="741A69AE" id="Ink 84" o:spid="_x0000_s1026" type="#_x0000_t75" style="position:absolute;margin-left:277.2pt;margin-top:7.45pt;width:8.4pt;height:8.2pt;z-index:251820032;visibility:visible;mso-wrap-style:square;mso-wrap-distance-left:9pt;mso-wrap-distance-top:0;mso-wrap-distance-right:9pt;mso-wrap-distance-bottom:0;mso-position-horizontal:absolute;mso-position-horizontal-relative:text;mso-position-vertical:absolute;mso-position-vertical-relative:text" o:gfxdata="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">
                 <v:imagedata r:id="rId79" o:title=""/>
               </v:shape>
             </w:pict>
@@ -5199,7 +5225,7 @@
           </mc:Choice>
           <mc:Fallback>
             <w:pict>
-              <v:shape w14:anchorId="05C1F164" id="Ink 80" o:spid="_x0000_s1026" type="#_x0000_t75" style="position:absolute;margin-left:274.2pt;margin-top:14.05pt;width:9.4pt;height:14.5pt;z-index:251819008;visibility:visible;mso-wrap-style:square;mso-wrap-distance-left:9pt;mso-wrap-distance-top:0;mso-wrap-distance-right:9pt;mso-wrap-distance-bottom:0;mso-position-horizontal:absolute;mso-position-horizontal-relative:text;mso-position-vertical:absolute;mso-position-vertical-relative:text" o:gfxdata="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">
+              <v:shape w14:anchorId="111C7C26" id="Ink 80" o:spid="_x0000_s1026" type="#_x0000_t75" style="position:absolute;margin-left:274.65pt;margin-top:14.6pt;width:8.8pt;height:13.7pt;z-index:251819008;visibility:visible;mso-wrap-style:square;mso-wrap-distance-left:9pt;mso-wrap-distance-top:0;mso-wrap-distance-right:9pt;mso-wrap-distance-bottom:0;mso-position-horizontal:absolute;mso-position-horizontal-relative:text;mso-position-vertical:absolute;mso-position-vertical-relative:text" o:gfxdata="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">
                 <v:imagedata r:id="rId81" o:title=""/>
               </v:shape>
             </w:pict>
@@ -5245,7 +5271,7 @@
           </mc:Choice>
           <mc:Fallback>
             <w:pict>
-              <v:shape w14:anchorId="5D1BB7D9" id="Ink 79" o:spid="_x0000_s1026" type="#_x0000_t75" style="position:absolute;margin-left:266.6pt;margin-top:21.25pt;width:4.4pt;height:10.5pt;z-index:251817984;visibility:visible;mso-wrap-style:square;mso-wrap-distance-left:9pt;mso-wrap-distance-top:0;mso-wrap-distance-right:9pt;mso-wrap-distance-bottom:0;mso-position-horizontal:absolute;mso-position-horizontal-relative:text;mso-position-vertical:absolute;mso-position-vertical-relative:text" o:gfxdata="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">
+              <v:shape w14:anchorId="17A8CD24" id="Ink 79" o:spid="_x0000_s1026" type="#_x0000_t75" style="position:absolute;margin-left:266.9pt;margin-top:21.9pt;width:3.6pt;height:9.6pt;z-index:251817984;visibility:visible;mso-wrap-style:square;mso-wrap-distance-left:9pt;mso-wrap-distance-top:0;mso-wrap-distance-right:9pt;mso-wrap-distance-bottom:0;mso-position-horizontal:absolute;mso-position-horizontal-relative:text;mso-position-vertical:absolute;mso-position-vertical-relative:text" o:gfxdata="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">
                 <v:imagedata r:id="rId83" o:title=""/>
               </v:shape>
             </w:pict>
@@ -5291,7 +5317,7 @@
           </mc:Choice>
           <mc:Fallback>
             <w:pict>
-              <v:shape w14:anchorId="6ADFDD07" id="Ink 78" o:spid="_x0000_s1026" type="#_x0000_t75" style="position:absolute;margin-left:260.7pt;margin-top:12.25pt;width:10.85pt;height:17.45pt;z-index:251816960;visibility:visible;mso-wrap-style:square;mso-wrap-distance-left:9pt;mso-wrap-distance-top:0;mso-wrap-distance-right:9pt;mso-wrap-distance-bottom:0;mso-position-horizontal:absolute;mso-position-horizontal-relative:text;mso-position-vertical:absolute;mso-position-vertical-relative:text" o:gfxdata="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">
+              <v:shape w14:anchorId="412D7A22" id="Ink 78" o:spid="_x0000_s1026" type="#_x0000_t75" style="position:absolute;margin-left:261.1pt;margin-top:12.95pt;width:9.75pt;height:16.5pt;z-index:251816960;visibility:visible;mso-wrap-style:square;mso-wrap-distance-left:9pt;mso-wrap-distance-top:0;mso-wrap-distance-right:9pt;mso-wrap-distance-bottom:0;mso-position-horizontal:absolute;mso-position-horizontal-relative:text;mso-position-vertical:absolute;mso-position-vertical-relative:text" o:gfxdata="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">
                 <v:imagedata r:id="rId85" o:title=""/>
               </v:shape>
             </w:pict>
@@ -5337,7 +5363,7 @@
           </mc:Choice>
           <mc:Fallback>
             <w:pict>
-              <v:shape w14:anchorId="325C5660" id="Ink 77" o:spid="_x0000_s1026" type="#_x0000_t75" style="position:absolute;margin-left:321.45pt;margin-top:11.35pt;width:8.85pt;height:15.55pt;z-index:251815936;visibility:visible;mso-wrap-style:square;mso-wrap-distance-left:9pt;mso-wrap-distance-top:0;mso-wrap-distance-right:9pt;mso-wrap-distance-bottom:0;mso-position-horizontal:absolute;mso-position-horizontal-relative:text;mso-position-vertical:absolute;mso-position-vertical-relative:text" o:gfxdata="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">
+              <v:shape w14:anchorId="219167D3" id="Ink 77" o:spid="_x0000_s1026" type="#_x0000_t75" style="position:absolute;margin-left:322.15pt;margin-top:12.05pt;width:8.05pt;height:14.55pt;z-index:251815936;visibility:visible;mso-wrap-style:square;mso-wrap-distance-left:9pt;mso-wrap-distance-top:0;mso-wrap-distance-right:9pt;mso-wrap-distance-bottom:0;mso-position-horizontal:absolute;mso-position-horizontal-relative:text;mso-position-vertical:absolute;mso-position-vertical-relative:text" o:gfxdata="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">
                 <v:imagedata r:id="rId87" o:title=""/>
               </v:shape>
             </w:pict>
@@ -5383,7 +5409,7 @@
           </mc:Choice>
           <mc:Fallback>
             <w:pict>
-              <v:shape w14:anchorId="03D39837" id="Ink 76" o:spid="_x0000_s1026" type="#_x0000_t75" style="position:absolute;margin-left:316.65pt;margin-top:18.15pt;width:5.45pt;height:10.35pt;z-index:251814912;visibility:visible;mso-wrap-style:square;mso-wrap-distance-left:9pt;mso-wrap-distance-top:0;mso-wrap-distance-right:9pt;mso-wrap-distance-bottom:0;mso-position-horizontal:absolute;mso-position-horizontal-relative:text;mso-position-vertical:absolute;mso-position-vertical-relative:text" o:gfxdata="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">
+              <v:shape w14:anchorId="00B29412" id="Ink 76" o:spid="_x0000_s1026" type="#_x0000_t75" style="position:absolute;margin-left:317.25pt;margin-top:18.8pt;width:4.15pt;height:9.25pt;z-index:251814912;visibility:visible;mso-wrap-style:square;mso-wrap-distance-left:9pt;mso-wrap-distance-top:0;mso-wrap-distance-right:9pt;mso-wrap-distance-bottom:0;mso-position-horizontal:absolute;mso-position-horizontal-relative:text;mso-position-vertical:absolute;mso-position-vertical-relative:text" o:gfxdata="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">
                 <v:imagedata r:id="rId89" o:title=""/>
               </v:shape>
             </w:pict>
@@ -5429,7 +5455,7 @@
           </mc:Choice>
           <mc:Fallback>
             <w:pict>
-              <v:shape w14:anchorId="157C8333" id="Ink 75" o:spid="_x0000_s1026" type="#_x0000_t75" style="position:absolute;margin-left:309.8pt;margin-top:11.4pt;width:7.95pt;height:15.55pt;z-index:251813888;visibility:visible;mso-wrap-style:square;mso-wrap-distance-left:9pt;mso-wrap-distance-top:0;mso-wrap-distance-right:9pt;mso-wrap-distance-bottom:0;mso-position-horizontal:absolute;mso-position-horizontal-relative:text;mso-position-vertical:absolute;mso-position-vertical-relative:text" o:gfxdata="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">
+              <v:shape w14:anchorId="68A9DCEB" id="Ink 75" o:spid="_x0000_s1026" type="#_x0000_t75" style="position:absolute;margin-left:310.05pt;margin-top:12.05pt;width:7.05pt;height:14.8pt;z-index:251813888;visibility:visible;mso-wrap-style:square;mso-wrap-distance-left:9pt;mso-wrap-distance-top:0;mso-wrap-distance-right:9pt;mso-wrap-distance-bottom:0;mso-position-horizontal:absolute;mso-position-horizontal-relative:text;mso-position-vertical:absolute;mso-position-vertical-relative:text" o:gfxdata="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">
                 <v:imagedata r:id="rId91" o:title=""/>
               </v:shape>
             </w:pict>
@@ -5475,7 +5501,7 @@
           </mc:Choice>
           <mc:Fallback>
             <w:pict>
-              <v:shape w14:anchorId="51F53DC5" id="Ink 74" o:spid="_x0000_s1026" type="#_x0000_t75" style="position:absolute;margin-left:372.4pt;margin-top:8.2pt;width:8.85pt;height:18.4pt;z-index:251812864;visibility:visible;mso-wrap-style:square;mso-wrap-distance-left:9pt;mso-wrap-distance-top:0;mso-wrap-distance-right:9pt;mso-wrap-distance-bottom:0;mso-position-horizontal:absolute;mso-position-horizontal-relative:text;mso-position-vertical:absolute;mso-position-vertical-relative:text" o:gfxdata="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">
+              <v:shape w14:anchorId="19E9B88B" id="Ink 74" o:spid="_x0000_s1026" type="#_x0000_t75" style="position:absolute;margin-left:372.75pt;margin-top:8.55pt;width:8.5pt;height:17.9pt;z-index:251812864;visibility:visible;mso-wrap-style:square;mso-wrap-distance-left:9pt;mso-wrap-distance-top:0;mso-wrap-distance-right:9pt;mso-wrap-distance-bottom:0;mso-position-horizontal:absolute;mso-position-horizontal-relative:text;mso-position-vertical:absolute;mso-position-vertical-relative:text" o:gfxdata="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">
                 <v:imagedata r:id="rId93" o:title=""/>
               </v:shape>
             </w:pict>
@@ -5521,7 +5547,7 @@
           </mc:Choice>
           <mc:Fallback>
             <w:pict>
-              <v:shape w14:anchorId="255E4410" id="Ink 73" o:spid="_x0000_s1026" type="#_x0000_t75" style="position:absolute;margin-left:357.75pt;margin-top:11.05pt;width:7.7pt;height:18.9pt;z-index:251811840;visibility:visible;mso-wrap-style:square;mso-wrap-distance-left:9pt;mso-wrap-distance-top:0;mso-wrap-distance-right:9pt;mso-wrap-distance-bottom:0;mso-position-horizontal:absolute;mso-position-horizontal-relative:text;mso-position-vertical:absolute;mso-position-vertical-relative:text" o:gfxdata="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">
+              <v:shape w14:anchorId="10054322" id="Ink 73" o:spid="_x0000_s1026" type="#_x0000_t75" style="position:absolute;margin-left:358.05pt;margin-top:11.4pt;width:7.3pt;height:18.45pt;z-index:251811840;visibility:visible;mso-wrap-style:square;mso-wrap-distance-left:9pt;mso-wrap-distance-top:0;mso-wrap-distance-right:9pt;mso-wrap-distance-bottom:0;mso-position-horizontal:absolute;mso-position-horizontal-relative:text;mso-position-vertical:absolute;mso-position-vertical-relative:text" o:gfxdata="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">
                 <v:imagedata r:id="rId95" o:title=""/>
               </v:shape>
             </w:pict>
@@ -5567,7 +5593,7 @@
           </mc:Choice>
           <mc:Fallback>
             <w:pict>
-              <v:shape w14:anchorId="62DA5D94" id="Ink 72" o:spid="_x0000_s1026" type="#_x0000_t75" style="position:absolute;margin-left:420.5pt;margin-top:10.45pt;width:6.05pt;height:15.25pt;z-index:251810816;visibility:visible;mso-wrap-style:square;mso-wrap-distance-left:9pt;mso-wrap-distance-top:0;mso-wrap-distance-right:9pt;mso-wrap-distance-bottom:0;mso-position-horizontal:absolute;mso-position-horizontal-relative:text;mso-position-vertical:absolute;mso-position-vertical-relative:text" o:gfxdata="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">
+              <v:shape w14:anchorId="21C9C31E" id="Ink 72" o:spid="_x0000_s1026" type="#_x0000_t75" style="position:absolute;margin-left:420.85pt;margin-top:11.15pt;width:5.6pt;height:14.3pt;z-index:251810816;visibility:visible;mso-wrap-style:square;mso-wrap-distance-left:9pt;mso-wrap-distance-top:0;mso-wrap-distance-right:9pt;mso-wrap-distance-bottom:0;mso-position-horizontal:absolute;mso-position-horizontal-relative:text;mso-position-vertical:absolute;mso-position-vertical-relative:text" o:gfxdata="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">
                 <v:imagedata r:id="rId97" o:title=""/>
               </v:shape>
             </w:pict>
@@ -5613,7 +5639,7 @@
           </mc:Choice>
           <mc:Fallback>
             <w:pict>
-              <v:shape w14:anchorId="3C833C76" id="Ink 71" o:spid="_x0000_s1026" type="#_x0000_t75" style="position:absolute;margin-left:407.25pt;margin-top:11.55pt;width:11.25pt;height:15.55pt;z-index:251809792;visibility:visible;mso-wrap-style:square;mso-wrap-distance-left:9pt;mso-wrap-distance-top:0;mso-wrap-distance-right:9pt;mso-wrap-distance-bottom:0;mso-position-horizontal:absolute;mso-position-horizontal-relative:text;mso-position-vertical:absolute;mso-position-vertical-relative:text" o:gfxdata="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">
+              <v:shape w14:anchorId="153B3498" id="Ink 71" o:spid="_x0000_s1026" type="#_x0000_t75" style="position:absolute;margin-left:407.9pt;margin-top:11.8pt;width:9.9pt;height:15.2pt;z-index:251809792;visibility:visible;mso-wrap-style:square;mso-wrap-distance-left:9pt;mso-wrap-distance-top:0;mso-wrap-distance-right:9pt;mso-wrap-distance-bottom:0;mso-position-horizontal:absolute;mso-position-horizontal-relative:text;mso-position-vertical:absolute;mso-position-vertical-relative:text" o:gfxdata="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">
                 <v:imagedata r:id="rId99" o:title=""/>
               </v:shape>
             </w:pict>
@@ -5659,7 +5685,7 @@
           </mc:Choice>
           <mc:Fallback>
             <w:pict>
-              <v:shape w14:anchorId="5806D7B5" id="Ink 70" o:spid="_x0000_s1026" type="#_x0000_t75" style="position:absolute;margin-left:467.35pt;margin-top:7.4pt;width:17.85pt;height:20.95pt;z-index:251808768;visibility:visible;mso-wrap-style:square;mso-wrap-distance-left:9pt;mso-wrap-distance-top:0;mso-wrap-distance-right:9pt;mso-wrap-distance-bottom:0;mso-position-horizontal:absolute;mso-position-horizontal-relative:text;mso-position-vertical:absolute;mso-position-vertical-relative:text" o:gfxdata="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">
+              <v:shape w14:anchorId="2EFF3220" id="Ink 70" o:spid="_x0000_s1026" type="#_x0000_t75" style="position:absolute;margin-left:468pt;margin-top:7.7pt;width:17.1pt;height:20.55pt;z-index:251808768;visibility:visible;mso-wrap-style:square;mso-wrap-distance-left:9pt;mso-wrap-distance-top:0;mso-wrap-distance-right:9pt;mso-wrap-distance-bottom:0;mso-position-horizontal:absolute;mso-position-horizontal-relative:text;mso-position-vertical:absolute;mso-position-vertical-relative:text" o:gfxdata="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">
                 <v:imagedata r:id="rId101" o:title=""/>
               </v:shape>
             </w:pict>
@@ -5705,7 +5731,7 @@
           </mc:Choice>
           <mc:Fallback>
             <w:pict>
-              <v:shape w14:anchorId="30AEDF10" id="Ink 69" o:spid="_x0000_s1026" type="#_x0000_t75" style="position:absolute;margin-left:466.65pt;margin-top:13.25pt;width:8.4pt;height:13.35pt;z-index:251807744;visibility:visible;mso-wrap-style:square;mso-wrap-distance-left:9pt;mso-wrap-distance-top:0;mso-wrap-distance-right:9pt;mso-wrap-distance-bottom:0;mso-position-horizontal:absolute;mso-position-horizontal-relative:text;mso-position-vertical:absolute;mso-position-vertical-relative:text" o:gfxdata="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">
+              <v:shape w14:anchorId="44A7B771" id="Ink 69" o:spid="_x0000_s1026" type="#_x0000_t75" style="position:absolute;margin-left:466.9pt;margin-top:13.9pt;width:8pt;height:12.55pt;z-index:251807744;visibility:visible;mso-wrap-style:square;mso-wrap-distance-left:9pt;mso-wrap-distance-top:0;mso-wrap-distance-right:9pt;mso-wrap-distance-bottom:0;mso-position-horizontal:absolute;mso-position-horizontal-relative:text;mso-position-vertical:absolute;mso-position-vertical-relative:text" o:gfxdata="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">
                 <v:imagedata r:id="rId103" o:title=""/>
               </v:shape>
             </w:pict>
@@ -5751,7 +5777,7 @@
           </mc:Choice>
           <mc:Fallback>
             <w:pict>
-              <v:shape w14:anchorId="6DCD1D83" id="Ink 68" o:spid="_x0000_s1026" type="#_x0000_t75" style="position:absolute;margin-left:457.55pt;margin-top:12.4pt;width:10.55pt;height:13pt;z-index:251806720;visibility:visible;mso-wrap-style:square;mso-wrap-distance-left:9pt;mso-wrap-distance-top:0;mso-wrap-distance-right:9pt;mso-wrap-distance-bottom:0;mso-position-horizontal:absolute;mso-position-horizontal-relative:text;mso-position-vertical:absolute;mso-position-vertical-relative:text" o:gfxdata="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">
+              <v:shape w14:anchorId="6073A908" id="Ink 68" o:spid="_x0000_s1026" type="#_x0000_t75" style="position:absolute;margin-left:457.95pt;margin-top:12.65pt;width:9.45pt;height:12.65pt;z-index:251806720;visibility:visible;mso-wrap-style:square;mso-wrap-distance-left:9pt;mso-wrap-distance-top:0;mso-wrap-distance-right:9pt;mso-wrap-distance-bottom:0;mso-position-horizontal:absolute;mso-position-horizontal-relative:text;mso-position-vertical:absolute;mso-position-vertical-relative:text" o:gfxdata="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">
                 <v:imagedata r:id="rId105" o:title=""/>
               </v:shape>
             </w:pict>
@@ -5797,7 +5823,7 @@
           </mc:Choice>
           <mc:Fallback>
             <w:pict>
-              <v:shape w14:anchorId="3CFE3C9F" id="Ink 67" o:spid="_x0000_s1026" type="#_x0000_t75" style="position:absolute;margin-left:528pt;margin-top:4.55pt;width:10.1pt;height:22.7pt;z-index:251805696;visibility:visible;mso-wrap-style:square;mso-wrap-distance-left:9pt;mso-wrap-distance-top:0;mso-wrap-distance-right:9pt;mso-wrap-distance-bottom:0;mso-position-horizontal:absolute;mso-position-horizontal-relative:text;mso-position-vertical:absolute;mso-position-vertical-relative:text" o:gfxdata="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">
+              <v:shape w14:anchorId="7C6AE101" id="Ink 67" o:spid="_x0000_s1026" type="#_x0000_t75" style="position:absolute;margin-left:528.2pt;margin-top:4.95pt;width:9.85pt;height:22.2pt;z-index:251805696;visibility:visible;mso-wrap-style:square;mso-wrap-distance-left:9pt;mso-wrap-distance-top:0;mso-wrap-distance-right:9pt;mso-wrap-distance-bottom:0;mso-position-horizontal:absolute;mso-position-horizontal-relative:text;mso-position-vertical:absolute;mso-position-vertical-relative:text" o:gfxdata="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">
                 <v:imagedata r:id="rId107" o:title=""/>
               </v:shape>
             </w:pict>
@@ -5843,7 +5869,7 @@
           </mc:Choice>
           <mc:Fallback>
             <w:pict>
-              <v:shape w14:anchorId="0A11FA77" id="Ink 66" o:spid="_x0000_s1026" type="#_x0000_t75" style="position:absolute;margin-left:518.35pt;margin-top:9.35pt;width:7.35pt;height:12.2pt;z-index:251804672;visibility:visible;mso-wrap-style:square;mso-wrap-distance-left:9pt;mso-wrap-distance-top:0;mso-wrap-distance-right:9pt;mso-wrap-distance-bottom:0;mso-position-horizontal:absolute;mso-position-horizontal-relative:text;mso-position-vertical:absolute;mso-position-vertical-relative:text" o:gfxdata="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">
+              <v:shape w14:anchorId="143E1874" id="Ink 66" o:spid="_x0000_s1026" type="#_x0000_t75" style="position:absolute;margin-left:518.5pt;margin-top:10pt;width:7.2pt;height:11.5pt;z-index:251804672;visibility:visible;mso-wrap-style:square;mso-wrap-distance-left:9pt;mso-wrap-distance-top:0;mso-wrap-distance-right:9pt;mso-wrap-distance-bottom:0;mso-position-horizontal:absolute;mso-position-horizontal-relative:text;mso-position-vertical:absolute;mso-position-vertical-relative:text" o:gfxdata="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">
                 <v:imagedata r:id="rId109" o:title=""/>
               </v:shape>
             </w:pict>
@@ -5889,7 +5915,7 @@
           </mc:Choice>
           <mc:Fallback>
             <w:pict>
-              <v:shape w14:anchorId="695C5D87" id="Ink 65" o:spid="_x0000_s1026" type="#_x0000_t75" style="position:absolute;margin-left:507.45pt;margin-top:9.9pt;width:9.1pt;height:12.8pt;z-index:251803648;visibility:visible;mso-wrap-style:square;mso-wrap-distance-left:9pt;mso-wrap-distance-top:0;mso-wrap-distance-right:9pt;mso-wrap-distance-bottom:0;mso-position-horizontal:absolute;mso-position-horizontal-relative:text;mso-position-vertical:absolute;mso-position-vertical-relative:text" o:gfxdata="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">
+              <v:shape w14:anchorId="09E2A668" id="Ink 65" o:spid="_x0000_s1026" type="#_x0000_t75" style="position:absolute;margin-left:507.75pt;margin-top:10pt;width:8.15pt;height:12.8pt;z-index:251803648;visibility:visible;mso-wrap-style:square;mso-wrap-distance-left:9pt;mso-wrap-distance-top:0;mso-wrap-distance-right:9pt;mso-wrap-distance-bottom:0;mso-position-horizontal:absolute;mso-position-horizontal-relative:text;mso-position-vertical:absolute;mso-position-vertical-relative:text" o:gfxdata="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">
                 <v:imagedata r:id="rId111" o:title=""/>
               </v:shape>
             </w:pict>
@@ -6029,16 +6055,9 @@
           <w:sz w:val="44"/>
         </w:rPr>
       </w:pPr>
-    </w:p>
-    <w:p>
-      <w:pPr>
-        <w:rPr>
-          <w:sz w:val="44"/>
-        </w:rPr>
-      </w:pPr>
-      <w:bookmarkStart w:id="1" w:name="_Hlk237110993"/>
-    </w:p>
-    <w:bookmarkEnd w:id="1"/>
+      <w:bookmarkStart w:id="0" w:name="_Hlk237110993"/>
+    </w:p>
+    <w:bookmarkEnd w:id="0"/>
     <w:p>
       <w:pPr>
         <w:rPr>
@@ -6107,7 +6126,13 @@
         <w:rPr>
           <w:sz w:val="44"/>
         </w:rPr>
-        <w:t xml:space="preserve">Điều khiển tự động bật đèn khi trời tối dùng quang trở (quạt quay khi nhiệt độ cao), ngõ ra ON/OFF. </w:t>
+        <w:t>Điều khiển tự động bật đèn khi trời tối dùng quang trở (quạt quay khi nhiệt độ</w:t>
+      </w:r>
+      <w:r>
+        <w:rPr>
+          <w:sz w:val="44"/>
+        </w:rPr>
+        <w:t xml:space="preserve"> cao), ngõ ra ON/OFF chan 6 (LEDa)</w:t>
       </w:r>
     </w:p>
     <w:p>
@@ -6126,7 +6151,13 @@
         <w:rPr>
           <w:sz w:val="44"/>
         </w:rPr>
-        <w:t>ng LED7 sáng đoạn g</w:t>
+        <w:t>ng LED7 sáng đoạ</w:t>
+      </w:r>
+      <w:r>
+        <w:rPr>
+          <w:sz w:val="44"/>
+        </w:rPr>
+        <w:t>n a</w:t>
       </w:r>
       <w:r>
         <w:rPr>
@@ -6377,7 +6408,13 @@
         <w:rPr>
           <w:sz w:val="44"/>
         </w:rPr>
-        <w:t xml:space="preserve"> g </w:t>
+        <w:t xml:space="preserve"> a</w:t>
+      </w:r>
+      <w:r>
+        <w:rPr>
+          <w:sz w:val="44"/>
+        </w:rPr>
+        <w:t xml:space="preserve"> </w:t>
       </w:r>
       <w:r>
         <w:rPr>
@@ -6454,7 +6491,13 @@
         <w:rPr>
           <w:sz w:val="44"/>
         </w:rPr>
-        <w:t xml:space="preserve"> sáng): LED g sáng</w:t>
+        <w:t xml:space="preserve"> sáng): LED a</w:t>
+      </w:r>
+      <w:r>
+        <w:rPr>
+          <w:sz w:val="44"/>
+        </w:rPr>
+        <w:t xml:space="preserve"> sáng</w:t>
       </w:r>
     </w:p>
     <w:p>
@@ -6526,7 +6569,13 @@
         <w:rPr>
           <w:sz w:val="44"/>
         </w:rPr>
-        <w:t>g sáng/</w:t>
+        <w:t>a</w:t>
+      </w:r>
+      <w:r>
+        <w:rPr>
+          <w:sz w:val="44"/>
+        </w:rPr>
+        <w:t xml:space="preserve"> sáng/</w:t>
       </w:r>
       <w:r>
         <w:rPr>
@@ -6654,7 +6703,7 @@
         <w:rPr>
           <w:sz w:val="44"/>
         </w:rPr>
-        <w:t>14h30 N5</w:t>
+        <w:t>15h38 B3c</w:t>
       </w:r>
     </w:p>
     <w:p>
@@ -6695,6 +6744,7 @@
         </w:rPr>
         <w:t>_inputXUNG</w:t>
       </w:r>
+      <w:proofErr w:type="gramStart"/>
       <w:r>
         <w:rPr>
           <w:sz w:val="44"/>
@@ -6711,34 +6761,41 @@
         <w:rPr>
           <w:sz w:val="44"/>
         </w:rPr>
+        <w:t>(</w:t>
+      </w:r>
+      <w:proofErr w:type="gramEnd"/>
+      <w:r>
+        <w:rPr>
+          <w:sz w:val="44"/>
+        </w:rPr>
+        <w:t>cam bien luu luong)</w:t>
+      </w:r>
+    </w:p>
+    <w:p>
+      <w:pPr>
+        <w:rPr>
+          <w:sz w:val="44"/>
+        </w:rPr>
+      </w:pPr>
+      <w:r>
+        <w:rPr>
+          <w:sz w:val="44"/>
+        </w:rPr>
+        <w:t xml:space="preserve">Đo tín hiệu xung: demXUNG++ khi có cạnh xuống. </w:t>
+      </w:r>
+    </w:p>
+    <w:p>
+      <w:pPr>
+        <w:rPr>
+          <w:sz w:val="44"/>
+        </w:rPr>
+      </w:pPr>
+      <w:r>
+        <w:rPr>
+          <w:sz w:val="44"/>
+        </w:rPr>
         <w:t>(cam bien luu luong)</w:t>
       </w:r>
-    </w:p>
-    <w:p>
-      <w:pPr>
-        <w:rPr>
-          <w:sz w:val="44"/>
-        </w:rPr>
-      </w:pPr>
-      <w:r>
-        <w:rPr>
-          <w:sz w:val="44"/>
-        </w:rPr>
-        <w:t xml:space="preserve">Đo tín hiệu xung: demXUNG++ khi có cạnh xuống. </w:t>
-      </w:r>
-    </w:p>
-    <w:p>
-      <w:pPr>
-        <w:rPr>
-          <w:sz w:val="44"/>
-        </w:rPr>
-      </w:pPr>
-      <w:r>
-        <w:rPr>
-          <w:sz w:val="44"/>
-        </w:rPr>
-        <w:t>(cam bien luu luong)</w:t>
-      </w:r>
       <w:r>
         <w:rPr>
           <w:sz w:val="44"/>
@@ -6858,7 +6915,21 @@
         <w:rPr>
           <w:sz w:val="44"/>
         </w:rPr>
-        <w:t xml:space="preserve">  pinMode(3,INPUT_PULLUP);</w:t>
+        <w:t xml:space="preserve">  pinMode(</w:t>
+      </w:r>
+      <w:proofErr w:type="gramStart"/>
+      <w:r>
+        <w:rPr>
+          <w:sz w:val="44"/>
+        </w:rPr>
+        <w:t>3,INPUT</w:t>
+      </w:r>
+      <w:proofErr w:type="gramEnd"/>
+      <w:r>
+        <w:rPr>
+          <w:sz w:val="44"/>
+        </w:rPr>
+        <w:t>_PULLUP);</w:t>
       </w:r>
     </w:p>
     <w:p>
@@ -6872,7 +6943,21 @@
         <w:rPr>
           <w:sz w:val="44"/>
         </w:rPr>
-        <w:t xml:space="preserve">  attachInterrupt(1, ngatngoai1, FALLING);</w:t>
+        <w:t xml:space="preserve">  </w:t>
+      </w:r>
+      <w:proofErr w:type="gramStart"/>
+      <w:r>
+        <w:rPr>
+          <w:sz w:val="44"/>
+        </w:rPr>
+        <w:t>attachInterrupt(</w:t>
+      </w:r>
+      <w:proofErr w:type="gramEnd"/>
+      <w:r>
+        <w:rPr>
+          <w:sz w:val="44"/>
+        </w:rPr>
+        <w:t>1, ngatngoai1, FALLING);</w:t>
       </w:r>
     </w:p>
     <w:p>
@@ -6916,6 +7001,7 @@
         </w:rPr>
         <w:t>(</w:t>
       </w:r>
+      <w:proofErr w:type="gramStart"/>
       <w:r>
         <w:rPr>
           <w:rFonts w:ascii="Consolas" w:eastAsia="Times New Roman" w:hAnsi="Consolas" w:cs="Consolas"/>
@@ -6934,6 +7020,7 @@
         </w:rPr>
         <w:t>(</w:t>
       </w:r>
+      <w:proofErr w:type="gramEnd"/>
       <w:r>
         <w:rPr>
           <w:rFonts w:ascii="Consolas" w:eastAsia="Times New Roman" w:hAnsi="Consolas" w:cs="Consolas"/>
@@ -7038,7 +7125,6 @@
           <w:noProof/>
           <w:sz w:val="28"/>
           <w:szCs w:val="28"/>
-          <w:lang w:val="vi-VN"/>
         </w:rPr>
         <w:drawing>
           <wp:inline distT="0" distB="0" distL="0" distR="0" wp14:anchorId="51CA7521" wp14:editId="5EFC585D">
@@ -7112,7 +7198,7 @@
           <w:sz w:val="44"/>
         </w:rPr>
         <w:lastRenderedPageBreak/>
-        <w:t>15h55 N5</w:t>
+        <w:t>07h40 B5s</w:t>
       </w:r>
     </w:p>
     <w:p>
@@ -7321,7 +7407,19 @@
         <w:rPr>
           <w:sz w:val="44"/>
         </w:rPr>
-        <w:t>chan 5: Lg)</w:t>
+        <w:t>chan 5: L</w:t>
+      </w:r>
+      <w:r>
+        <w:rPr>
+          <w:sz w:val="44"/>
+        </w:rPr>
+        <w:t>a</w:t>
+      </w:r>
+      <w:r>
+        <w:rPr>
+          <w:sz w:val="44"/>
+        </w:rPr>
+        <w:t>)</w:t>
       </w:r>
       <w:r>
         <w:rPr>
@@ -7363,7 +7461,13 @@
         <w:rPr>
           <w:sz w:val="44"/>
         </w:rPr>
-        <w:t>00 LED</w:t>
+        <w:t xml:space="preserve">00 </w:t>
+      </w:r>
+      <w:r>
+        <w:rPr>
+          <w:sz w:val="44"/>
+        </w:rPr>
+        <w:t>DEN</w:t>
       </w:r>
       <w:r>
         <w:rPr>
@@ -7399,7 +7503,13 @@
         <w:rPr>
           <w:sz w:val="44"/>
         </w:rPr>
-        <w:t>00 LED</w:t>
+        <w:t xml:space="preserve">00 </w:t>
+      </w:r>
+      <w:r>
+        <w:rPr>
+          <w:sz w:val="44"/>
+        </w:rPr>
+        <w:t>DEN</w:t>
       </w:r>
       <w:r>
         <w:rPr>
@@ -7435,7 +7545,13 @@
         <w:rPr>
           <w:sz w:val="44"/>
         </w:rPr>
-        <w:t>00 LED</w:t>
+        <w:t xml:space="preserve">00 </w:t>
+      </w:r>
+      <w:r>
+        <w:rPr>
+          <w:sz w:val="44"/>
+        </w:rPr>
+        <w:t>DEN</w:t>
       </w:r>
       <w:r>
         <w:rPr>
@@ -7471,7 +7587,13 @@
         <w:rPr>
           <w:sz w:val="44"/>
         </w:rPr>
-        <w:t>00 LED</w:t>
+        <w:t xml:space="preserve">00 </w:t>
+      </w:r>
+      <w:r>
+        <w:rPr>
+          <w:sz w:val="44"/>
+        </w:rPr>
+        <w:t>DEN</w:t>
       </w:r>
       <w:r>
         <w:rPr>
@@ -7504,7 +7626,21 @@
         <w:rPr>
           <w:sz w:val="44"/>
         </w:rPr>
-        <w:t xml:space="preserve">  pinMode(3,INPUT_PULLUP);</w:t>
+        <w:t xml:space="preserve">  pinMode(</w:t>
+      </w:r>
+      <w:proofErr w:type="gramStart"/>
+      <w:r>
+        <w:rPr>
+          <w:sz w:val="44"/>
+        </w:rPr>
+        <w:t>3,INPUT</w:t>
+      </w:r>
+      <w:proofErr w:type="gramEnd"/>
+      <w:r>
+        <w:rPr>
+          <w:sz w:val="44"/>
+        </w:rPr>
+        <w:t>_PULLUP);</w:t>
       </w:r>
     </w:p>
     <w:p>
@@ -7518,7 +7654,21 @@
         <w:rPr>
           <w:sz w:val="44"/>
         </w:rPr>
-        <w:t xml:space="preserve">  attachInterrupt(1, ngatngoai1, FALLING);</w:t>
+        <w:t xml:space="preserve">  </w:t>
+      </w:r>
+      <w:proofErr w:type="gramStart"/>
+      <w:r>
+        <w:rPr>
+          <w:sz w:val="44"/>
+        </w:rPr>
+        <w:t>attachInterrupt(</w:t>
+      </w:r>
+      <w:proofErr w:type="gramEnd"/>
+      <w:r>
+        <w:rPr>
+          <w:sz w:val="44"/>
+        </w:rPr>
+        <w:t>1, ngatngoai1, FALLING);</w:t>
       </w:r>
     </w:p>
     <w:p>
@@ -7532,7 +7682,21 @@
         <w:rPr>
           <w:sz w:val="44"/>
         </w:rPr>
-        <w:t xml:space="preserve">  pinMode(5,OUTPUT);</w:t>
+        <w:t xml:space="preserve">  pinMode(</w:t>
+      </w:r>
+      <w:proofErr w:type="gramStart"/>
+      <w:r>
+        <w:rPr>
+          <w:sz w:val="44"/>
+        </w:rPr>
+        <w:t>5,OUTPUT</w:t>
+      </w:r>
+      <w:proofErr w:type="gramEnd"/>
+      <w:r>
+        <w:rPr>
+          <w:sz w:val="44"/>
+        </w:rPr>
+        <w:t>);</w:t>
       </w:r>
     </w:p>
     <w:p>
@@ -7546,7 +7710,14 @@
         <w:rPr>
           <w:sz w:val="44"/>
         </w:rPr>
-        <w:t xml:space="preserve">  analogWrite(5,</w:t>
+        <w:t xml:space="preserve">  analogWrite(</w:t>
+      </w:r>
+      <w:proofErr w:type="gramStart"/>
+      <w:r>
+        <w:rPr>
+          <w:sz w:val="44"/>
+        </w:rPr>
+        <w:t>5,</w:t>
       </w:r>
       <w:r>
         <w:rPr>
@@ -7554,6 +7725,7 @@
         </w:rPr>
         <w:t>tanso</w:t>
       </w:r>
+      <w:proofErr w:type="gramEnd"/>
       <w:r>
         <w:rPr>
           <w:sz w:val="44"/>
@@ -7580,7 +7752,7 @@
         <w:rPr>
           <w:sz w:val="44"/>
         </w:rPr>
-        <w:t>10h30 N6</w:t>
+        <w:t>10h25 N5s</w:t>
       </w:r>
     </w:p>
     <w:p>
@@ -7750,7 +7922,7 @@
           </mc:Choice>
           <mc:Fallback>
             <w:pict>
-              <v:shape w14:anchorId="0A84DB14" id="Ink 20" o:spid="_x0000_s1026" type="#_x0000_t75" style="position:absolute;margin-left:455.5pt;margin-top:33.8pt;width:1.05pt;height:1.05pt;z-index:251744256;visibility:visible;mso-wrap-style:square;mso-wrap-distance-left:9pt;mso-wrap-distance-top:0;mso-wrap-distance-right:9pt;mso-wrap-distance-bottom:0;mso-position-horizontal:absolute;mso-position-horizontal-relative:text;mso-position-vertical:absolute;mso-position-vertical-relative:text" o:gfxdata="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">
+              <v:shape w14:anchorId="4F7CFDB3" id="Ink 20" o:spid="_x0000_s1026" type="#_x0000_t75" style="position:absolute;margin-left:455.5pt;margin-top:33.8pt;width:1.05pt;height:1.05pt;z-index:251744256;visibility:visible;mso-wrap-style:square;mso-wrap-distance-left:9pt;mso-wrap-distance-top:0;mso-wrap-distance-right:9pt;mso-wrap-distance-bottom:0;mso-position-horizontal:absolute;mso-position-horizontal-relative:text;mso-position-vertical:absolute;mso-position-vertical-relative:text" o:gfxdata="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">
                 <v:imagedata r:id="rId116" o:title=""/>
               </v:shape>
             </w:pict>
@@ -7796,7 +7968,7 @@
           </mc:Choice>
           <mc:Fallback>
             <w:pict>
-              <v:shape w14:anchorId="718F64D5" id="Ink 19" o:spid="_x0000_s1026" type="#_x0000_t75" style="position:absolute;margin-left:455.5pt;margin-top:33.8pt;width:1.05pt;height:1.05pt;z-index:251743232;visibility:visible;mso-wrap-style:square;mso-wrap-distance-left:9pt;mso-wrap-distance-top:0;mso-wrap-distance-right:9pt;mso-wrap-distance-bottom:0;mso-position-horizontal:absolute;mso-position-horizontal-relative:text;mso-position-vertical:absolute;mso-position-vertical-relative:text" o:gfxdata="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">
+              <v:shape w14:anchorId="3DAFCC00" id="Ink 19" o:spid="_x0000_s1026" type="#_x0000_t75" style="position:absolute;margin-left:455.5pt;margin-top:33.8pt;width:1.05pt;height:1.05pt;z-index:251743232;visibility:visible;mso-wrap-style:square;mso-wrap-distance-left:9pt;mso-wrap-distance-top:0;mso-wrap-distance-right:9pt;mso-wrap-distance-bottom:0;mso-position-horizontal:absolute;mso-position-horizontal-relative:text;mso-position-vertical:absolute;mso-position-vertical-relative:text" o:gfxdata="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">
                 <v:imagedata r:id="rId116" o:title=""/>
               </v:shape>
             </w:pict>
@@ -7877,7 +8049,19 @@
         <w:rPr>
           <w:sz w:val="44"/>
         </w:rPr>
+        <w:t xml:space="preserve"> và quãng đường &gt; 50m</w:t>
+      </w:r>
+      <w:r>
+        <w:rPr>
+          <w:sz w:val="44"/>
+        </w:rPr>
         <w:t>. NUT1 unlock. NUT2 lock</w:t>
+      </w:r>
+      <w:r>
+        <w:rPr>
+          <w:sz w:val="44"/>
+        </w:rPr>
+        <w:t>.</w:t>
       </w:r>
     </w:p>
     <w:p>
@@ -8319,7 +8503,7 @@
         <w:rPr>
           <w:sz w:val="44"/>
         </w:rPr>
-        <w:t>14h00 N6</w:t>
+        <w:t>13h50 B5c</w:t>
       </w:r>
     </w:p>
     <w:p>
@@ -8780,7 +8964,7 @@
           </mc:Choice>
           <mc:Fallback>
             <w:pict>
-              <v:shape w14:anchorId="3238BD67" id="Ink 16" o:spid="_x0000_s1026" type="#_x0000_t75" style="position:absolute;margin-left:278.95pt;margin-top:1.6pt;width:18.2pt;height:20.9pt;z-index:251756544;visibility:visible;mso-wrap-style:square;mso-wrap-distance-left:9pt;mso-wrap-distance-top:0;mso-wrap-distance-right:9pt;mso-wrap-distance-bottom:0;mso-position-horizontal:absolute;mso-position-horizontal-relative:text;mso-position-vertical:absolute;mso-position-vertical-relative:text" o:gfxdata="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">
+              <v:shape w14:anchorId="3881E0F0" id="Ink 16" o:spid="_x0000_s1026" type="#_x0000_t75" style="position:absolute;margin-left:279pt;margin-top:1.85pt;width:17.75pt;height:20.65pt;z-index:251756544;visibility:visible;mso-wrap-style:square;mso-wrap-distance-left:9pt;mso-wrap-distance-top:0;mso-wrap-distance-right:9pt;mso-wrap-distance-bottom:0;mso-position-horizontal:absolute;mso-position-horizontal-relative:text;mso-position-vertical:absolute;mso-position-vertical-relative:text" o:gfxdata="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">
                 <v:imagedata r:id="rId119" o:title=""/>
               </v:shape>
             </w:pict>
@@ -8826,7 +9010,7 @@
           </mc:Choice>
           <mc:Fallback>
             <w:pict>
-              <v:shape w14:anchorId="1701D489" id="Ink 15" o:spid="_x0000_s1026" type="#_x0000_t75" style="position:absolute;margin-left:253.65pt;margin-top:2.55pt;width:24.65pt;height:22.35pt;z-index:251755520;visibility:visible;mso-wrap-style:square;mso-wrap-distance-left:9pt;mso-wrap-distance-top:0;mso-wrap-distance-right:9pt;mso-wrap-distance-bottom:0;mso-position-horizontal:absolute;mso-position-horizontal-relative:text;mso-position-vertical:absolute;mso-position-vertical-relative:text" o:gfxdata="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">
+              <v:shape w14:anchorId="3C2D80DA" id="Ink 15" o:spid="_x0000_s1026" type="#_x0000_t75" style="position:absolute;margin-left:254.05pt;margin-top:2.65pt;width:23.75pt;height:21.95pt;z-index:251755520;visibility:visible;mso-wrap-style:square;mso-wrap-distance-left:9pt;mso-wrap-distance-top:0;mso-wrap-distance-right:9pt;mso-wrap-distance-bottom:0;mso-position-horizontal:absolute;mso-position-horizontal-relative:text;mso-position-vertical:absolute;mso-position-vertical-relative:text" o:gfxdata="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">
                 <v:imagedata r:id="rId121" o:title=""/>
               </v:shape>
             </w:pict>
@@ -8872,7 +9056,7 @@
           </mc:Choice>
           <mc:Fallback>
             <w:pict>
-              <v:shape w14:anchorId="2761731E" id="Ink 14" o:spid="_x0000_s1026" type="#_x0000_t75" style="position:absolute;margin-left:236.5pt;margin-top:-14.25pt;width:80.6pt;height:60.85pt;z-index:251754496;visibility:visible;mso-wrap-style:square;mso-wrap-distance-left:9pt;mso-wrap-distance-top:0;mso-wrap-distance-right:9pt;mso-wrap-distance-bottom:0;mso-position-horizontal:absolute;mso-position-horizontal-relative:text;mso-position-vertical:absolute;mso-position-vertical-relative:text" o:gfxdata="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">
+              <v:shape w14:anchorId="05BB88D3" id="Ink 14" o:spid="_x0000_s1026" type="#_x0000_t75" style="position:absolute;margin-left:236.85pt;margin-top:-14.1pt;width:80.2pt;height:60.55pt;z-index:251754496;visibility:visible;mso-wrap-style:square;mso-wrap-distance-left:9pt;mso-wrap-distance-top:0;mso-wrap-distance-right:9pt;mso-wrap-distance-bottom:0;mso-position-horizontal:absolute;mso-position-horizontal-relative:text;mso-position-vertical:absolute;mso-position-vertical-relative:text" o:gfxdata="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">
                 <v:imagedata r:id="rId123" o:title=""/>
               </v:shape>
             </w:pict>
@@ -8918,7 +9102,7 @@
           </mc:Choice>
           <mc:Fallback>
             <w:pict>
-              <v:shape w14:anchorId="0F856963" id="Ink 13" o:spid="_x0000_s1026" type="#_x0000_t75" style="position:absolute;margin-left:262.7pt;margin-top:26.35pt;width:11.9pt;height:9.95pt;z-index:251753472;visibility:visible;mso-wrap-style:square;mso-wrap-distance-left:9pt;mso-wrap-distance-top:0;mso-wrap-distance-right:9pt;mso-wrap-distance-bottom:0;mso-position-horizontal:absolute;mso-position-horizontal-relative:text;mso-position-vertical:absolute;mso-position-vertical-relative:text" o:gfxdata="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">
+              <v:shape w14:anchorId="3E572216" id="Ink 13" o:spid="_x0000_s1026" type="#_x0000_t75" style="position:absolute;margin-left:263.2pt;margin-top:26.55pt;width:10.9pt;height:9.2pt;z-index:251753472;visibility:visible;mso-wrap-style:square;mso-wrap-distance-left:9pt;mso-wrap-distance-top:0;mso-wrap-distance-right:9pt;mso-wrap-distance-bottom:0;mso-position-horizontal:absolute;mso-position-horizontal-relative:text;mso-position-vertical:absolute;mso-position-vertical-relative:text" o:gfxdata="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">
                 <v:imagedata r:id="rId125" o:title=""/>
               </v:shape>
             </w:pict>
@@ -8971,7 +9155,7 @@
           </mc:Choice>
           <mc:Fallback>
             <w:pict>
-              <v:shape w14:anchorId="01C790F5" id="Ink 49" o:spid="_x0000_s1026" type="#_x0000_t75" style="position:absolute;margin-left:251.85pt;margin-top:2.3pt;width:15.3pt;height:24.75pt;z-index:251834368;visibility:visible;mso-wrap-style:square;mso-wrap-distance-left:9pt;mso-wrap-distance-top:0;mso-wrap-distance-right:9pt;mso-wrap-distance-bottom:0;mso-position-horizontal:absolute;mso-position-horizontal-relative:text;mso-position-vertical:absolute;mso-position-vertical-relative:text" o:gfxdata="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">
+              <v:shape w14:anchorId="5600C443" id="Ink 49" o:spid="_x0000_s1026" type="#_x0000_t75" style="position:absolute;margin-left:252.35pt;margin-top:2.5pt;width:14.8pt;height:24.15pt;z-index:251834368;visibility:visible;mso-wrap-style:square;mso-wrap-distance-left:9pt;mso-wrap-distance-top:0;mso-wrap-distance-right:9pt;mso-wrap-distance-bottom:0;mso-position-horizontal:absolute;mso-position-horizontal-relative:text;mso-position-vertical:absolute;mso-position-vertical-relative:text" o:gfxdata="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">
                 <v:imagedata r:id="rId127" o:title=""/>
               </v:shape>
             </w:pict>
@@ -9017,7 +9201,7 @@
           </mc:Choice>
           <mc:Fallback>
             <w:pict>
-              <v:shape w14:anchorId="107CBFF6" id="Ink 48" o:spid="_x0000_s1026" type="#_x0000_t75" style="position:absolute;margin-left:233.1pt;margin-top:8.75pt;width:7.95pt;height:12.85pt;z-index:251833344;visibility:visible;mso-wrap-style:square;mso-wrap-distance-left:9pt;mso-wrap-distance-top:0;mso-wrap-distance-right:9pt;mso-wrap-distance-bottom:0;mso-position-horizontal:absolute;mso-position-horizontal-relative:text;mso-position-vertical:absolute;mso-position-vertical-relative:text" o:gfxdata="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">
+              <v:shape w14:anchorId="5C1C982C" id="Ink 48" o:spid="_x0000_s1026" type="#_x0000_t75" style="position:absolute;margin-left:233.3pt;margin-top:9.1pt;width:7.75pt;height:12.15pt;z-index:251833344;visibility:visible;mso-wrap-style:square;mso-wrap-distance-left:9pt;mso-wrap-distance-top:0;mso-wrap-distance-right:9pt;mso-wrap-distance-bottom:0;mso-position-horizontal:absolute;mso-position-horizontal-relative:text;mso-position-vertical:absolute;mso-position-vertical-relative:text" o:gfxdata="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">
                 <v:imagedata r:id="rId129" o:title=""/>
               </v:shape>
             </w:pict>
@@ -9063,7 +9247,7 @@
           </mc:Choice>
           <mc:Fallback>
             <w:pict>
-              <v:shape w14:anchorId="573FEC33" id="Ink 47" o:spid="_x0000_s1026" type="#_x0000_t75" style="position:absolute;margin-left:218.95pt;margin-top:8.55pt;width:13.3pt;height:12.5pt;z-index:251832320;visibility:visible;mso-wrap-style:square;mso-wrap-distance-left:9pt;mso-wrap-distance-top:0;mso-wrap-distance-right:9pt;mso-wrap-distance-bottom:0;mso-position-horizontal:absolute;mso-position-horizontal-relative:text;mso-position-vertical:absolute;mso-position-vertical-relative:text" o:gfxdata="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">
+              <v:shape w14:anchorId="1B2076E7" id="Ink 47" o:spid="_x0000_s1026" type="#_x0000_t75" style="position:absolute;margin-left:219.5pt;margin-top:8.95pt;width:12.3pt;height:11.95pt;z-index:251832320;visibility:visible;mso-wrap-style:square;mso-wrap-distance-left:9pt;mso-wrap-distance-top:0;mso-wrap-distance-right:9pt;mso-wrap-distance-bottom:0;mso-position-horizontal:absolute;mso-position-horizontal-relative:text;mso-position-vertical:absolute;mso-position-vertical-relative:text" o:gfxdata="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">
                 <v:imagedata r:id="rId131" o:title=""/>
               </v:shape>
             </w:pict>
@@ -9109,7 +9293,7 @@
           </mc:Choice>
           <mc:Fallback>
             <w:pict>
-              <v:shape w14:anchorId="310A979F" id="Ink 26" o:spid="_x0000_s1026" type="#_x0000_t75" style="position:absolute;margin-left:274.15pt;margin-top:-6.95pt;width:63.05pt;height:26.25pt;z-index:251831296;visibility:visible;mso-wrap-style:square;mso-wrap-distance-left:9pt;mso-wrap-distance-top:0;mso-wrap-distance-right:9pt;mso-wrap-distance-bottom:0;mso-position-horizontal:absolute;mso-position-horizontal-relative:text;mso-position-vertical:absolute;mso-position-vertical-relative:text" o:gfxdata="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">
+              <v:shape w14:anchorId="791DF861" id="Ink 26" o:spid="_x0000_s1026" type="#_x0000_t75" style="position:absolute;margin-left:274.35pt;margin-top:-6.8pt;width:62.8pt;height:25.6pt;z-index:251831296;visibility:visible;mso-wrap-style:square;mso-wrap-distance-left:9pt;mso-wrap-distance-top:0;mso-wrap-distance-right:9pt;mso-wrap-distance-bottom:0;mso-position-horizontal:absolute;mso-position-horizontal-relative:text;mso-position-vertical:absolute;mso-position-vertical-relative:text" o:gfxdata="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">
                 <v:imagedata r:id="rId133" o:title=""/>
               </v:shape>
             </w:pict>
@@ -9155,7 +9339,7 @@
           </mc:Choice>
           <mc:Fallback>
             <w:pict>
-              <v:shape w14:anchorId="00A5274F" id="Ink 12" o:spid="_x0000_s1026" type="#_x0000_t75" style="position:absolute;margin-left:264.7pt;margin-top:21.5pt;width:13.75pt;height:13.4pt;z-index:251752448;visibility:visible;mso-wrap-style:square;mso-wrap-distance-left:9pt;mso-wrap-distance-top:0;mso-wrap-distance-right:9pt;mso-wrap-distance-bottom:0;mso-position-horizontal:absolute;mso-position-horizontal-relative:text;mso-position-vertical:absolute;mso-position-vertical-relative:text" o:gfxdata="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">
+              <v:shape w14:anchorId="492B1570" id="Ink 12" o:spid="_x0000_s1026" type="#_x0000_t75" style="position:absolute;margin-left:265pt;margin-top:21.95pt;width:13pt;height:12.8pt;z-index:251752448;visibility:visible;mso-wrap-style:square;mso-wrap-distance-left:9pt;mso-wrap-distance-top:0;mso-wrap-distance-right:9pt;mso-wrap-distance-bottom:0;mso-position-horizontal:absolute;mso-position-horizontal-relative:text;mso-position-vertical:absolute;mso-position-vertical-relative:text" o:gfxdata="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">
                 <v:imagedata r:id="rId135" o:title=""/>
               </v:shape>
             </w:pict>
@@ -9201,7 +9385,7 @@
           </mc:Choice>
           <mc:Fallback>
             <w:pict>
-              <v:shape w14:anchorId="43DD8FF4" id="Ink 11" o:spid="_x0000_s1026" type="#_x0000_t75" style="position:absolute;margin-left:267.45pt;margin-top:-11.05pt;width:3.8pt;height:37.75pt;z-index:251751424;visibility:visible;mso-wrap-style:square;mso-wrap-distance-left:9pt;mso-wrap-distance-top:0;mso-wrap-distance-right:9pt;mso-wrap-distance-bottom:0;mso-position-horizontal:absolute;mso-position-horizontal-relative:text;mso-position-vertical:absolute;mso-position-vertical-relative:text" o:gfxdata="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">
+              <v:shape w14:anchorId="26FCEC45" id="Ink 11" o:spid="_x0000_s1026" type="#_x0000_t75" style="position:absolute;margin-left:267.95pt;margin-top:-10.55pt;width:3.15pt;height:37.05pt;z-index:251751424;visibility:visible;mso-wrap-style:square;mso-wrap-distance-left:9pt;mso-wrap-distance-top:0;mso-wrap-distance-right:9pt;mso-wrap-distance-bottom:0;mso-position-horizontal:absolute;mso-position-horizontal-relative:text;mso-position-vertical:absolute;mso-position-vertical-relative:text" o:gfxdata="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">
                 <v:imagedata r:id="rId137" o:title=""/>
               </v:shape>
             </w:pict>
@@ -9261,7 +9445,7 @@
           </mc:Choice>
           <mc:Fallback>
             <w:pict>
-              <v:shape w14:anchorId="696D116B" id="Ink 46" o:spid="_x0000_s1026" type="#_x0000_t75" style="position:absolute;margin-left:312.15pt;margin-top:-3.2pt;width:13.1pt;height:29.8pt;z-index:251783168;visibility:visible;mso-wrap-style:square;mso-wrap-distance-left:9pt;mso-wrap-distance-top:0;mso-wrap-distance-right:9pt;mso-wrap-distance-bottom:0;mso-position-horizontal:absolute;mso-position-horizontal-relative:text;mso-position-vertical:absolute;mso-position-vertical-relative:text" o:gfxdata="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">
+              <v:shape w14:anchorId="31B009B3" id="Ink 46" o:spid="_x0000_s1026" type="#_x0000_t75" style="position:absolute;margin-left:312.85pt;margin-top:-2.75pt;width:12pt;height:28.7pt;z-index:251783168;visibility:visible;mso-wrap-style:square;mso-wrap-distance-left:9pt;mso-wrap-distance-top:0;mso-wrap-distance-right:9pt;mso-wrap-distance-bottom:0;mso-position-horizontal:absolute;mso-position-horizontal-relative:text;mso-position-vertical:absolute;mso-position-vertical-relative:text" o:gfxdata="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">
                 <v:imagedata r:id="rId139" o:title=""/>
               </v:shape>
             </w:pict>
@@ -9307,7 +9491,7 @@
           </mc:Choice>
           <mc:Fallback>
             <w:pict>
-              <v:shape w14:anchorId="11CBE316" id="Ink 45" o:spid="_x0000_s1026" type="#_x0000_t75" style="position:absolute;margin-left:305.6pt;margin-top:-.8pt;width:13.45pt;height:57.15pt;z-index:251782144;visibility:visible;mso-wrap-style:square;mso-wrap-distance-left:9pt;mso-wrap-distance-top:0;mso-wrap-distance-right:9pt;mso-wrap-distance-bottom:0;mso-position-horizontal:absolute;mso-position-horizontal-relative:text;mso-position-vertical:absolute;mso-position-vertical-relative:text" o:gfxdata="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">
+              <v:shape w14:anchorId="34CB3F95" id="Ink 45" o:spid="_x0000_s1026" type="#_x0000_t75" style="position:absolute;margin-left:306.1pt;margin-top:-.55pt;width:12.95pt;height:56.9pt;z-index:251782144;visibility:visible;mso-wrap-style:square;mso-wrap-distance-left:9pt;mso-wrap-distance-top:0;mso-wrap-distance-right:9pt;mso-wrap-distance-bottom:0;mso-position-horizontal:absolute;mso-position-horizontal-relative:text;mso-position-vertical:absolute;mso-position-vertical-relative:text" o:gfxdata="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">
                 <v:imagedata r:id="rId141" o:title=""/>
               </v:shape>
             </w:pict>
@@ -9353,7 +9537,7 @@
           </mc:Choice>
           <mc:Fallback>
             <w:pict>
-              <v:shape w14:anchorId="3A8ED1A2" id="Ink 23" o:spid="_x0000_s1026" type="#_x0000_t75" style="position:absolute;margin-left:450.9pt;margin-top:-5.95pt;width:23.75pt;height:43.5pt;z-index:251763712;visibility:visible;mso-wrap-style:square;mso-wrap-distance-left:9pt;mso-wrap-distance-top:0;mso-wrap-distance-right:9pt;mso-wrap-distance-bottom:0;mso-position-horizontal:absolute;mso-position-horizontal-relative:text;mso-position-vertical:absolute;mso-position-vertical-relative:text" o:gfxdata="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">
+              <v:shape w14:anchorId="0AB45280" id="Ink 23" o:spid="_x0000_s1026" type="#_x0000_t75" style="position:absolute;margin-left:450.8pt;margin-top:-5.8pt;width:23.4pt;height:43.35pt;z-index:251763712;visibility:visible;mso-wrap-style:square;mso-wrap-distance-left:9pt;mso-wrap-distance-top:0;mso-wrap-distance-right:9pt;mso-wrap-distance-bottom:0;mso-position-horizontal:absolute;mso-position-horizontal-relative:text;mso-position-vertical:absolute;mso-position-vertical-relative:text" o:gfxdata="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">
                 <v:imagedata r:id="rId143" o:title=""/>
               </v:shape>
             </w:pict>
@@ -9399,7 +9583,7 @@
           </mc:Choice>
           <mc:Fallback>
             <w:pict>
-              <v:shape w14:anchorId="7C858549" id="Ink 22" o:spid="_x0000_s1026" type="#_x0000_t75" style="position:absolute;margin-left:456.5pt;margin-top:-1.45pt;width:9.6pt;height:3.9pt;z-index:251762688;visibility:visible;mso-wrap-style:square;mso-wrap-distance-left:9pt;mso-wrap-distance-top:0;mso-wrap-distance-right:9pt;mso-wrap-distance-bottom:0;mso-position-horizontal:absolute;mso-position-horizontal-relative:text;mso-position-vertical:absolute;mso-position-vertical-relative:text" o:gfxdata="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">
+              <v:shape w14:anchorId="3F857F43" id="Ink 22" o:spid="_x0000_s1026" type="#_x0000_t75" style="position:absolute;margin-left:456.75pt;margin-top:-1.1pt;width:8.8pt;height:3.05pt;z-index:251762688;visibility:visible;mso-wrap-style:square;mso-wrap-distance-left:9pt;mso-wrap-distance-top:0;mso-wrap-distance-right:9pt;mso-wrap-distance-bottom:0;mso-position-horizontal:absolute;mso-position-horizontal-relative:text;mso-position-vertical:absolute;mso-position-vertical-relative:text" o:gfxdata="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">
                 <v:imagedata r:id="rId145" o:title=""/>
               </v:shape>
             </w:pict>
@@ -9445,7 +9629,7 @@
           </mc:Choice>
           <mc:Fallback>
             <w:pict>
-              <v:shape w14:anchorId="24C24A92" id="Ink 21" o:spid="_x0000_s1026" type="#_x0000_t75" style="position:absolute;margin-left:415.3pt;margin-top:-5.6pt;width:20.6pt;height:34.85pt;z-index:251761664;visibility:visible;mso-wrap-style:square;mso-wrap-distance-left:9pt;mso-wrap-distance-top:0;mso-wrap-distance-right:9pt;mso-wrap-distance-bottom:0;mso-position-horizontal:absolute;mso-position-horizontal-relative:text;mso-position-vertical:absolute;mso-position-vertical-relative:text" o:gfxdata="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">
+              <v:shape w14:anchorId="1089F9A7" id="Ink 21" o:spid="_x0000_s1026" type="#_x0000_t75" style="position:absolute;margin-left:415.65pt;margin-top:-5.25pt;width:20.2pt;height:34.05pt;z-index:251761664;visibility:visible;mso-wrap-style:square;mso-wrap-distance-left:9pt;mso-wrap-distance-top:0;mso-wrap-distance-right:9pt;mso-wrap-distance-bottom:0;mso-position-horizontal:absolute;mso-position-horizontal-relative:text;mso-position-vertical:absolute;mso-position-vertical-relative:text" o:gfxdata="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">
                 <v:imagedata r:id="rId147" o:title=""/>
               </v:shape>
             </w:pict>
@@ -9491,7 +9675,7 @@
           </mc:Choice>
           <mc:Fallback>
             <w:pict>
-              <v:shape w14:anchorId="3A93CEC7" id="Ink 20" o:spid="_x0000_s1026" type="#_x0000_t75" style="position:absolute;margin-left:357.3pt;margin-top:3.3pt;width:70.85pt;height:16.45pt;z-index:251760640;visibility:visible;mso-wrap-style:square;mso-wrap-distance-left:9pt;mso-wrap-distance-top:0;mso-wrap-distance-right:9pt;mso-wrap-distance-bottom:0;mso-position-horizontal:absolute;mso-position-horizontal-relative:text;mso-position-vertical:absolute;mso-position-vertical-relative:text" o:gfxdata="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">
+              <v:shape w14:anchorId="17F72AA0" id="Ink 20" o:spid="_x0000_s1026" type="#_x0000_t75" style="position:absolute;margin-left:357.55pt;margin-top:3.75pt;width:70.55pt;height:15.6pt;z-index:251760640;visibility:visible;mso-wrap-style:square;mso-wrap-distance-left:9pt;mso-wrap-distance-top:0;mso-wrap-distance-right:9pt;mso-wrap-distance-bottom:0;mso-position-horizontal:absolute;mso-position-horizontal-relative:text;mso-position-vertical:absolute;mso-position-vertical-relative:text" o:gfxdata="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">
                 <v:imagedata r:id="rId149" o:title=""/>
               </v:shape>
             </w:pict>
@@ -9537,7 +9721,7 @@
           </mc:Choice>
           <mc:Fallback>
             <w:pict>
-              <v:shape w14:anchorId="206C66C2" id="Ink 19" o:spid="_x0000_s1026" type="#_x0000_t75" style="position:absolute;margin-left:276.95pt;margin-top:-10.35pt;width:11.05pt;height:32.1pt;z-index:251759616;visibility:visible;mso-wrap-style:square;mso-wrap-distance-left:9pt;mso-wrap-distance-top:0;mso-wrap-distance-right:9pt;mso-wrap-distance-bottom:0;mso-position-horizontal:absolute;mso-position-horizontal-relative:text;mso-position-vertical:absolute;mso-position-vertical-relative:text" o:gfxdata="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">
+              <v:shape w14:anchorId="6BAC0DEB" id="Ink 19" o:spid="_x0000_s1026" type="#_x0000_t75" style="position:absolute;margin-left:277.2pt;margin-top:-10.15pt;width:10.55pt;height:31.4pt;z-index:251759616;visibility:visible;mso-wrap-style:square;mso-wrap-distance-left:9pt;mso-wrap-distance-top:0;mso-wrap-distance-right:9pt;mso-wrap-distance-bottom:0;mso-position-horizontal:absolute;mso-position-horizontal-relative:text;mso-position-vertical:absolute;mso-position-vertical-relative:text" o:gfxdata="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">
                 <v:imagedata r:id="rId151" o:title=""/>
               </v:shape>
             </w:pict>
@@ -9583,7 +9767,7 @@
           </mc:Choice>
           <mc:Fallback>
             <w:pict>
-              <v:shape w14:anchorId="5DAE2D2B" id="Ink 18" o:spid="_x0000_s1026" type="#_x0000_t75" style="position:absolute;margin-left:290.7pt;margin-top:18.8pt;width:4.3pt;height:8.45pt;z-index:251758592;visibility:visible;mso-wrap-style:square;mso-wrap-distance-left:9pt;mso-wrap-distance-top:0;mso-wrap-distance-right:9pt;mso-wrap-distance-bottom:0;mso-position-horizontal:absolute;mso-position-horizontal-relative:text;mso-position-vertical:absolute;mso-position-vertical-relative:text" o:gfxdata="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">
+              <v:shape w14:anchorId="638CA285" id="Ink 18" o:spid="_x0000_s1026" type="#_x0000_t75" style="position:absolute;margin-left:291.25pt;margin-top:19.15pt;width:3.45pt;height:7.75pt;z-index:251758592;visibility:visible;mso-wrap-style:square;mso-wrap-distance-left:9pt;mso-wrap-distance-top:0;mso-wrap-distance-right:9pt;mso-wrap-distance-bottom:0;mso-position-horizontal:absolute;mso-position-horizontal-relative:text;mso-position-vertical:absolute;mso-position-vertical-relative:text" o:gfxdata="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">
                 <v:imagedata r:id="rId153" o:title=""/>
               </v:shape>
             </w:pict>
@@ -9629,7 +9813,7 @@
           </mc:Choice>
           <mc:Fallback>
             <w:pict>
-              <v:shape w14:anchorId="6FEDBB81" id="Ink 17" o:spid="_x0000_s1026" type="#_x0000_t75" style="position:absolute;margin-left:257.2pt;margin-top:7.85pt;width:37.7pt;height:42.7pt;z-index:251757568;visibility:visible;mso-wrap-style:square;mso-wrap-distance-left:9pt;mso-wrap-distance-top:0;mso-wrap-distance-right:9pt;mso-wrap-distance-bottom:0;mso-position-horizontal:absolute;mso-position-horizontal-relative:text;mso-position-vertical:absolute;mso-position-vertical-relative:text" o:gfxdata="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">
+              <v:shape w14:anchorId="6CA97FC9" id="Ink 17" o:spid="_x0000_s1026" type="#_x0000_t75" style="position:absolute;margin-left:257.4pt;margin-top:8.4pt;width:37pt;height:42.05pt;z-index:251757568;visibility:visible;mso-wrap-style:square;mso-wrap-distance-left:9pt;mso-wrap-distance-top:0;mso-wrap-distance-right:9pt;mso-wrap-distance-bottom:0;mso-position-horizontal:absolute;mso-position-horizontal-relative:text;mso-position-vertical:absolute;mso-position-vertical-relative:text" o:gfxdata="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">
                 <v:imagedata r:id="rId155" o:title=""/>
               </v:shape>
             </w:pict>
@@ -9675,7 +9859,7 @@
           </mc:Choice>
           <mc:Fallback>
             <w:pict>
-              <v:shape w14:anchorId="7EFC2EE0" id="Ink 10" o:spid="_x0000_s1026" type="#_x0000_t75" style="position:absolute;margin-left:60.35pt;margin-top:26.85pt;width:34.85pt;height:14.85pt;z-index:251750400;visibility:visible;mso-wrap-style:square;mso-wrap-distance-left:9pt;mso-wrap-distance-top:0;mso-wrap-distance-right:9pt;mso-wrap-distance-bottom:0;mso-position-horizontal:absolute;mso-position-horizontal-relative:text;mso-position-vertical:absolute;mso-position-vertical-relative:text" o:gfxdata="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">
+              <v:shape w14:anchorId="75401A60" id="Ink 10" o:spid="_x0000_s1026" type="#_x0000_t75" style="position:absolute;margin-left:60.75pt;margin-top:26.95pt;width:34.45pt;height:14.3pt;z-index:251750400;visibility:visible;mso-wrap-style:square;mso-wrap-distance-left:9pt;mso-wrap-distance-top:0;mso-wrap-distance-right:9pt;mso-wrap-distance-bottom:0;mso-position-horizontal:absolute;mso-position-horizontal-relative:text;mso-position-vertical:absolute;mso-position-vertical-relative:text" o:gfxdata="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">
                 <v:imagedata r:id="rId157" o:title=""/>
               </v:shape>
             </w:pict>
@@ -9721,7 +9905,7 @@
           </mc:Choice>
           <mc:Fallback>
             <w:pict>
-              <v:shape w14:anchorId="727A38D4" id="Ink 9" o:spid="_x0000_s1026" type="#_x0000_t75" style="position:absolute;margin-left:72.65pt;margin-top:16.9pt;width:16.2pt;height:46.1pt;z-index:251749376;visibility:visible;mso-wrap-style:square;mso-wrap-distance-left:9pt;mso-wrap-distance-top:0;mso-wrap-distance-right:9pt;mso-wrap-distance-bottom:0;mso-position-horizontal:absolute;mso-position-horizontal-relative:text;mso-position-vertical:absolute;mso-position-vertical-relative:text" o:gfxdata="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">
+              <v:shape w14:anchorId="3AD02538" id="Ink 9" o:spid="_x0000_s1026" type="#_x0000_t75" style="position:absolute;margin-left:72.95pt;margin-top:17.25pt;width:15.8pt;height:45.7pt;z-index:251749376;visibility:visible;mso-wrap-style:square;mso-wrap-distance-left:9pt;mso-wrap-distance-top:0;mso-wrap-distance-right:9pt;mso-wrap-distance-bottom:0;mso-position-horizontal:absolute;mso-position-horizontal-relative:text;mso-position-vertical:absolute;mso-position-vertical-relative:text" o:gfxdata="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">
                 <v:imagedata r:id="rId159" o:title=""/>
               </v:shape>
             </w:pict>
@@ -9767,7 +9951,7 @@
           </mc:Choice>
           <mc:Fallback>
             <w:pict>
-              <v:shape w14:anchorId="3E1C155F" id="Ink 8" o:spid="_x0000_s1026" type="#_x0000_t75" style="position:absolute;margin-left:187.8pt;margin-top:26.2pt;width:13.85pt;height:17.85pt;z-index:251748352;visibility:visible;mso-wrap-style:square;mso-wrap-distance-left:9pt;mso-wrap-distance-top:0;mso-wrap-distance-right:9pt;mso-wrap-distance-bottom:0;mso-position-horizontal:absolute;mso-position-horizontal-relative:text;mso-position-vertical:absolute;mso-position-vertical-relative:text" o:gfxdata="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">
+              <v:shape w14:anchorId="01DBBC13" id="Ink 8" o:spid="_x0000_s1026" type="#_x0000_t75" style="position:absolute;margin-left:188.1pt;margin-top:26.6pt;width:13.4pt;height:16.95pt;z-index:251748352;visibility:visible;mso-wrap-style:square;mso-wrap-distance-left:9pt;mso-wrap-distance-top:0;mso-wrap-distance-right:9pt;mso-wrap-distance-bottom:0;mso-position-horizontal:absolute;mso-position-horizontal-relative:text;mso-position-vertical:absolute;mso-position-vertical-relative:text" o:gfxdata="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">
                 <v:imagedata r:id="rId161" o:title=""/>
               </v:shape>
             </w:pict>
@@ -9813,7 +9997,7 @@
           </mc:Choice>
           <mc:Fallback>
             <w:pict>
-              <v:shape w14:anchorId="7896D433" id="Ink 7" o:spid="_x0000_s1026" type="#_x0000_t75" style="position:absolute;margin-left:122.45pt;margin-top:30.35pt;width:80.8pt;height:12.7pt;z-index:251747328;visibility:visible;mso-wrap-style:square;mso-wrap-distance-left:9pt;mso-wrap-distance-top:0;mso-wrap-distance-right:9pt;mso-wrap-distance-bottom:0;mso-position-horizontal:absolute;mso-position-horizontal-relative:text;mso-position-vertical:absolute;mso-position-vertical-relative:text" o:gfxdata="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">
+              <v:shape w14:anchorId="731E0F59" id="Ink 7" o:spid="_x0000_s1026" type="#_x0000_t75" style="position:absolute;margin-left:122.85pt;margin-top:30.85pt;width:80.3pt;height:11.8pt;z-index:251747328;visibility:visible;mso-wrap-style:square;mso-wrap-distance-left:9pt;mso-wrap-distance-top:0;mso-wrap-distance-right:9pt;mso-wrap-distance-bottom:0;mso-position-horizontal:absolute;mso-position-horizontal-relative:text;mso-position-vertical:absolute;mso-position-vertical-relative:text" o:gfxdata="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">
                 <v:imagedata r:id="rId163" o:title=""/>
               </v:shape>
             </w:pict>
@@ -9859,7 +10043,7 @@
           </mc:Choice>
           <mc:Fallback>
             <w:pict>
-              <v:shape w14:anchorId="5191FBD6" id="Ink 6" o:spid="_x0000_s1026" type="#_x0000_t75" style="position:absolute;margin-left:198.5pt;margin-top:-55.1pt;width:154.5pt;height:154.05pt;z-index:251746304;visibility:visible;mso-wrap-style:square;mso-wrap-distance-left:9pt;mso-wrap-distance-top:0;mso-wrap-distance-right:9pt;mso-wrap-distance-bottom:0;mso-position-horizontal:absolute;mso-position-horizontal-relative:text;mso-position-vertical:absolute;mso-position-vertical-relative:text" o:gfxdata="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">
+              <v:shape w14:anchorId="0664CCAD" id="Ink 6" o:spid="_x0000_s1026" type="#_x0000_t75" style="position:absolute;margin-left:198.95pt;margin-top:-54.9pt;width:154.05pt;height:153.9pt;z-index:251746304;visibility:visible;mso-wrap-style:square;mso-wrap-distance-left:9pt;mso-wrap-distance-top:0;mso-wrap-distance-right:9pt;mso-wrap-distance-bottom:0;mso-position-horizontal:absolute;mso-position-horizontal-relative:text;mso-position-vertical:absolute;mso-position-vertical-relative:text" o:gfxdata="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">
                 <v:imagedata r:id="rId165" o:title=""/>
               </v:shape>
             </w:pict>
@@ -9905,7 +10089,7 @@
           </mc:Choice>
           <mc:Fallback>
             <w:pict>
-              <v:shape w14:anchorId="0A630671" id="Ink 5" o:spid="_x0000_s1026" type="#_x0000_t75" style="position:absolute;margin-left:196.05pt;margin-top:-35.8pt;width:8.5pt;height:119.4pt;z-index:251745280;visibility:visible;mso-wrap-style:square;mso-wrap-distance-left:9pt;mso-wrap-distance-top:0;mso-wrap-distance-right:9pt;mso-wrap-distance-bottom:0;mso-position-horizontal:absolute;mso-position-horizontal-relative:text;mso-position-vertical:absolute;mso-position-vertical-relative:text" o:gfxdata="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">
+              <v:shape w14:anchorId="7B67C264" id="Ink 5" o:spid="_x0000_s1026" type="#_x0000_t75" style="position:absolute;margin-left:196.1pt;margin-top:-35.45pt;width:8pt;height:118.95pt;z-index:251745280;visibility:visible;mso-wrap-style:square;mso-wrap-distance-left:9pt;mso-wrap-distance-top:0;mso-wrap-distance-right:9pt;mso-wrap-distance-bottom:0;mso-position-horizontal:absolute;mso-position-horizontal-relative:text;mso-position-vertical:absolute;mso-position-vertical-relative:text" o:gfxdata="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">
                 <v:imagedata r:id="rId167" o:title=""/>
               </v:shape>
             </w:pict>
@@ -9972,7 +10156,7 @@
           </mc:Choice>
           <mc:Fallback>
             <w:pict>
-              <v:shape w14:anchorId="70F103F1" id="Ink 33" o:spid="_x0000_s1026" type="#_x0000_t75" style="position:absolute;margin-left:381.85pt;margin-top:16.05pt;width:5.6pt;height:29.4pt;z-index:251769856;visibility:visible;mso-wrap-style:square;mso-wrap-distance-left:9pt;mso-wrap-distance-top:0;mso-wrap-distance-right:9pt;mso-wrap-distance-bottom:0;mso-position-horizontal:absolute;mso-position-horizontal-relative:text;mso-position-vertical:absolute;mso-position-vertical-relative:text" o:gfxdata="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">
+              <v:shape w14:anchorId="15074F6A" id="Ink 33" o:spid="_x0000_s1026" type="#_x0000_t75" style="position:absolute;margin-left:382.15pt;margin-top:16.35pt;width:5.15pt;height:28.65pt;z-index:251769856;visibility:visible;mso-wrap-style:square;mso-wrap-distance-left:9pt;mso-wrap-distance-top:0;mso-wrap-distance-right:9pt;mso-wrap-distance-bottom:0;mso-position-horizontal:absolute;mso-position-horizontal-relative:text;mso-position-vertical:absolute;mso-position-vertical-relative:text" o:gfxdata="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">
                 <v:imagedata r:id="rId169" o:title=""/>
               </v:shape>
             </w:pict>
@@ -10018,7 +10202,7 @@
           </mc:Choice>
           <mc:Fallback>
             <w:pict>
-              <v:shape w14:anchorId="01E73FEB" id="Ink 32" o:spid="_x0000_s1026" type="#_x0000_t75" style="position:absolute;margin-left:333.5pt;margin-top:23.05pt;width:8.35pt;height:21.45pt;z-index:251768832;visibility:visible;mso-wrap-style:square;mso-wrap-distance-left:9pt;mso-wrap-distance-top:0;mso-wrap-distance-right:9pt;mso-wrap-distance-bottom:0;mso-position-horizontal:absolute;mso-position-horizontal-relative:text;mso-position-vertical:absolute;mso-position-vertical-relative:text" o:gfxdata="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">
+              <v:shape w14:anchorId="49817361" id="Ink 32" o:spid="_x0000_s1026" type="#_x0000_t75" style="position:absolute;margin-left:333.7pt;margin-top:23.35pt;width:7.7pt;height:20.7pt;z-index:251768832;visibility:visible;mso-wrap-style:square;mso-wrap-distance-left:9pt;mso-wrap-distance-top:0;mso-wrap-distance-right:9pt;mso-wrap-distance-bottom:0;mso-position-horizontal:absolute;mso-position-horizontal-relative:text;mso-position-vertical:absolute;mso-position-vertical-relative:text" o:gfxdata="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">
                 <v:imagedata r:id="rId171" o:title=""/>
               </v:shape>
             </w:pict>
@@ -10064,7 +10248,7 @@
           </mc:Choice>
           <mc:Fallback>
             <w:pict>
-              <v:shape w14:anchorId="24148381" id="Ink 30" o:spid="_x0000_s1026" type="#_x0000_t75" style="position:absolute;margin-left:354.85pt;margin-top:20.3pt;width:4pt;height:16.7pt;z-index:251766784;visibility:visible;mso-wrap-style:square;mso-wrap-distance-left:9pt;mso-wrap-distance-top:0;mso-wrap-distance-right:9pt;mso-wrap-distance-bottom:0;mso-position-horizontal:absolute;mso-position-horizontal-relative:text;mso-position-vertical:absolute;mso-position-vertical-relative:text" o:gfxdata="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">
+              <v:shape w14:anchorId="238C7622" id="Ink 30" o:spid="_x0000_s1026" type="#_x0000_t75" style="position:absolute;margin-left:355.05pt;margin-top:20.55pt;width:3.45pt;height:16.4pt;z-index:251766784;visibility:visible;mso-wrap-style:square;mso-wrap-distance-left:9pt;mso-wrap-distance-top:0;mso-wrap-distance-right:9pt;mso-wrap-distance-bottom:0;mso-position-horizontal:absolute;mso-position-horizontal-relative:text;mso-position-vertical:absolute;mso-position-vertical-relative:text" o:gfxdata="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">
                 <v:imagedata r:id="rId173" o:title=""/>
               </v:shape>
             </w:pict>
@@ -10110,7 +10294,7 @@
           </mc:Choice>
           <mc:Fallback>
             <w:pict>
-              <v:shape w14:anchorId="0E097330" id="Ink 29" o:spid="_x0000_s1026" type="#_x0000_t75" style="position:absolute;margin-left:155.25pt;margin-top:18.65pt;width:326.4pt;height:26.6pt;z-index:251765760;visibility:visible;mso-wrap-style:square;mso-wrap-distance-left:9pt;mso-wrap-distance-top:0;mso-wrap-distance-right:9pt;mso-wrap-distance-bottom:0;mso-position-horizontal:absolute;mso-position-horizontal-relative:text;mso-position-vertical:absolute;mso-position-vertical-relative:text" o:gfxdata="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">
+              <v:shape w14:anchorId="14D5E2EA" id="Ink 29" o:spid="_x0000_s1026" type="#_x0000_t75" style="position:absolute;margin-left:155.5pt;margin-top:18.55pt;width:325.7pt;height:26.45pt;z-index:251765760;visibility:visible;mso-wrap-style:square;mso-wrap-distance-left:9pt;mso-wrap-distance-top:0;mso-wrap-distance-right:9pt;mso-wrap-distance-bottom:0;mso-position-horizontal:absolute;mso-position-horizontal-relative:text;mso-position-vertical:absolute;mso-position-vertical-relative:text" o:gfxdata="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">
                 <v:imagedata r:id="rId175" o:title=""/>
               </v:shape>
             </w:pict>
@@ -10156,7 +10340,7 @@
           </mc:Choice>
           <mc:Fallback>
             <w:pict>
-              <v:shape w14:anchorId="2FCE4FC6" id="Ink 27" o:spid="_x0000_s1026" type="#_x0000_t75" style="position:absolute;margin-left:258.15pt;margin-top:-14.35pt;width:7.85pt;height:87.95pt;z-index:251764736;visibility:visible;mso-wrap-style:square;mso-wrap-distance-left:9pt;mso-wrap-distance-top:0;mso-wrap-distance-right:9pt;mso-wrap-distance-bottom:0;mso-position-horizontal:absolute;mso-position-horizontal-relative:text;mso-position-vertical:absolute;mso-position-vertical-relative:text" o:gfxdata="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">
+              <v:shape w14:anchorId="17B65E34" id="Ink 27" o:spid="_x0000_s1026" type="#_x0000_t75" style="position:absolute;margin-left:258.65pt;margin-top:-13.9pt;width:7.35pt;height:87.4pt;z-index:251764736;visibility:visible;mso-wrap-style:square;mso-wrap-distance-left:9pt;mso-wrap-distance-top:0;mso-wrap-distance-right:9pt;mso-wrap-distance-bottom:0;mso-position-horizontal:absolute;mso-position-horizontal-relative:text;mso-position-vertical:absolute;mso-position-vertical-relative:text" o:gfxdata="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">
                 <v:imagedata r:id="rId177" o:title=""/>
               </v:shape>
             </w:pict>
@@ -10209,7 +10393,7 @@
           </mc:Choice>
           <mc:Fallback>
             <w:pict>
-              <v:shape w14:anchorId="6EB49363" id="Ink 44" o:spid="_x0000_s1026" type="#_x0000_t75" style="position:absolute;margin-left:409.9pt;margin-top:-9.95pt;width:25.95pt;height:25.55pt;z-index:251781120;visibility:visible;mso-wrap-style:square;mso-wrap-distance-left:9pt;mso-wrap-distance-top:0;mso-wrap-distance-right:9pt;mso-wrap-distance-bottom:0;mso-position-horizontal:absolute;mso-position-horizontal-relative:text;mso-position-vertical:absolute;mso-position-vertical-relative:text" o:gfxdata="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">
+              <v:shape w14:anchorId="55D3E0C6" id="Ink 44" o:spid="_x0000_s1026" type="#_x0000_t75" style="position:absolute;margin-left:410.2pt;margin-top:-9.5pt;width:25.2pt;height:24.8pt;z-index:251781120;visibility:visible;mso-wrap-style:square;mso-wrap-distance-left:9pt;mso-wrap-distance-top:0;mso-wrap-distance-right:9pt;mso-wrap-distance-bottom:0;mso-position-horizontal:absolute;mso-position-horizontal-relative:text;mso-position-vertical:absolute;mso-position-vertical-relative:text" o:gfxdata="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">
                 <v:imagedata r:id="rId179" o:title=""/>
               </v:shape>
             </w:pict>
@@ -10255,7 +10439,7 @@
           </mc:Choice>
           <mc:Fallback>
             <w:pict>
-              <v:shape w14:anchorId="56DC912C" id="Ink 43" o:spid="_x0000_s1026" type="#_x0000_t75" style="position:absolute;margin-left:411.45pt;margin-top:10.1pt;width:6.15pt;height:17.6pt;z-index:251780096;visibility:visible;mso-wrap-style:square;mso-wrap-distance-left:9pt;mso-wrap-distance-top:0;mso-wrap-distance-right:9pt;mso-wrap-distance-bottom:0;mso-position-horizontal:absolute;mso-position-horizontal-relative:text;mso-position-vertical:absolute;mso-position-vertical-relative:text" o:gfxdata="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">
+              <v:shape w14:anchorId="4A3AA9EA" id="Ink 43" o:spid="_x0000_s1026" type="#_x0000_t75" style="position:absolute;margin-left:411.55pt;margin-top:10.4pt;width:6.05pt;height:17.15pt;z-index:251780096;visibility:visible;mso-wrap-style:square;mso-wrap-distance-left:9pt;mso-wrap-distance-top:0;mso-wrap-distance-right:9pt;mso-wrap-distance-bottom:0;mso-position-horizontal:absolute;mso-position-horizontal-relative:text;mso-position-vertical:absolute;mso-position-vertical-relative:text" o:gfxdata="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">
                 <v:imagedata r:id="rId181" o:title=""/>
               </v:shape>
             </w:pict>
@@ -10301,7 +10485,7 @@
           </mc:Choice>
           <mc:Fallback>
             <w:pict>
-              <v:shape w14:anchorId="24B4E7F4" id="Ink 42" o:spid="_x0000_s1026" type="#_x0000_t75" style="position:absolute;margin-left:403.65pt;margin-top:15.35pt;width:2.8pt;height:7.6pt;z-index:251779072;visibility:visible;mso-wrap-style:square;mso-wrap-distance-left:9pt;mso-wrap-distance-top:0;mso-wrap-distance-right:9pt;mso-wrap-distance-bottom:0;mso-position-horizontal:absolute;mso-position-horizontal-relative:text;mso-position-vertical:absolute;mso-position-vertical-relative:text" o:gfxdata="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">
+              <v:shape w14:anchorId="184236B1" id="Ink 42" o:spid="_x0000_s1026" type="#_x0000_t75" style="position:absolute;margin-left:404.05pt;margin-top:15.75pt;width:2.05pt;height:6.7pt;z-index:251779072;visibility:visible;mso-wrap-style:square;mso-wrap-distance-left:9pt;mso-wrap-distance-top:0;mso-wrap-distance-right:9pt;mso-wrap-distance-bottom:0;mso-position-horizontal:absolute;mso-position-horizontal-relative:text;mso-position-vertical:absolute;mso-position-vertical-relative:text" o:gfxdata="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">
                 <v:imagedata r:id="rId183" o:title=""/>
               </v:shape>
             </w:pict>
@@ -10347,7 +10531,7 @@
           </mc:Choice>
           <mc:Fallback>
             <w:pict>
-              <v:shape w14:anchorId="1897A982" id="Ink 41" o:spid="_x0000_s1026" type="#_x0000_t75" style="position:absolute;margin-left:401.35pt;margin-top:17.9pt;width:6.25pt;height:2.25pt;z-index:251778048;visibility:visible;mso-wrap-style:square;mso-wrap-distance-left:9pt;mso-wrap-distance-top:0;mso-wrap-distance-right:9pt;mso-wrap-distance-bottom:0;mso-position-horizontal:absolute;mso-position-horizontal-relative:text;mso-position-vertical:absolute;mso-position-vertical-relative:text" o:gfxdata="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">
+              <v:shape w14:anchorId="208E4A44" id="Ink 41" o:spid="_x0000_s1026" type="#_x0000_t75" style="position:absolute;margin-left:401.6pt;margin-top:18.3pt;width:5.5pt;height:1.7pt;z-index:251778048;visibility:visible;mso-wrap-style:square;mso-wrap-distance-left:9pt;mso-wrap-distance-top:0;mso-wrap-distance-right:9pt;mso-wrap-distance-bottom:0;mso-position-horizontal:absolute;mso-position-horizontal-relative:text;mso-position-vertical:absolute;mso-position-vertical-relative:text" o:gfxdata="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">
                 <v:imagedata r:id="rId185" o:title=""/>
               </v:shape>
             </w:pict>
@@ -10393,7 +10577,7 @@
           </mc:Choice>
           <mc:Fallback>
             <w:pict>
-              <v:shape w14:anchorId="4164EF7B" id="Ink 40" o:spid="_x0000_s1026" type="#_x0000_t75" style="position:absolute;margin-left:386.2pt;margin-top:17.95pt;width:9.2pt;height:3.05pt;z-index:251777024;visibility:visible;mso-wrap-style:square;mso-wrap-distance-left:9pt;mso-wrap-distance-top:0;mso-wrap-distance-right:9pt;mso-wrap-distance-bottom:0;mso-position-horizontal:absolute;mso-position-horizontal-relative:text;mso-position-vertical:absolute;mso-position-vertical-relative:text" o:gfxdata="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">
+              <v:shape w14:anchorId="6332F4BD" id="Ink 40" o:spid="_x0000_s1026" type="#_x0000_t75" style="position:absolute;margin-left:386.4pt;margin-top:18.15pt;width:8.5pt;height:2.6pt;z-index:251777024;visibility:visible;mso-wrap-style:square;mso-wrap-distance-left:9pt;mso-wrap-distance-top:0;mso-wrap-distance-right:9pt;mso-wrap-distance-bottom:0;mso-position-horizontal:absolute;mso-position-horizontal-relative:text;mso-position-vertical:absolute;mso-position-vertical-relative:text" o:gfxdata="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">
                 <v:imagedata r:id="rId187" o:title=""/>
               </v:shape>
             </w:pict>
@@ -10439,7 +10623,7 @@
           </mc:Choice>
           <mc:Fallback>
             <w:pict>
-              <v:shape w14:anchorId="2B80BB88" id="Ink 39" o:spid="_x0000_s1026" type="#_x0000_t75" style="position:absolute;margin-left:383.15pt;margin-top:8.55pt;width:10pt;height:19.45pt;z-index:251776000;visibility:visible;mso-wrap-style:square;mso-wrap-distance-left:9pt;mso-wrap-distance-top:0;mso-wrap-distance-right:9pt;mso-wrap-distance-bottom:0;mso-position-horizontal:absolute;mso-position-horizontal-relative:text;mso-position-vertical:absolute;mso-position-vertical-relative:text" o:gfxdata="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">
+              <v:shape w14:anchorId="75EEA869" id="Ink 39" o:spid="_x0000_s1026" type="#_x0000_t75" style="position:absolute;margin-left:383.25pt;margin-top:8.85pt;width:9.85pt;height:19pt;z-index:251776000;visibility:visible;mso-wrap-style:square;mso-wrap-distance-left:9pt;mso-wrap-distance-top:0;mso-wrap-distance-right:9pt;mso-wrap-distance-bottom:0;mso-position-horizontal:absolute;mso-position-horizontal-relative:text;mso-position-vertical:absolute;mso-position-vertical-relative:text" o:gfxdata="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">
                 <v:imagedata r:id="rId189" o:title=""/>
               </v:shape>
             </w:pict>
@@ -10485,7 +10669,7 @@
           </mc:Choice>
           <mc:Fallback>
             <w:pict>
-              <v:shape w14:anchorId="79A97FC8" id="Ink 38" o:spid="_x0000_s1026" type="#_x0000_t75" style="position:absolute;margin-left:328pt;margin-top:8.5pt;width:23.2pt;height:11.75pt;z-index:251774976;visibility:visible;mso-wrap-style:square;mso-wrap-distance-left:9pt;mso-wrap-distance-top:0;mso-wrap-distance-right:9pt;mso-wrap-distance-bottom:0;mso-position-horizontal:absolute;mso-position-horizontal-relative:text;mso-position-vertical:absolute;mso-position-vertical-relative:text" o:gfxdata="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">
+              <v:shape w14:anchorId="37E1C9D8" id="Ink 38" o:spid="_x0000_s1026" type="#_x0000_t75" style="position:absolute;margin-left:328.35pt;margin-top:9pt;width:22.35pt;height:10.95pt;z-index:251774976;visibility:visible;mso-wrap-style:square;mso-wrap-distance-left:9pt;mso-wrap-distance-top:0;mso-wrap-distance-right:9pt;mso-wrap-distance-bottom:0;mso-position-horizontal:absolute;mso-position-horizontal-relative:text;mso-position-vertical:absolute;mso-position-vertical-relative:text" o:gfxdata="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">
                 <v:imagedata r:id="rId191" o:title=""/>
               </v:shape>
             </w:pict>
@@ -10531,7 +10715,7 @@
           </mc:Choice>
           <mc:Fallback>
             <w:pict>
-              <v:shape w14:anchorId="368B6011" id="Ink 37" o:spid="_x0000_s1026" type="#_x0000_t75" style="position:absolute;margin-left:330.25pt;margin-top:15.15pt;width:5.5pt;height:12.3pt;z-index:251773952;visibility:visible;mso-wrap-style:square;mso-wrap-distance-left:9pt;mso-wrap-distance-top:0;mso-wrap-distance-right:9pt;mso-wrap-distance-bottom:0;mso-position-horizontal:absolute;mso-position-horizontal-relative:text;mso-position-vertical:absolute;mso-position-vertical-relative:text" o:gfxdata="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">
+              <v:shape w14:anchorId="2D03908D" id="Ink 37" o:spid="_x0000_s1026" type="#_x0000_t75" style="position:absolute;margin-left:330.75pt;margin-top:15.55pt;width:4.9pt;height:11.75pt;z-index:251773952;visibility:visible;mso-wrap-style:square;mso-wrap-distance-left:9pt;mso-wrap-distance-top:0;mso-wrap-distance-right:9pt;mso-wrap-distance-bottom:0;mso-position-horizontal:absolute;mso-position-horizontal-relative:text;mso-position-vertical:absolute;mso-position-vertical-relative:text" o:gfxdata="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">
                 <v:imagedata r:id="rId193" o:title=""/>
               </v:shape>
             </w:pict>
@@ -10577,7 +10761,7 @@
           </mc:Choice>
           <mc:Fallback>
             <w:pict>
-              <v:shape w14:anchorId="1F6D6E1F" id="Ink 36" o:spid="_x0000_s1026" type="#_x0000_t75" style="position:absolute;margin-left:328.05pt;margin-top:18.7pt;width:3.65pt;height:2.05pt;z-index:251772928;visibility:visible;mso-wrap-style:square;mso-wrap-distance-left:9pt;mso-wrap-distance-top:0;mso-wrap-distance-right:9pt;mso-wrap-distance-bottom:0;mso-position-horizontal:absolute;mso-position-horizontal-relative:text;mso-position-vertical:absolute;mso-position-vertical-relative:text" o:gfxdata="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">
+              <v:shape w14:anchorId="06306F40" id="Ink 36" o:spid="_x0000_s1026" type="#_x0000_t75" style="position:absolute;margin-left:328.35pt;margin-top:19.2pt;width:2.8pt;height:1.4pt;z-index:251772928;visibility:visible;mso-wrap-style:square;mso-wrap-distance-left:9pt;mso-wrap-distance-top:0;mso-wrap-distance-right:9pt;mso-wrap-distance-bottom:0;mso-position-horizontal:absolute;mso-position-horizontal-relative:text;mso-position-vertical:absolute;mso-position-vertical-relative:text" o:gfxdata="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">
                 <v:imagedata r:id="rId195" o:title=""/>
               </v:shape>
             </w:pict>
@@ -10623,7 +10807,7 @@
           </mc:Choice>
           <mc:Fallback>
             <w:pict>
-              <v:shape w14:anchorId="01900E61" id="Ink 35" o:spid="_x0000_s1026" type="#_x0000_t75" style="position:absolute;margin-left:315.55pt;margin-top:18.15pt;width:8.1pt;height:4.1pt;z-index:251771904;visibility:visible;mso-wrap-style:square;mso-wrap-distance-left:9pt;mso-wrap-distance-top:0;mso-wrap-distance-right:9pt;mso-wrap-distance-bottom:0;mso-position-horizontal:absolute;mso-position-horizontal-relative:text;mso-position-vertical:absolute;mso-position-vertical-relative:text" o:gfxdata="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">
+              <v:shape w14:anchorId="167AB04F" id="Ink 35" o:spid="_x0000_s1026" type="#_x0000_t75" style="position:absolute;margin-left:315.75pt;margin-top:18.35pt;width:7.45pt;height:3.65pt;z-index:251771904;visibility:visible;mso-wrap-style:square;mso-wrap-distance-left:9pt;mso-wrap-distance-top:0;mso-wrap-distance-right:9pt;mso-wrap-distance-bottom:0;mso-position-horizontal:absolute;mso-position-horizontal-relative:text;mso-position-vertical:absolute;mso-position-vertical-relative:text" o:gfxdata="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">
                 <v:imagedata r:id="rId197" o:title=""/>
               </v:shape>
             </w:pict>
@@ -10669,7 +10853,7 @@
           </mc:Choice>
           <mc:Fallback>
             <w:pict>
-              <v:shape w14:anchorId="15E3D2FE" id="Ink 34" o:spid="_x0000_s1026" type="#_x0000_t75" style="position:absolute;margin-left:313.65pt;margin-top:8.15pt;width:13.25pt;height:20.9pt;z-index:251770880;visibility:visible;mso-wrap-style:square;mso-wrap-distance-left:9pt;mso-wrap-distance-top:0;mso-wrap-distance-right:9pt;mso-wrap-distance-bottom:0;mso-position-horizontal:absolute;mso-position-horizontal-relative:text;mso-position-vertical:absolute;mso-position-vertical-relative:text" o:gfxdata="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">
+              <v:shape w14:anchorId="2A6ACA99" id="Ink 34" o:spid="_x0000_s1026" type="#_x0000_t75" style="position:absolute;margin-left:313.7pt;margin-top:8.4pt;width:13.15pt;height:20.65pt;z-index:251770880;visibility:visible;mso-wrap-style:square;mso-wrap-distance-left:9pt;mso-wrap-distance-top:0;mso-wrap-distance-right:9pt;mso-wrap-distance-bottom:0;mso-position-horizontal:absolute;mso-position-horizontal-relative:text;mso-position-vertical:absolute;mso-position-vertical-relative:text" o:gfxdata="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">
                 <v:imagedata r:id="rId199" o:title=""/>
               </v:shape>
             </w:pict>
@@ -10715,7 +10899,7 @@
           </mc:Choice>
           <mc:Fallback>
             <w:pict>
-              <v:shape w14:anchorId="2F5C074A" id="Ink 31" o:spid="_x0000_s1026" type="#_x0000_t75" style="position:absolute;margin-left:349.1pt;margin-top:3pt;width:19.8pt;height:24.45pt;z-index:251767808;visibility:visible;mso-wrap-style:square;mso-wrap-distance-left:9pt;mso-wrap-distance-top:0;mso-wrap-distance-right:9pt;mso-wrap-distance-bottom:0;mso-position-horizontal:absolute;mso-position-horizontal-relative:text;mso-position-vertical:absolute;mso-position-vertical-relative:text" o:gfxdata="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">
+              <v:shape w14:anchorId="0EF4AEAB" id="Ink 31" o:spid="_x0000_s1026" type="#_x0000_t75" style="position:absolute;margin-left:349.1pt;margin-top:3pt;width:19.35pt;height:24.45pt;z-index:251767808;visibility:visible;mso-wrap-style:square;mso-wrap-distance-left:9pt;mso-wrap-distance-top:0;mso-wrap-distance-right:9pt;mso-wrap-distance-bottom:0;mso-position-horizontal:absolute;mso-position-horizontal-relative:text;mso-position-vertical:absolute;mso-position-vertical-relative:text" o:gfxdata="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">
                 <v:imagedata r:id="rId201" o:title=""/>
               </v:shape>
             </w:pict>
@@ -10929,7 +11113,6 @@
           <w:noProof/>
           <w:sz w:val="28"/>
           <w:szCs w:val="28"/>
-          <w:lang w:val="vi-VN"/>
         </w:rPr>
         <w:drawing>
           <wp:inline distT="0" distB="0" distL="0" distR="0" wp14:anchorId="484A77A3" wp14:editId="6BDC93F6">
@@ -11338,13 +11521,27 @@
         <w:rPr>
           <w:sz w:val="44"/>
         </w:rPr>
-        <w:t xml:space="preserve"> máy tính -100  </w:t>
-      </w:r>
-      <w:r>
-        <w:rPr>
-          <w:sz w:val="44"/>
-        </w:rPr>
-        <w:t xml:space="preserve">-1   </w:t>
+        <w:t xml:space="preserve"> máy tính -</w:t>
+      </w:r>
+      <w:proofErr w:type="gramStart"/>
+      <w:r>
+        <w:rPr>
+          <w:sz w:val="44"/>
+        </w:rPr>
+        <w:t xml:space="preserve">100  </w:t>
+      </w:r>
+      <w:r>
+        <w:rPr>
+          <w:sz w:val="44"/>
+        </w:rPr>
+        <w:t>-</w:t>
+      </w:r>
+      <w:proofErr w:type="gramEnd"/>
+      <w:r>
+        <w:rPr>
+          <w:sz w:val="44"/>
+        </w:rPr>
+        <w:t xml:space="preserve">1   </w:t>
       </w:r>
       <w:r>
         <w:rPr>
@@ -11556,7 +11753,7 @@
           <w:sz w:val="44"/>
         </w:rPr>
       </w:pPr>
-      <w:bookmarkStart w:id="2" w:name="_Hlk237275529"/>
+      <w:bookmarkStart w:id="1" w:name="_Hlk237275529"/>
       <w:r>
         <w:rPr>
           <w:sz w:val="44"/>
@@ -11643,7 +11840,7 @@
         <w:t>”)</w:t>
       </w:r>
     </w:p>
-    <w:bookmarkEnd w:id="2"/>
+    <w:bookmarkEnd w:id="1"/>
     <w:p>
       <w:pPr>
         <w:pStyle w:val="ListParagraph"/>
@@ -11683,45 +11880,17 @@
     <w:p>
       <w:pPr>
         <w:pStyle w:val="ListParagraph"/>
-        <w:numPr>
-          <w:ilvl w:val="0"/>
-          <w:numId w:val="1"/>
-        </w:numPr>
-        <w:rPr>
-          <w:sz w:val="44"/>
-        </w:rPr>
-      </w:pPr>
-      <w:r>
-        <w:rPr>
-          <w:sz w:val="44"/>
-        </w:rPr>
-        <w:t xml:space="preserve">Nút 2: chỉnh </w:t>
-      </w:r>
-      <w:r>
-        <w:rPr>
-          <w:sz w:val="44"/>
-        </w:rPr>
-        <w:t xml:space="preserve">(cơ) </w:t>
-      </w:r>
-      <w:r>
-        <w:rPr>
-          <w:sz w:val="44"/>
-        </w:rPr>
-        <w:t>chạy thuận.</w:t>
-      </w:r>
-      <w:r>
-        <w:rPr>
-          <w:sz w:val="44"/>
-        </w:rPr>
-        <w:t xml:space="preserve"> (giữ để chỉnh)</w:t>
-      </w:r>
-    </w:p>
-    <w:p>
-      <w:pPr>
-        <w:rPr>
-          <w:sz w:val="44"/>
-        </w:rPr>
-      </w:pPr>
+        <w:rPr>
+          <w:sz w:val="44"/>
+        </w:rPr>
+      </w:pPr>
+      <w:r>
+        <w:rPr>
+          <w:sz w:val="44"/>
+          <w:u w:val="single"/>
+        </w:rPr>
+        <w:t xml:space="preserve"> </w:t>
+      </w:r>
       <w:r>
         <w:rPr>
           <w:sz w:val="44"/>
@@ -11751,9 +11920,9 @@
         <w:rPr>
           <w:sz w:val="44"/>
         </w:rPr>
-        <w:lastRenderedPageBreak/>
         <w:t>Nút 3: quay về vị trí 0</w:t>
       </w:r>
+      <w:proofErr w:type="gramStart"/>
       <w:r>
         <w:rPr>
           <w:sz w:val="44"/>
@@ -11772,7 +11941,14 @@
         <w:rPr>
           <w:sz w:val="44"/>
         </w:rPr>
-        <w:t>(không giữ tay).</w:t>
+        <w:t>(</w:t>
+      </w:r>
+      <w:proofErr w:type="gramEnd"/>
+      <w:r>
+        <w:rPr>
+          <w:sz w:val="44"/>
+        </w:rPr>
+        <w:t>không giữ tay).</w:t>
       </w:r>
     </w:p>
     <w:p>
@@ -11792,6 +11968,7 @@
         </w:rPr>
         <w:t>Nút 4: chạy đến vị trí 120</w:t>
       </w:r>
+      <w:proofErr w:type="gramStart"/>
       <w:r>
         <w:rPr>
           <w:sz w:val="44"/>
@@ -11810,7 +11987,14 @@
         <w:rPr>
           <w:sz w:val="44"/>
         </w:rPr>
-        <w:t>(không giữ tay).</w:t>
+        <w:t>(</w:t>
+      </w:r>
+      <w:proofErr w:type="gramEnd"/>
+      <w:r>
+        <w:rPr>
+          <w:sz w:val="44"/>
+        </w:rPr>
+        <w:t>không giữ tay).</w:t>
       </w:r>
     </w:p>
     <w:p>
@@ -11850,7 +12034,7 @@
         </w:rPr>
         <w:t>: (“</w:t>
       </w:r>
-      <w:bookmarkStart w:id="3" w:name="_Hlk237275554"/>
+      <w:bookmarkStart w:id="2" w:name="_Hlk237275554"/>
       <w:r>
         <w:rPr>
           <w:sz w:val="44"/>
@@ -11872,13 +12056,14 @@
         </w:rPr>
         <w:t>_</w:t>
       </w:r>
-      <w:r>
-        <w:rPr>
-          <w:sz w:val="44"/>
-          <w:highlight w:val="cyan"/>
-        </w:rPr>
-        <w:t>test</w:t>
-      </w:r>
+      <w:bookmarkEnd w:id="2"/>
+      <w:r>
+        <w:rPr>
+          <w:sz w:val="44"/>
+        </w:rPr>
+        <w:t>dkCamchung</w:t>
+      </w:r>
+      <w:bookmarkStart w:id="3" w:name="_GoBack"/>
       <w:bookmarkEnd w:id="3"/>
       <w:r>
         <w:rPr>
@@ -11893,6 +12078,12 @@
           <w:sz w:val="44"/>
         </w:rPr>
       </w:pPr>
+      <w:r>
+        <w:rPr>
+          <w:sz w:val="44"/>
+        </w:rPr>
+        <w:t>Dieu khien cam chung</w:t>
+      </w:r>
     </w:p>
     <w:p>
       <w:pPr>
@@ -11939,7 +12130,7 @@
           </mc:Choice>
           <mc:Fallback>
             <w:pict>
-              <v:shape w14:anchorId="7A9F2BE3" id="Ink 24" o:spid="_x0000_s1026" type="#_x0000_t75" style="position:absolute;margin-left:154.6pt;margin-top:23.75pt;width:1.75pt;height:4.15pt;z-index:251681792;visibility:visible;mso-wrap-style:square;mso-wrap-distance-left:9pt;mso-wrap-distance-top:0;mso-wrap-distance-right:9pt;mso-wrap-distance-bottom:0;mso-position-horizontal:absolute;mso-position-horizontal-relative:text;mso-position-vertical:absolute;mso-position-vertical-relative:text" o:gfxdata="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">
+              <v:shape w14:anchorId="60A002A9" id="Ink 24" o:spid="_x0000_s1026" type="#_x0000_t75" style="position:absolute;margin-left:155.1pt;margin-top:24.25pt;width:.7pt;height:3.15pt;z-index:251681792;visibility:visible;mso-wrap-style:square;mso-wrap-distance-left:9pt;mso-wrap-distance-top:0;mso-wrap-distance-right:9pt;mso-wrap-distance-bottom:0;mso-position-horizontal:absolute;mso-position-horizontal-relative:text;mso-position-vertical:absolute;mso-position-vertical-relative:text" o:gfxdata="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">
                 <v:imagedata r:id="rId205" o:title=""/>
               </v:shape>
             </w:pict>
@@ -12015,13 +12206,27 @@
         <w:rPr>
           <w:sz w:val="44"/>
         </w:rPr>
-        <w:t xml:space="preserve">Điều khiển tốc độ bằng thanh trượt trên máy tính. </w:t>
-      </w:r>
-      <w:r>
-        <w:rPr>
-          <w:sz w:val="44"/>
-        </w:rPr>
-        <w:t>.  (dùng biến trở).</w:t>
+        <w:t>Điều khiển tốc độ bằng thanh trượt trên máy tính</w:t>
+      </w:r>
+      <w:proofErr w:type="gramStart"/>
+      <w:r>
+        <w:rPr>
+          <w:sz w:val="44"/>
+        </w:rPr>
+        <w:t xml:space="preserve">. </w:t>
+      </w:r>
+      <w:r>
+        <w:rPr>
+          <w:sz w:val="44"/>
+        </w:rPr>
+        <w:t>.</w:t>
+      </w:r>
+      <w:proofErr w:type="gramEnd"/>
+      <w:r>
+        <w:rPr>
+          <w:sz w:val="44"/>
+        </w:rPr>
+        <w:t xml:space="preserve">  (dùng biến trở).</w:t>
       </w:r>
     </w:p>
     <w:p>
@@ -12226,7 +12431,6 @@
           <w:noProof/>
           <w:sz w:val="28"/>
           <w:szCs w:val="28"/>
-          <w:lang w:val="vi-VN"/>
         </w:rPr>
         <w:lastRenderedPageBreak/>
         <w:drawing>
@@ -12344,19 +12548,7 @@
         <w:rPr>
           <w:sz w:val="44"/>
         </w:rPr>
-        <w:t>. Nhấn nút SW</w:t>
-      </w:r>
-      <w:r>
-        <w:rPr>
-          <w:sz w:val="44"/>
-        </w:rPr>
-        <w:t>2</w:t>
-      </w:r>
-      <w:r>
-        <w:rPr>
-          <w:sz w:val="44"/>
-        </w:rPr>
-        <w:t xml:space="preserve"> motor chạy thuận 10s thì dừng. Nhấn nút SW1 motor chạy ngược 10s thì dừng. </w:t>
+        <w:t xml:space="preserve">. Nhấn nút SW3 motor chạy thuận 10s thì dừng. Nhấn nút SW1 motor chạy ngược 10s thì dừng. </w:t>
       </w:r>
     </w:p>
     <w:p/>
@@ -12481,7 +12673,21 @@
         <w:rPr>
           <w:sz w:val="44"/>
         </w:rPr>
-        <w:t xml:space="preserve">(100);) 3000 xung dừng.  </w:t>
+        <w:t>(</w:t>
+      </w:r>
+      <w:proofErr w:type="gramStart"/>
+      <w:r>
+        <w:rPr>
+          <w:sz w:val="44"/>
+        </w:rPr>
+        <w:t>100);)</w:t>
+      </w:r>
+      <w:proofErr w:type="gramEnd"/>
+      <w:r>
+        <w:rPr>
+          <w:sz w:val="44"/>
+        </w:rPr>
+        <w:t xml:space="preserve"> 3000 xung dừng.  </w:t>
       </w:r>
     </w:p>
     <w:p>
@@ -12541,11 +12747,19 @@
         </w:rPr>
         <w:t>-</w:t>
       </w:r>
-      <w:r>
-        <w:rPr>
-          <w:sz w:val="44"/>
-        </w:rPr>
-        <w:t xml:space="preserve">100);) 0 xung dừng.  </w:t>
+      <w:proofErr w:type="gramStart"/>
+      <w:r>
+        <w:rPr>
+          <w:sz w:val="44"/>
+        </w:rPr>
+        <w:t>100);)</w:t>
+      </w:r>
+      <w:proofErr w:type="gramEnd"/>
+      <w:r>
+        <w:rPr>
+          <w:sz w:val="44"/>
+        </w:rPr>
+        <w:t xml:space="preserve"> 0 xung dừng.  </w:t>
       </w:r>
     </w:p>
     <w:p>
@@ -12572,7 +12786,7 @@
 </file>
 
 <file path=word/numbering.xml><?xml version="1.0" encoding="utf-8"?>
-<w:numbering xmlns:wpc="http://schemas.microsoft.com/office/word/2010/wordprocessingCanvas" xmlns:cx="http://schemas.microsoft.com/office/drawing/2014/chartex" xmlns:cx1="http://schemas.microsoft.com/office/drawing/2015/9/8/chartex" xmlns:cx2="http://schemas.microsoft.com/office/drawing/2015/10/21/chartex" xmlns:cx3="http://schemas.microsoft.com/office/drawing/2016/5/9/chartex" xmlns:cx4="http://schemas.microsoft.com/office/drawing/2016/5/10/chartex" xmlns:cx5="http://schemas.microsoft.com/office/drawing/2016/5/11/chartex" xmlns:cx6="http://schemas.microsoft.com/office/drawing/2016/5/12/chartex" xmlns:cx7="http://schemas.microsoft.com/office/drawing/2016/5/13/chartex" xmlns:cx8="http://schemas.microsoft.com/office/drawing/2016/5/14/chartex" xmlns:mc="http://schemas.openxmlformats.org/markup-compatibility/2006" xmlns:aink="http://schemas.microsoft.com/office/drawing/2016/ink" xmlns:am3d="http://schemas.microsoft.com/office/drawing/2017/model3d" xmlns:o="urn:schemas-microsoft-com:office:office" xmlns:oel="http://schemas.microsoft.com/office/2019/extlst" xmlns:r="http://schemas.openxmlformats.org/officeDocument/2006/relationships" xmlns:m="http://schemas.openxmlformats.org/officeDocument/2006/math" xmlns:v="urn:schemas-microsoft-com:vml" xmlns:wp14="http://schemas.microsoft.com/office/word/2010/wordprocessingDrawing" xmlns:wp="http://schemas.openxmlformats.org/drawingml/2006/wordprocessingDrawing" xmlns:w10="urn:schemas-microsoft-com:office:word" xmlns:w="http://schemas.openxmlformats.org/wordprocessingml/2006/main" xmlns:w14="http://schemas.microsoft.com/office/word/2010/wordml" xmlns:w15="http://schemas.microsoft.com/office/word/2012/wordml" xmlns:w16cex="http://schemas.microsoft.com/office/word/2018/wordml/cex" xmlns:w16cid="http://schemas.microsoft.com/office/word/2016/wordml/cid" xmlns:w16="http://schemas.microsoft.com/office/word/2018/wordml" xmlns:w16du="http://schemas.microsoft.com/office/word/2023/wordml/word16du" xmlns:w16sdtdh="http://schemas.microsoft.com/office/word/2020/wordml/sdtdatahash" xmlns:w16sdtfl="http://schemas.microsoft.com/office/word/2024/wordml/sdtformatlock" xmlns:w16se="http://schemas.microsoft.com/office/word/2015/wordml/symex" xmlns:wpg="http://schemas.microsoft.com/office/word/2010/wordprocessingGroup" xmlns:wpi="http://schemas.microsoft.com/office/word/2010/wordprocessingInk" xmlns:wne="http://schemas.microsoft.com/office/word/2006/wordml" xmlns:wps="http://schemas.microsoft.com/office/word/2010/wordprocessingShape" mc:Ignorable="w14 w15 w16se w16cid w16 w16cex w16sdtdh w16sdtfl w16du wp14">
+<w:numbering xmlns:wpc="http://schemas.microsoft.com/office/word/2010/wordprocessingCanvas" xmlns:cx="http://schemas.microsoft.com/office/drawing/2014/chartex" xmlns:mc="http://schemas.openxmlformats.org/markup-compatibility/2006" xmlns:o="urn:schemas-microsoft-com:office:office" xmlns:r="http://schemas.openxmlformats.org/officeDocument/2006/relationships" xmlns:m="http://schemas.openxmlformats.org/officeDocument/2006/math" xmlns:v="urn:schemas-microsoft-com:vml" xmlns:wp14="http://schemas.microsoft.com/office/word/2010/wordprocessingDrawing" xmlns:wp="http://schemas.openxmlformats.org/drawingml/2006/wordprocessingDrawing" xmlns:w10="urn:schemas-microsoft-com:office:word" xmlns:w="http://schemas.openxmlformats.org/wordprocessingml/2006/main" xmlns:w14="http://schemas.microsoft.com/office/word/2010/wordml" xmlns:w15="http://schemas.microsoft.com/office/word/2012/wordml" xmlns:w16se="http://schemas.microsoft.com/office/word/2015/wordml/symex" xmlns:wpg="http://schemas.microsoft.com/office/word/2010/wordprocessingGroup" xmlns:wpi="http://schemas.microsoft.com/office/word/2010/wordprocessingInk" xmlns:wne="http://schemas.microsoft.com/office/word/2006/wordml" xmlns:wps="http://schemas.microsoft.com/office/word/2010/wordprocessingShape" mc:Ignorable="w14 w15 w16se wp14">
   <w:abstractNum w:abstractNumId="0" w15:restartNumberingAfterBreak="0">
     <w:nsid w:val="0265043E"/>
     <w:multiLevelType w:val="hybridMultilevel"/>
@@ -12797,17 +13011,17 @@
       </w:rPr>
     </w:lvl>
   </w:abstractNum>
-  <w:num w:numId="1" w16cid:durableId="2003043732">
+  <w:num w:numId="1">
     <w:abstractNumId w:val="0"/>
   </w:num>
-  <w:num w:numId="2" w16cid:durableId="46804155">
+  <w:num w:numId="2">
     <w:abstractNumId w:val="1"/>
   </w:num>
 </w:numbering>
 </file>
 
 <file path=word/styles.xml><?xml version="1.0" encoding="utf-8"?>
-<w:styles xmlns:mc="http://schemas.openxmlformats.org/markup-compatibility/2006" xmlns:r="http://schemas.openxmlformats.org/officeDocument/2006/relationships" xmlns:w="http://schemas.openxmlformats.org/wordprocessingml/2006/main" xmlns:w14="http://schemas.microsoft.com/office/word/2010/wordml" xmlns:w15="http://schemas.microsoft.com/office/word/2012/wordml" xmlns:w16cex="http://schemas.microsoft.com/office/word/2018/wordml/cex" xmlns:w16cid="http://schemas.microsoft.com/office/word/2016/wordml/cid" xmlns:w16="http://schemas.microsoft.com/office/word/2018/wordml" xmlns:w16du="http://schemas.microsoft.com/office/word/2023/wordml/word16du" xmlns:w16sdtdh="http://schemas.microsoft.com/office/word/2020/wordml/sdtdatahash" xmlns:w16sdtfl="http://schemas.microsoft.com/office/word/2024/wordml/sdtformatlock" xmlns:w16se="http://schemas.microsoft.com/office/word/2015/wordml/symex" mc:Ignorable="w14 w15 w16se w16cid w16 w16cex w16sdtdh w16sdtfl w16du">
+<w:styles xmlns:mc="http://schemas.openxmlformats.org/markup-compatibility/2006" xmlns:r="http://schemas.openxmlformats.org/officeDocument/2006/relationships" xmlns:w="http://schemas.openxmlformats.org/wordprocessingml/2006/main" xmlns:w14="http://schemas.microsoft.com/office/word/2010/wordml" xmlns:w15="http://schemas.microsoft.com/office/word/2012/wordml" xmlns:w16se="http://schemas.microsoft.com/office/word/2015/wordml/symex" mc:Ignorable="w14 w15 w16se">
   <w:docDefaults>
     <w:rPrDefault>
       <w:rPr>
@@ -12823,7 +13037,7 @@
       </w:pPr>
     </w:pPrDefault>
   </w:docDefaults>
-  <w:latentStyles w:defLockedState="0" w:defUIPriority="99" w:defSemiHidden="0" w:defUnhideWhenUsed="0" w:defQFormat="0" w:count="376">
+  <w:latentStyles w:defLockedState="0" w:defUIPriority="99" w:defSemiHidden="0" w:defUnhideWhenUsed="0" w:defQFormat="0" w:count="371">
     <w:lsdException w:name="Normal" w:uiPriority="0" w:qFormat="1"/>
     <w:lsdException w:name="heading 1" w:uiPriority="9" w:qFormat="1"/>
     <w:lsdException w:name="heading 2" w:semiHidden="1" w:uiPriority="9" w:unhideWhenUsed="1" w:qFormat="1"/>
@@ -13195,16 +13409,11 @@
     <w:lsdException w:name="List Table 5 Dark Accent 6" w:uiPriority="50"/>
     <w:lsdException w:name="List Table 6 Colorful Accent 6" w:uiPriority="51"/>
     <w:lsdException w:name="List Table 7 Colorful Accent 6" w:uiPriority="52"/>
-    <w:lsdException w:name="Mention" w:semiHidden="1" w:unhideWhenUsed="1"/>
-    <w:lsdException w:name="Smart Hyperlink" w:semiHidden="1" w:unhideWhenUsed="1"/>
-    <w:lsdException w:name="Hashtag" w:semiHidden="1" w:unhideWhenUsed="1"/>
-    <w:lsdException w:name="Unresolved Mention" w:semiHidden="1" w:unhideWhenUsed="1"/>
-    <w:lsdException w:name="Smart Link" w:semiHidden="1" w:unhideWhenUsed="1"/>
   </w:latentStyles>
   <w:style w:type="paragraph" w:default="1" w:styleId="Normal">
     <w:name w:val="Normal"/>
     <w:qFormat/>
-    <w:rsid w:val="004C735C"/>
+    <w:rsid w:val="000C6297"/>
   </w:style>
   <w:style w:type="character" w:default="1" w:styleId="DefaultParagraphFont">
     <w:name w:val="Default Paragraph Font"/>

</xml_diff>